<commit_message>
Format monetary values for DOCX output
</commit_message>
<xml_diff>
--- a/output/result.docx
+++ b/output/result.docx
@@ -1817,7 +1817,7 @@
                 <w:szCs w:val="21"/>
                 <w:lang w:eastAsia="bg-BG"/>
               </w:rPr>
-              <w:t xml:space="preserve">- Жилище, апартамент - в жилищна или вилна сграда, или в сграда със смесено предназначение, който съгласно Схема на самостоятелен обект в сграда № 15-212416-12.02.2026, издадена от АГКК, представлява самостоятелен обект в сграда с идентификатор 68134.107.198.1.6, с адрес: гр. София, район Средец, ул. ЦАР ИВАН АСЕН II №43, ет. 3, ап. 6, находящ се в сграда с идентификатор 68134.107.198.1, разположена в поземлен имот с идентификатор 68134.107.198, с площ от 80.00 кв. м., при съседи: на същия етаж – 68134.107.198.1.5, под обекта – 68134.107.198.1.4, над обекта – 68134.107.198.1.8.</w:t>
+              <w:t xml:space="preserve">- Жилище, апартамент - в жилищна или вилна сграда, или в сграда със смесено предназначение, който съгласно Схема на самостоятелен обект в сграда № 15-212416-12.02.2026 г., издадена от АГКК, представлява самостоятелен обект в сграда с идентификатор 68134.107.198.1.6, с адрес: гр. София, район Средец, ул. ЦАР ИВАН АСЕН II №43, ет. 3, ап. 6, находящ се в сграда с идентификатор 68134.107.198.1, разположена в поземлен имот с идентификатор 68134.107.198, с площ от 80.00 кв. м., при съседи: на същия етаж – 68134.107.198.1.5, под обекта – 68134.107.198.1.4, над обекта – 68134.107.198.1.8</w:t>
             </w:r>
             <w:r>
               <w:rPr>
@@ -2060,7 +2060,27 @@
                 <w:szCs w:val="21"/>
                 <w:lang w:eastAsia="bg-BG"/>
               </w:rPr>
-              <w:t xml:space="preserve">360000</w:t>
+              <w:t xml:space="preserve">360 000,00</w:t>
+            </w:r>
+            <w:r>
+              <w:rPr>
+                <w:rFonts w:ascii="Georgia" w:hAnsi="Georgia"/>
+                <w:b/>
+                <w:sz w:val="21"/>
+                <w:szCs w:val="21"/>
+                <w:lang w:eastAsia="bg-BG"/>
+              </w:rPr>
+              <w:t/>
+            </w:r>
+            <w:r>
+              <w:rPr>
+                <w:rFonts w:ascii="Georgia" w:hAnsi="Georgia"/>
+                <w:b/>
+                <w:sz w:val="21"/>
+                <w:szCs w:val="21"/>
+                <w:lang w:eastAsia="bg-BG"/>
+              </w:rPr>
+              <w:t/>
             </w:r>
             <w:r>
               <w:rPr>
@@ -2354,7 +2374,7 @@
                 <w:szCs w:val="21"/>
                 <w:lang w:eastAsia="bg-BG"/>
               </w:rPr>
-              <w:t xml:space="preserve">36000</w:t>
+              <w:t xml:space="preserve">36 000,00</w:t>
             </w:r>
             <w:r>
               <w:rPr>
@@ -2362,6 +2382,26 @@
                 <w:b/>
                 <w:sz w:val="21"/>
                 <w:szCs w:val="21"/>
+                <w:lang w:eastAsia="bg-BG"/>
+              </w:rPr>
+              <w:t/>
+            </w:r>
+            <w:r>
+              <w:rPr>
+                <w:rFonts w:ascii="Georgia" w:hAnsi="Georgia" w:cs="Courier New"/>
+                <w:b/>
+                <w:sz w:val="21"/>
+                <w:szCs w:val="21"/>
+                <w:lang w:eastAsia="bg-BG"/>
+              </w:rPr>
+              <w:t/>
+            </w:r>
+            <w:r>
+              <w:rPr>
+                <w:rFonts w:ascii="Georgia" w:hAnsi="Georgia" w:cs="Courier New"/>
+                <w:b/>
+                <w:sz w:val="21"/>
+                <w:szCs w:val="21"/>
                 <w:lang w:val="bg-BG" w:eastAsia="bg-BG"/>
               </w:rPr>
               <w:t xml:space="preserve"> евро (</w:t>
@@ -2429,7 +2469,7 @@
                 <w:szCs w:val="21"/>
                 <w:lang w:val="bg-BG" w:eastAsia="bg-BG"/>
               </w:rPr>
-              <w:t xml:space="preserve">продажна цена, като към датата на подписване на настоящия окончателен </w:t>
+              <w:t xml:space="preserve">продажна цена, като към датата на </w:t>
             </w:r>
             <w:r>
               <w:rPr>
@@ -2439,7 +2479,7 @@
                 <w:lang w:val="bg-BG" w:eastAsia="bg-BG"/>
               </w:rPr>
               <w:lastRenderedPageBreak/>
-              <w:t xml:space="preserve">договор във формата на нотариален акт дължимата сума от общата продажна цена е в размер на </w:t>
+              <w:t xml:space="preserve">подписване на настоящия окончателен договор във формата на нотариален акт дължимата сума от общата продажна цена е в размер на </w:t>
             </w:r>
             <w:r>
               <w:rPr>
@@ -2449,7 +2489,7 @@
                 <w:szCs w:val="21"/>
                 <w:lang w:eastAsia="bg-BG"/>
               </w:rPr>
-              <w:t xml:space="preserve">324000</w:t>
+              <w:t xml:space="preserve">324 000,00</w:t>
             </w:r>
             <w:r>
               <w:rPr>
@@ -2457,6 +2497,26 @@
                 <w:b/>
                 <w:sz w:val="21"/>
                 <w:szCs w:val="21"/>
+                <w:lang w:eastAsia="bg-BG"/>
+              </w:rPr>
+              <w:t/>
+            </w:r>
+            <w:r>
+              <w:rPr>
+                <w:rFonts w:ascii="Georgia" w:hAnsi="Georgia" w:cs="Courier New"/>
+                <w:b/>
+                <w:sz w:val="21"/>
+                <w:szCs w:val="21"/>
+                <w:lang w:eastAsia="bg-BG"/>
+              </w:rPr>
+              <w:t/>
+            </w:r>
+            <w:r>
+              <w:rPr>
+                <w:rFonts w:ascii="Georgia" w:hAnsi="Georgia" w:cs="Courier New"/>
+                <w:b/>
+                <w:sz w:val="21"/>
+                <w:szCs w:val="21"/>
                 <w:lang w:val="bg-BG" w:eastAsia="bg-BG"/>
               </w:rPr>
               <w:t xml:space="preserve"> евро (</w:t>
@@ -2546,7 +2606,27 @@
                 <w:szCs w:val="21"/>
                 <w:lang w:eastAsia="bg-BG"/>
               </w:rPr>
-              <w:t xml:space="preserve">324000</w:t>
+              <w:t xml:space="preserve">324 000,00</w:t>
+            </w:r>
+            <w:r>
+              <w:rPr>
+                <w:rFonts w:ascii="Georgia" w:hAnsi="Georgia" w:cs="Courier New"/>
+                <w:b/>
+                <w:sz w:val="21"/>
+                <w:szCs w:val="21"/>
+                <w:lang w:eastAsia="bg-BG"/>
+              </w:rPr>
+              <w:t/>
+            </w:r>
+            <w:r>
+              <w:rPr>
+                <w:rFonts w:ascii="Georgia" w:hAnsi="Georgia" w:cs="Courier New"/>
+                <w:b/>
+                <w:sz w:val="21"/>
+                <w:szCs w:val="21"/>
+                <w:lang w:eastAsia="bg-BG"/>
+              </w:rPr>
+              <w:t/>
             </w:r>
             <w:r>
               <w:rPr>
@@ -3919,9 +3999,9 @@
                 <w:rFonts w:ascii="Georgia" w:hAnsi="Georgia"/>
                 <w:sz w:val="21"/>
                 <w:szCs w:val="21"/>
-                <w:lang w:val="bg-BG" w:eastAsia="bg-BG"/>
-              </w:rPr>
-              <w:t>10</w:t>
+                <w:lang w:val="en-US" w:eastAsia="bg-BG"/>
+              </w:rPr>
+              <w:t xml:space="preserve">10</w:t>
             </w:r>
             <w:r>
               <w:rPr>
@@ -7205,6 +7285,7 @@
   <w:style w:type="character" w:default="1" w:styleId="DefaultParagraphFont">
     <w:name w:val="Default Paragraph Font"/>
     <w:uiPriority w:val="1"/>
+    <w:semiHidden/>
     <w:unhideWhenUsed/>
   </w:style>
   <w:style w:type="table" w:default="1" w:styleId="TableNormal">

</xml_diff>

<commit_message>
Format percentages and attached parts for DOCX output
</commit_message>
<xml_diff>
--- a/output/result.docx
+++ b/output/result.docx
@@ -1817,7 +1817,7 @@
                 <w:szCs w:val="21"/>
                 <w:lang w:eastAsia="bg-BG"/>
               </w:rPr>
-              <w:t xml:space="preserve">- Жилище, апартамент - в жилищна или вилна сграда, или в сграда със смесено предназначение, който съгласно Схема на самостоятелен обект в сграда № 15-212416-12.02.2026 г., издадена от АГКК, представлява самостоятелен обект в сграда с идентификатор 68134.107.198.1.6, с адрес: гр. София, район Средец, ул. ЦАР ИВАН АСЕН II № 43, ет. 3, ап. 6, находящ се в сграда с идентификатор 68134.107.198.1, с предназначение: Жилищна сграда - многофамилна, брой етажи: 5, разположена в поземлен имот с идентификатор 68134.107.198, с предназначение на обекта: Жилище, апартамент - в жилищна или вилна сграда, или в сграда със смесено предназначение, брой нива: 1, с площ от 80.00 кв. м., прилежащи части: таван 6, изба 6 и 12,51% ид.ч.от общите части на сградата, при съседи: на същия етаж – 68134.107.198.1.5, под обекта – 68134.107.198.1.4, над обекта – 68134.107.198.1.8</w:t>
+              <w:t xml:space="preserve">- Жилище, апартамент - в жилищна или вилна сграда, или в сграда със смесено предназначение, който съгласно Схема на самостоятелен обект в сграда № 15-212416-12.02.2026 г., издадена от АГКК, представлява самостоятелен обект в сграда с идентификатор 68134.107.198.1.6, с адрес: гр. София, район Средец, ул. ЦАР ИВАН АСЕН II № 43, ет. 3, ап. 6, находящ се в сграда с идентификатор 68134.107.198.1, с предназначение: Жилищна сграда - многофамилна, брой етажи: 5, разположена в поземлен имот с идентификатор 68134.107.198, с предназначение на обекта: Жилище, апартамент - в жилищна или вилна сграда, или в сграда със смесено предназначение, брой нива: 1, с площ от 80.00 кв. м., прилежащи части: таван 6, изба 6 и 12,51 % ид.ч.от общите части на сградата, при съседи: на същия етаж – 68134.107.198.1.5, под обекта – 68134.107.198.1.4, над обекта – 68134.107.198.1.8</w:t>
             </w:r>
             <w:r>
               <w:rPr>
@@ -2442,7 +2442,7 @@
                 <w:szCs w:val="21"/>
                 <w:lang w:eastAsia="bg-BG"/>
               </w:rPr>
-              <w:t xml:space="preserve">10</w:t>
+              <w:t xml:space="preserve">10 %</w:t>
             </w:r>
             <w:r>
               <w:rPr>
@@ -2451,7 +2451,7 @@
                 <w:szCs w:val="21"/>
                 <w:lang w:val="bg-BG" w:eastAsia="bg-BG"/>
               </w:rPr>
-              <w:t xml:space="preserve"> % (десет процента) от договорената </w:t>
+              <w:t xml:space="preserve"> (десет процента) от договорената </w:t>
             </w:r>
             <w:r>
               <w:rPr>
@@ -2469,7 +2469,7 @@
                 <w:szCs w:val="21"/>
                 <w:lang w:val="bg-BG" w:eastAsia="bg-BG"/>
               </w:rPr>
-              <w:t xml:space="preserve">продажна цена, като към датата на </w:t>
+              <w:t xml:space="preserve">продажна цена, като към </w:t>
             </w:r>
             <w:r>
               <w:rPr>
@@ -2479,7 +2479,7 @@
                 <w:lang w:val="bg-BG" w:eastAsia="bg-BG"/>
               </w:rPr>
               <w:lastRenderedPageBreak/>
-              <w:t xml:space="preserve">подписване на настоящия окончателен договор във формата на нотариален акт дължимата сума от общата продажна цена е в размер на </w:t>
+              <w:t xml:space="preserve">датата на подписване на настоящия окончателен договор във формата на нотариален акт дължимата сума от общата продажна цена е в размер на </w:t>
             </w:r>
             <w:r>
               <w:rPr>
@@ -4001,16 +4001,16 @@
                 <w:szCs w:val="21"/>
                 <w:lang w:val="en-US" w:eastAsia="bg-BG"/>
               </w:rPr>
-              <w:t xml:space="preserve">10</w:t>
-            </w:r>
-            <w:r>
-              <w:rPr>
-                <w:rFonts w:ascii="Georgia" w:hAnsi="Georgia"/>
-                <w:sz w:val="21"/>
-                <w:szCs w:val="21"/>
-                <w:lang w:val="bg-BG" w:eastAsia="bg-BG"/>
-              </w:rPr>
-              <w:t xml:space="preserve"> % (</w:t>
+              <w:t xml:space="preserve">10 %</w:t>
+            </w:r>
+            <w:r>
+              <w:rPr>
+                <w:rFonts w:ascii="Georgia" w:hAnsi="Georgia"/>
+                <w:sz w:val="21"/>
+                <w:szCs w:val="21"/>
+                <w:lang w:val="bg-BG" w:eastAsia="bg-BG"/>
+              </w:rPr>
+              <w:t xml:space="preserve"> (</w:t>
             </w:r>
             <w:r>
               <w:rPr>
@@ -5167,7 +5167,17 @@
                 <w:szCs w:val="21"/>
                 <w:lang w:val="bg-BG" w:eastAsia="bg-BG"/>
               </w:rPr>
-              <w:t xml:space="preserve">Преди извършването и подписването на нотариалния акт, в изпълнение на задълженията си по </w:t>
+              <w:t xml:space="preserve">Преди извършването и подписването на нотариалния акт, в изпълнение на задълженията </w:t>
+            </w:r>
+            <w:r>
+              <w:rPr>
+                <w:rFonts w:ascii="Georgia" w:hAnsi="Georgia"/>
+                <w:sz w:val="21"/>
+                <w:szCs w:val="21"/>
+                <w:lang w:val="bg-BG" w:eastAsia="bg-BG"/>
+              </w:rPr>
+              <w:lastRenderedPageBreak/>
+              <w:t xml:space="preserve">си по </w:t>
             </w:r>
             <w:r>
               <w:rPr>
@@ -5187,17 +5197,7 @@
                 <w:szCs w:val="21"/>
                 <w:lang w:val="bg-BG" w:eastAsia="bg-BG"/>
               </w:rPr>
-              <w:t xml:space="preserve">, разясних на участващите в нотариалното производство лица, ясно и </w:t>
-            </w:r>
-            <w:r>
-              <w:rPr>
-                <w:rFonts w:ascii="Georgia" w:hAnsi="Georgia"/>
-                <w:sz w:val="21"/>
-                <w:szCs w:val="21"/>
-                <w:lang w:val="bg-BG" w:eastAsia="bg-BG"/>
-              </w:rPr>
-              <w:lastRenderedPageBreak/>
-              <w:t>недвусмислено фактическото положение и правните последици от този договор, и се убедих, че същите го сключват по добра воля, че разбират смисъла и значението на акта, който извършват и желаят настъпването на правните му последици. ----------------------------</w:t>
+              <w:t>, разясних на участващите в нотариалното производство лица, ясно и недвусмислено фактическото положение и правните последици от този договор, и се убедих, че същите го сключват по добра воля, че разбират смисъла и значението на акта, който извършват и желаят настъпването на правните му последици. ----------------------------</w:t>
             </w:r>
             <w:r>
               <w:rPr>

</xml_diff>

<commit_message>
Add dynamic tax evaluation fields
</commit_message>
<xml_diff>
--- a/output/result.docx
+++ b/output/result.docx
@@ -1824,194 +1824,27 @@
                 <w:rFonts w:ascii="Georgia" w:eastAsia="Calibri" w:hAnsi="Georgia"/>
                 <w:sz w:val="21"/>
                 <w:szCs w:val="21"/>
+                <w:lang w:eastAsia="bg-BG"/>
+              </w:rPr>
+              <w:t>,</w:t>
+            </w:r>
+            <w:r>
+              <w:rPr>
+                <w:rFonts w:ascii="Georgia" w:eastAsia="Calibri" w:hAnsi="Georgia"/>
+                <w:sz w:val="21"/>
+                <w:szCs w:val="21"/>
                 <w:lang w:val="bg-BG" w:eastAsia="bg-BG"/>
               </w:rPr>
               <w:t xml:space="preserve"> </w:t>
             </w:r>
             <w:r>
               <w:rPr>
-                <w:rFonts w:ascii="Georgia" w:hAnsi="Georgia"/>
-                <w:i/>
-                <w:sz w:val="21"/>
-                <w:szCs w:val="21"/>
-                <w:lang w:val="bg-BG"/>
-              </w:rPr>
-              <w:t xml:space="preserve">представляващ съгласно доказателствен </w:t>
-            </w:r>
-            <w:r>
-              <w:rPr>
-                <w:rFonts w:ascii="Georgia" w:hAnsi="Georgia"/>
-                <w:i/>
-                <w:sz w:val="21"/>
-                <w:szCs w:val="21"/>
-                <w:lang w:val="bg-BG"/>
-              </w:rPr>
-              <w:t>Н</w:t>
-            </w:r>
-            <w:r>
-              <w:rPr>
-                <w:rFonts w:ascii="Georgia" w:hAnsi="Georgia"/>
-                <w:i/>
-                <w:sz w:val="21"/>
-                <w:szCs w:val="21"/>
-                <w:lang w:val="bg-BG"/>
-              </w:rPr>
-              <w:t>отариален акт за покупко-продажба на недвижим имот, № 29, том 2, рег. № 3118, дело 179 от 17.06.2005г. на Нотариус Маргарита Перусанова, рег. № 236 в НК, с район на действие – РС – София, вписан в СВ – гр. София към АВ с вх. рег. 29484 от 17.06.2005г., Акт № 183, том 85, дело № 21635/2005г., по имотна партида № 311618</w:t>
-            </w:r>
-            <w:r>
-              <w:rPr>
-                <w:rFonts w:ascii="Georgia" w:hAnsi="Georgia"/>
-                <w:sz w:val="21"/>
-                <w:szCs w:val="21"/>
-                <w:lang w:val="bg-BG"/>
-              </w:rPr>
-              <w:t xml:space="preserve"> –</w:t>
-            </w:r>
-            <w:r>
-              <w:rPr>
-                <w:rFonts w:ascii="Georgia" w:hAnsi="Georgia"/>
-                <w:sz w:val="21"/>
-                <w:szCs w:val="21"/>
-                <w:lang w:val="bg-BG"/>
-              </w:rPr>
-              <w:t xml:space="preserve"> </w:t>
-            </w:r>
-            <w:r>
-              <w:rPr>
-                <w:rFonts w:ascii="Georgia" w:hAnsi="Georgia"/>
-                <w:b/>
-                <w:bCs/>
-                <w:sz w:val="21"/>
-                <w:szCs w:val="21"/>
-                <w:lang w:val="bg-BG"/>
-              </w:rPr>
-              <w:t>АПАРТАМЕНТ № 6</w:t>
-            </w:r>
-            <w:r>
-              <w:rPr>
-                <w:rFonts w:ascii="Georgia" w:hAnsi="Georgia"/>
-                <w:sz w:val="21"/>
-                <w:szCs w:val="21"/>
-                <w:lang w:val="bg-BG"/>
-              </w:rPr>
-              <w:t xml:space="preserve"> /</w:t>
-            </w:r>
-            <w:r>
-              <w:rPr>
-                <w:rFonts w:ascii="Georgia" w:hAnsi="Georgia"/>
-                <w:b/>
-                <w:bCs/>
-                <w:sz w:val="21"/>
-                <w:szCs w:val="21"/>
-                <w:lang w:val="bg-BG"/>
-              </w:rPr>
-              <w:t>шест</w:t>
-            </w:r>
-            <w:r>
-              <w:rPr>
-                <w:rFonts w:ascii="Georgia" w:hAnsi="Georgia"/>
-                <w:sz w:val="21"/>
-                <w:szCs w:val="21"/>
-                <w:lang w:val="bg-BG"/>
-              </w:rPr>
-              <w:t xml:space="preserve">/, находящ се в град София, в сградата на Е. С. „Попилиеви“, на ул. „Цар Иван Асен II /втори/“ № 43 /четиридесет и три/, с площ от 80 /осемдесет/ кв. м., състоящ се от две стаи, хол, кухня и сервизни помещения, при съседи: изток – апартамент № 5 /пет/ на Радко Димитров Попилиев и стълбище, север – дворно място, запад – дворно място, юг – улица „Цар Иван Асен II /втори/“, </w:t>
-            </w:r>
-            <w:r>
-              <w:rPr>
-                <w:rFonts w:ascii="Georgia" w:hAnsi="Georgia"/>
-                <w:b/>
-                <w:sz w:val="21"/>
-                <w:szCs w:val="21"/>
-                <w:lang w:val="bg-BG"/>
-              </w:rPr>
-              <w:t>заедно с ТАВАНСКО ПОМЕЩЕНИЕ</w:t>
-            </w:r>
-            <w:r>
-              <w:rPr>
-                <w:rFonts w:ascii="Georgia" w:hAnsi="Georgia"/>
-                <w:sz w:val="21"/>
-                <w:szCs w:val="21"/>
-                <w:lang w:val="bg-BG"/>
-              </w:rPr>
-              <w:t xml:space="preserve"> </w:t>
-            </w:r>
-            <w:r>
-              <w:rPr>
-                <w:rFonts w:ascii="Georgia" w:hAnsi="Georgia"/>
-                <w:b/>
-                <w:bCs/>
-                <w:sz w:val="21"/>
-                <w:szCs w:val="21"/>
-                <w:lang w:val="bg-BG"/>
-              </w:rPr>
-              <w:t>№ 6</w:t>
-            </w:r>
-            <w:r>
-              <w:rPr>
-                <w:rFonts w:ascii="Georgia" w:hAnsi="Georgia"/>
-                <w:sz w:val="21"/>
-                <w:szCs w:val="21"/>
-                <w:lang w:val="bg-BG"/>
-              </w:rPr>
-              <w:t xml:space="preserve"> /шест/, без описана квадратура по доказателствен нотариален акт, при съседи: изток – таванско помещение № 7 /седем/ на Мая Аврамова Лисичкова и коридор, север – коридор, запад – таванско помещение № 5 /пет/ на Роза Костова Илиева и коридор, </w:t>
-            </w:r>
-            <w:r>
-              <w:rPr>
-                <w:rFonts w:ascii="Georgia" w:hAnsi="Georgia"/>
-                <w:b/>
-                <w:sz w:val="21"/>
-                <w:szCs w:val="21"/>
-                <w:lang w:val="bg-BG"/>
-              </w:rPr>
-              <w:t>заедно с ИЗБЕНО ПОМЕЩЕНИЕ № 6</w:t>
-            </w:r>
-            <w:r>
-              <w:rPr>
-                <w:rFonts w:ascii="Georgia" w:hAnsi="Georgia"/>
-                <w:sz w:val="21"/>
-                <w:szCs w:val="21"/>
-                <w:lang w:val="bg-BG"/>
-              </w:rPr>
-              <w:t xml:space="preserve"> /шест/, без описана квадратура по доказателствен нотариален акт, при съседи: изток – коридор, север – избено помещение № 7 /седем/ на Мария Георгиева Дончева, запад – коридор, юг – улица „Цар Иван Асен II /втори/“, </w:t>
-            </w:r>
-            <w:r>
-              <w:rPr>
-                <w:rFonts w:ascii="Georgia" w:hAnsi="Georgia"/>
-                <w:b/>
-                <w:sz w:val="21"/>
-                <w:szCs w:val="21"/>
-                <w:lang w:val="bg-BG"/>
-              </w:rPr>
-              <w:t>заедно с 12,51 % /дванадесет цяло петдесет и една стотни</w:t>
-            </w:r>
-            <w:r>
-              <w:rPr>
-                <w:rFonts w:ascii="Georgia" w:hAnsi="Georgia"/>
-                <w:b/>
-                <w:sz w:val="21"/>
-                <w:szCs w:val="21"/>
-                <w:lang w:val="bg-BG"/>
-              </w:rPr>
-              <w:t xml:space="preserve"> върху сто</w:t>
-            </w:r>
-            <w:r>
-              <w:rPr>
-                <w:rFonts w:ascii="Georgia" w:hAnsi="Georgia"/>
-                <w:b/>
-                <w:sz w:val="21"/>
-                <w:szCs w:val="21"/>
-                <w:lang w:val="bg-BG"/>
-              </w:rPr>
-              <w:t>/ идеални части от общите части на сградата и от правото на строеж върху мястото</w:t>
-            </w:r>
-            <w:r>
-              <w:rPr>
-                <w:rFonts w:ascii="Georgia" w:hAnsi="Georgia"/>
-                <w:sz w:val="21"/>
-                <w:szCs w:val="21"/>
-                <w:lang w:val="bg-BG"/>
-              </w:rPr>
-              <w:t>, в което е построена сградата, с площ от 263,50 /двеста шестдесет и три цяло и петдесет стотни/ кв. м., съставляващо имот планоснимачен номер 13 /тринадесет/, в квартал 23 /двадесет и три/ по плана на град София, местност „Трета извънградска част“</w:t>
+                <w:rFonts w:ascii="Georgia" w:eastAsia="Calibri" w:hAnsi="Georgia"/>
+                <w:sz w:val="21"/>
+                <w:szCs w:val="21"/>
+                <w:lang w:eastAsia="bg-BG"/>
+              </w:rPr>
+              <w:t xml:space="preserve">представляващ съгласно доказателствен Нотариален акт за покупко-продажба на недвижим имот, № 29, том 2, рег. № 3118, дело 179 от 17.06.2005г. на Нотариус Маргарита Перусанова, рег. № 236 в НК, с район на действие – РС – София, вписан в СВ – гр. София към АВ с вх. рег. 29484 от 17.06.2005г., Акт № 183, том 85, дело № 21635/2005г., по имотна партида № 311618 – АПАРТАМЕНТ № 6 /шест/, находящ се в град София, в сградата на Е. С. „Попилиеви“, на ул. „Цар Иван Асен II /втори/“ № 43 /четиридесет и три/, с площ от 80 /осемдесет/ кв. м., състоящ се от две стаи, хол, кухня и сервизни помещения, при съседи: изток – апартамент № 5 /пет/ на Радко Димитров Попилиев и стълбище, север – дворно място, запад – дворно място, юг – улица „Цар Иван Асен II /втори/“, заедно с ТАВАНСКО ПОМЕЩЕНИЕ № 6 /шест/, без описана квадратура по доказателствен нотариален акт, при съседи: изток – таванско помещение № 7 /седем/ на Мая Аврамова Лисичкова и коридор, север – коридор, запад – таванско помещение № 5 /пет/ на Роза Костова Илиева и коридор, заедно с ИЗБЕНО ПОМЕЩЕНИЕ № 6 /шест/, без описана квадратура по доказателствен нотариален акт, при съседи: изток – коридор, север – избено помещение № 7 /седем/ на Мария Георгиева Дончева, запад – коридор, юг – улица „Цар Иван Асен II /втори/“, заедно с 12,51 % /дванадесет цяло петдесет и една стотни върху сто/ идеални части от общите части на сградата и от правото на строеж върху мястото, в което е построена сградата, с площ от 263,50 /двеста шестдесет и три цяло и петдесет стотни/ кв. м., съставляващо имот планоснимачен номер 13 /тринадесет/, в квартал 23 /двадесет и три/ по плана на град София, местност „Трета извънградска част“</w:t>
             </w:r>
             <w:r>
               <w:rPr>
@@ -2469,17 +2302,7 @@
                 <w:szCs w:val="21"/>
                 <w:lang w:val="bg-BG" w:eastAsia="bg-BG"/>
               </w:rPr>
-              <w:t xml:space="preserve">продажна цена, като към </w:t>
-            </w:r>
-            <w:r>
-              <w:rPr>
-                <w:rFonts w:ascii="Georgia" w:hAnsi="Georgia" w:cs="Courier New"/>
-                <w:sz w:val="21"/>
-                <w:szCs w:val="21"/>
-                <w:lang w:val="bg-BG" w:eastAsia="bg-BG"/>
-              </w:rPr>
-              <w:lastRenderedPageBreak/>
-              <w:t xml:space="preserve">датата на подписване на настоящия окончателен договор във формата на нотариален акт дължимата сума от общата продажна цена е в размер на </w:t>
+              <w:t xml:space="preserve">продажна цена, като към датата на подписване на настоящия окончателен договор във формата на нотариален акт дължимата сума от общата продажна цена е в размер на </w:t>
             </w:r>
             <w:r>
               <w:rPr>
@@ -3646,7 +3469,17 @@
                 <w:szCs w:val="21"/>
                 <w:lang w:val="bg-BG" w:eastAsia="bg-BG"/>
               </w:rPr>
-              <w:t xml:space="preserve"> няма сключени предварителни договори за продажба с трети лица, не </w:t>
+              <w:t xml:space="preserve"> няма сключени предварителни договори за продажба с трети </w:t>
+            </w:r>
+            <w:r>
+              <w:rPr>
+                <w:rFonts w:ascii="Georgia" w:hAnsi="Georgia"/>
+                <w:sz w:val="21"/>
+                <w:szCs w:val="21"/>
+                <w:lang w:val="bg-BG" w:eastAsia="bg-BG"/>
+              </w:rPr>
+              <w:lastRenderedPageBreak/>
+              <w:t xml:space="preserve">лица, не </w:t>
             </w:r>
             <w:r>
               <w:rPr>
@@ -5167,17 +5000,7 @@
                 <w:szCs w:val="21"/>
                 <w:lang w:val="bg-BG" w:eastAsia="bg-BG"/>
               </w:rPr>
-              <w:t xml:space="preserve">Преди извършването и подписването на нотариалния акт, в изпълнение на задълженията </w:t>
-            </w:r>
-            <w:r>
-              <w:rPr>
-                <w:rFonts w:ascii="Georgia" w:hAnsi="Georgia"/>
-                <w:sz w:val="21"/>
-                <w:szCs w:val="21"/>
-                <w:lang w:val="bg-BG" w:eastAsia="bg-BG"/>
-              </w:rPr>
-              <w:lastRenderedPageBreak/>
-              <w:t xml:space="preserve">си по </w:t>
+              <w:t xml:space="preserve">Преди извършването и подписването на нотариалния акт, в изпълнение на задълженията си по </w:t>
             </w:r>
             <w:r>
               <w:rPr>
@@ -5525,7 +5348,17 @@
                 <w:szCs w:val="21"/>
                 <w:lang w:val="bg-BG" w:eastAsia="bg-BG"/>
               </w:rPr>
-              <w:t>РСЦ24-УГ01-4783/30.07.2024 г., издадено от Столична община-район „Средец“</w:t>
+              <w:t>РСЦ24-УГ01-</w:t>
+            </w:r>
+            <w:r>
+              <w:rPr>
+                <w:rFonts w:ascii="Georgia" w:hAnsi="Georgia"/>
+                <w:sz w:val="21"/>
+                <w:szCs w:val="21"/>
+                <w:lang w:val="bg-BG" w:eastAsia="bg-BG"/>
+              </w:rPr>
+              <w:lastRenderedPageBreak/>
+              <w:t>4783/30.07.2024 г., издадено от Столична община-район „Средец“</w:t>
             </w:r>
             <w:r>
               <w:rPr>

</xml_diff>

<commit_message>
Add dynamic seller bank details
</commit_message>
<xml_diff>
--- a/output/result.docx
+++ b/output/result.docx
@@ -2592,44 +2592,43 @@
                 <w:spacing w:val="3"/>
                 <w:sz w:val="21"/>
                 <w:szCs w:val="21"/>
-                <w:lang w:val="bg-BG" w:eastAsia="bg-BG"/>
-              </w:rPr>
-              <w:t>„</w:t>
-            </w:r>
-            <w:r>
-              <w:rPr>
-                <w:rFonts w:ascii="Georgia" w:hAnsi="Georgia"/>
-                <w:b/>
+                <w:lang w:eastAsia="bg-BG"/>
+              </w:rPr>
+              <w:t xml:space="preserve">„УНИКРЕДИТ БУЛБАНК“ АД</w:t>
+            </w:r>
+            <w:r>
+              <w:rPr>
+                <w:rFonts w:ascii="Georgia" w:hAnsi="Georgia"/>
                 <w:color w:val="000000"/>
                 <w:spacing w:val="3"/>
                 <w:sz w:val="21"/>
                 <w:szCs w:val="21"/>
                 <w:lang w:val="bg-BG" w:eastAsia="bg-BG"/>
               </w:rPr>
-              <w:t>УНИКРЕДИТ БУЛБАНК</w:t>
-            </w:r>
-            <w:r>
-              <w:rPr>
-                <w:rFonts w:ascii="Georgia" w:hAnsi="Georgia"/>
-                <w:b/>
+              <w:t xml:space="preserve">, </w:t>
+            </w:r>
+            <w:r>
+              <w:rPr>
+                <w:rFonts w:ascii="Georgia" w:hAnsi="Georgia"/>
                 <w:color w:val="000000"/>
                 <w:spacing w:val="3"/>
                 <w:sz w:val="21"/>
                 <w:szCs w:val="21"/>
-                <w:lang w:val="bg-BG" w:eastAsia="bg-BG"/>
-              </w:rPr>
-              <w:t>“ АД</w:t>
-            </w:r>
-            <w:r>
-              <w:rPr>
-                <w:rFonts w:ascii="Georgia" w:hAnsi="Georgia"/>
+                <w:lang w:val="en-US" w:eastAsia="bg-BG"/>
+              </w:rPr>
+              <w:t xml:space="preserve">BIC </w:t>
+            </w:r>
+            <w:r>
+              <w:rPr>
+                <w:rFonts w:ascii="Georgia" w:hAnsi="Georgia"/>
+                <w:b/>
                 <w:color w:val="000000"/>
                 <w:spacing w:val="3"/>
                 <w:sz w:val="21"/>
                 <w:szCs w:val="21"/>
-                <w:lang w:val="bg-BG" w:eastAsia="bg-BG"/>
-              </w:rPr>
-              <w:t xml:space="preserve">, </w:t>
+                <w:lang w:eastAsia="bg-BG"/>
+              </w:rPr>
+              <w:t xml:space="preserve">UNCRBGSF</w:t>
             </w:r>
             <w:r>
               <w:rPr>
@@ -2638,199 +2637,32 @@
                 <w:spacing w:val="3"/>
                 <w:sz w:val="21"/>
                 <w:szCs w:val="21"/>
-                <w:lang w:val="en-US" w:eastAsia="bg-BG"/>
-              </w:rPr>
-              <w:t xml:space="preserve">BIC </w:t>
-            </w:r>
-            <w:r>
-              <w:rPr>
-                <w:rFonts w:ascii="Georgia" w:hAnsi="Georgia"/>
-                <w:b/>
+                <w:lang w:val="bg-BG" w:eastAsia="bg-BG"/>
+              </w:rPr>
+              <w:t xml:space="preserve">, </w:t>
+            </w:r>
+            <w:r>
+              <w:rPr>
+                <w:rFonts w:ascii="Georgia" w:hAnsi="Georgia"/>
                 <w:color w:val="000000"/>
                 <w:spacing w:val="3"/>
                 <w:sz w:val="21"/>
                 <w:szCs w:val="21"/>
                 <w:lang w:val="en-US" w:eastAsia="bg-BG"/>
               </w:rPr>
-              <w:t>UNCRBGSF</w:t>
-            </w:r>
-            <w:r>
-              <w:rPr>
-                <w:rFonts w:ascii="Georgia" w:hAnsi="Georgia"/>
+              <w:t xml:space="preserve">IBAN </w:t>
+            </w:r>
+            <w:r>
+              <w:rPr>
+                <w:rFonts w:ascii="Georgia" w:hAnsi="Georgia"/>
+                <w:b/>
                 <w:color w:val="000000"/>
                 <w:spacing w:val="3"/>
                 <w:sz w:val="21"/>
                 <w:szCs w:val="21"/>
-                <w:lang w:val="bg-BG" w:eastAsia="bg-BG"/>
-              </w:rPr>
-              <w:t xml:space="preserve">, </w:t>
-            </w:r>
-            <w:r>
-              <w:rPr>
-                <w:rFonts w:ascii="Georgia" w:hAnsi="Georgia"/>
-                <w:color w:val="000000"/>
-                <w:spacing w:val="3"/>
-                <w:sz w:val="21"/>
-                <w:szCs w:val="21"/>
-                <w:lang w:val="en-US" w:eastAsia="bg-BG"/>
-              </w:rPr>
-              <w:t xml:space="preserve">IBAN </w:t>
-            </w:r>
-            <w:r>
-              <w:rPr>
-                <w:rFonts w:ascii="Georgia" w:hAnsi="Georgia"/>
-                <w:b/>
-                <w:color w:val="000000"/>
-                <w:spacing w:val="3"/>
-                <w:sz w:val="21"/>
-                <w:szCs w:val="21"/>
-                <w:lang w:val="en-US" w:eastAsia="bg-BG"/>
-              </w:rPr>
-              <w:t>BG</w:t>
-            </w:r>
-            <w:r>
-              <w:rPr>
-                <w:rFonts w:ascii="Georgia" w:hAnsi="Georgia"/>
-                <w:b/>
-                <w:color w:val="000000"/>
-                <w:spacing w:val="3"/>
-                <w:sz w:val="21"/>
-                <w:szCs w:val="21"/>
-                <w:lang w:val="bg-BG" w:eastAsia="bg-BG"/>
-              </w:rPr>
-              <w:t xml:space="preserve"> </w:t>
-            </w:r>
-            <w:r>
-              <w:rPr>
-                <w:rFonts w:ascii="Georgia" w:hAnsi="Georgia"/>
-                <w:b/>
-                <w:color w:val="000000"/>
-                <w:spacing w:val="3"/>
-                <w:sz w:val="21"/>
-                <w:szCs w:val="21"/>
-                <w:lang w:val="en-US" w:eastAsia="bg-BG"/>
-              </w:rPr>
-              <w:t>67</w:t>
-            </w:r>
-            <w:r>
-              <w:rPr>
-                <w:rFonts w:ascii="Georgia" w:hAnsi="Georgia"/>
-                <w:b/>
-                <w:color w:val="000000"/>
-                <w:spacing w:val="3"/>
-                <w:sz w:val="21"/>
-                <w:szCs w:val="21"/>
-                <w:lang w:val="bg-BG" w:eastAsia="bg-BG"/>
-              </w:rPr>
-              <w:t xml:space="preserve"> </w:t>
-            </w:r>
-            <w:r>
-              <w:rPr>
-                <w:rFonts w:ascii="Georgia" w:hAnsi="Georgia"/>
-                <w:b/>
-                <w:color w:val="000000"/>
-                <w:spacing w:val="3"/>
-                <w:sz w:val="21"/>
-                <w:szCs w:val="21"/>
-                <w:lang w:val="en-US" w:eastAsia="bg-BG"/>
-              </w:rPr>
-              <w:t>UNCR</w:t>
-            </w:r>
-            <w:r>
-              <w:rPr>
-                <w:rFonts w:ascii="Georgia" w:hAnsi="Georgia"/>
-                <w:b/>
-                <w:color w:val="000000"/>
-                <w:spacing w:val="3"/>
-                <w:sz w:val="21"/>
-                <w:szCs w:val="21"/>
-                <w:lang w:val="bg-BG" w:eastAsia="bg-BG"/>
-              </w:rPr>
-              <w:t xml:space="preserve"> </w:t>
-            </w:r>
-            <w:r>
-              <w:rPr>
-                <w:rFonts w:ascii="Georgia" w:hAnsi="Georgia"/>
-                <w:b/>
-                <w:color w:val="000000"/>
-                <w:spacing w:val="3"/>
-                <w:sz w:val="21"/>
-                <w:szCs w:val="21"/>
-                <w:lang w:val="en-US" w:eastAsia="bg-BG"/>
-              </w:rPr>
-              <w:t>7000</w:t>
-            </w:r>
-            <w:r>
-              <w:rPr>
-                <w:rFonts w:ascii="Georgia" w:hAnsi="Georgia"/>
-                <w:b/>
-                <w:color w:val="000000"/>
-                <w:spacing w:val="3"/>
-                <w:sz w:val="21"/>
-                <w:szCs w:val="21"/>
-                <w:lang w:val="bg-BG" w:eastAsia="bg-BG"/>
-              </w:rPr>
-              <w:t xml:space="preserve"> </w:t>
-            </w:r>
-            <w:r>
-              <w:rPr>
-                <w:rFonts w:ascii="Georgia" w:hAnsi="Georgia"/>
-                <w:b/>
-                <w:color w:val="000000"/>
-                <w:spacing w:val="3"/>
-                <w:sz w:val="21"/>
-                <w:szCs w:val="21"/>
-                <w:lang w:val="en-US" w:eastAsia="bg-BG"/>
-              </w:rPr>
-              <w:t>4522</w:t>
-            </w:r>
-            <w:r>
-              <w:rPr>
-                <w:rFonts w:ascii="Georgia" w:hAnsi="Georgia"/>
-                <w:b/>
-                <w:color w:val="000000"/>
-                <w:spacing w:val="3"/>
-                <w:sz w:val="21"/>
-                <w:szCs w:val="21"/>
-                <w:lang w:val="bg-BG" w:eastAsia="bg-BG"/>
-              </w:rPr>
-              <w:t xml:space="preserve"> </w:t>
-            </w:r>
-            <w:r>
-              <w:rPr>
-                <w:rFonts w:ascii="Georgia" w:hAnsi="Georgia"/>
-                <w:b/>
-                <w:color w:val="000000"/>
-                <w:spacing w:val="3"/>
-                <w:sz w:val="21"/>
-                <w:szCs w:val="21"/>
-                <w:lang w:val="en-US" w:eastAsia="bg-BG"/>
-              </w:rPr>
-              <w:t>6900</w:t>
-            </w:r>
-            <w:r>
-              <w:rPr>
-                <w:rFonts w:ascii="Georgia" w:hAnsi="Georgia"/>
-                <w:b/>
-                <w:color w:val="000000"/>
-                <w:spacing w:val="3"/>
-                <w:sz w:val="21"/>
-                <w:szCs w:val="21"/>
-                <w:lang w:val="bg-BG" w:eastAsia="bg-BG"/>
-              </w:rPr>
-              <w:t xml:space="preserve"> </w:t>
-            </w:r>
-            <w:r>
-              <w:rPr>
-                <w:rFonts w:ascii="Georgia" w:hAnsi="Georgia"/>
-                <w:b/>
-                <w:color w:val="000000"/>
-                <w:spacing w:val="3"/>
-                <w:sz w:val="21"/>
-                <w:szCs w:val="21"/>
-                <w:lang w:val="en-US" w:eastAsia="bg-BG"/>
-              </w:rPr>
-              <w:t>18</w:t>
+                <w:lang w:eastAsia="bg-BG"/>
+              </w:rPr>
+              <w:t xml:space="preserve">BG 67 UNCR 7000 4522 6900 18</w:t>
             </w:r>
             <w:r>
               <w:rPr>
@@ -3012,9 +2844,9 @@
                 <w:bCs/>
                 <w:sz w:val="21"/>
                 <w:szCs w:val="21"/>
-                <w:lang w:val="en-US" w:eastAsia="bg-BG"/>
-              </w:rPr>
-              <w:t>48 492</w:t>
+                <w:lang w:eastAsia="bg-BG"/>
+              </w:rPr>
+              <w:t xml:space="preserve">48 492,90</w:t>
             </w:r>
             <w:r>
               <w:rPr>
@@ -3025,7 +2857,7 @@
                 <w:szCs w:val="21"/>
                 <w:lang w:val="bg-BG" w:eastAsia="bg-BG"/>
               </w:rPr>
-              <w:t>, 90</w:t>
+              <w:t xml:space="preserve"> </w:t>
             </w:r>
             <w:r>
               <w:rPr>
@@ -3036,33 +2868,22 @@
                 <w:szCs w:val="21"/>
                 <w:lang w:val="bg-BG" w:eastAsia="bg-BG"/>
               </w:rPr>
+              <w:t>евро</w:t>
+            </w:r>
+            <w:r>
+              <w:rPr>
+                <w:rFonts w:ascii="Georgia" w:hAnsi="Georgia"/>
+                <w:b/>
+                <w:bCs/>
+                <w:sz w:val="21"/>
+                <w:szCs w:val="21"/>
+                <w:lang w:val="bg-BG" w:eastAsia="bg-BG"/>
+              </w:rPr>
               <w:t xml:space="preserve"> </w:t>
             </w:r>
             <w:r>
               <w:rPr>
                 <w:rFonts w:ascii="Georgia" w:hAnsi="Georgia"/>
-                <w:b/>
-                <w:bCs/>
-                <w:sz w:val="21"/>
-                <w:szCs w:val="21"/>
-                <w:lang w:val="bg-BG" w:eastAsia="bg-BG"/>
-              </w:rPr>
-              <w:t>евро</w:t>
-            </w:r>
-            <w:r>
-              <w:rPr>
-                <w:rFonts w:ascii="Georgia" w:hAnsi="Georgia"/>
-                <w:b/>
-                <w:bCs/>
-                <w:sz w:val="21"/>
-                <w:szCs w:val="21"/>
-                <w:lang w:val="bg-BG" w:eastAsia="bg-BG"/>
-              </w:rPr>
-              <w:t xml:space="preserve"> </w:t>
-            </w:r>
-            <w:r>
-              <w:rPr>
-                <w:rFonts w:ascii="Georgia" w:hAnsi="Georgia"/>
                 <w:sz w:val="21"/>
                 <w:szCs w:val="21"/>
                 <w:lang w:val="bg-BG" w:eastAsia="bg-BG"/>
@@ -3074,36 +2895,27 @@
                 <w:rFonts w:ascii="Georgia" w:hAnsi="Georgia"/>
                 <w:sz w:val="21"/>
                 <w:szCs w:val="21"/>
-                <w:lang w:val="bg-BG" w:eastAsia="bg-BG"/>
-              </w:rPr>
-              <w:t>четиридесет и осем хиляди четиристотин деветдесет и две евро и деветдесет евроцента</w:t>
-            </w:r>
-            <w:r>
-              <w:rPr>
-                <w:rFonts w:ascii="Georgia" w:hAnsi="Georgia"/>
-                <w:sz w:val="21"/>
-                <w:szCs w:val="21"/>
-                <w:lang w:val="bg-BG" w:eastAsia="bg-BG"/>
-              </w:rPr>
-              <w:t>), съгласно Удостоверение за данъчна оценка с изх. № 7</w:t>
-            </w:r>
-            <w:r>
-              <w:rPr>
-                <w:rFonts w:ascii="Georgia" w:hAnsi="Georgia"/>
-                <w:sz w:val="21"/>
-                <w:szCs w:val="21"/>
-                <w:lang w:val="bg-BG" w:eastAsia="bg-BG"/>
-              </w:rPr>
-              <w:t>2</w:t>
-            </w:r>
-            <w:r>
-              <w:rPr>
-                <w:rFonts w:ascii="Georgia" w:hAnsi="Georgia"/>
-                <w:sz w:val="21"/>
-                <w:szCs w:val="21"/>
-                <w:lang w:val="bg-BG" w:eastAsia="bg-BG"/>
-              </w:rPr>
-              <w:t>24051164</w:t>
+                <w:lang w:eastAsia="bg-BG"/>
+              </w:rPr>
+              <w:t xml:space="preserve">четиридесет и осем хиляди четиристотин деветдесет и две евро и деветдесет евроцента</w:t>
+            </w:r>
+            <w:r>
+              <w:rPr>
+                <w:rFonts w:ascii="Georgia" w:hAnsi="Georgia"/>
+                <w:sz w:val="21"/>
+                <w:szCs w:val="21"/>
+                <w:lang w:val="bg-BG" w:eastAsia="bg-BG"/>
+              </w:rPr>
+              <w:t xml:space="preserve">), съгласно Удостоверение за данъчна оценка с изх. № </w:t>
+            </w:r>
+            <w:r>
+              <w:rPr>
+                <w:rFonts w:ascii="Georgia" w:hAnsi="Georgia"/>
+                <w:sz w:val="21"/>
+                <w:szCs w:val="21"/>
+                <w:lang w:eastAsia="bg-BG"/>
+              </w:rPr>
+              <w:t xml:space="preserve">7224051164</w:t>
             </w:r>
             <w:r>
               <w:rPr>
@@ -3119,90 +2931,36 @@
                 <w:rFonts w:ascii="Georgia" w:hAnsi="Georgia"/>
                 <w:sz w:val="21"/>
                 <w:szCs w:val="21"/>
-                <w:lang w:val="bg-BG" w:eastAsia="bg-BG"/>
-              </w:rPr>
-              <w:t>25</w:t>
-            </w:r>
-            <w:r>
-              <w:rPr>
-                <w:rFonts w:ascii="Georgia" w:hAnsi="Georgia"/>
-                <w:sz w:val="21"/>
-                <w:szCs w:val="21"/>
-                <w:lang w:val="bg-BG" w:eastAsia="bg-BG"/>
-              </w:rPr>
-              <w:t>.0</w:t>
-            </w:r>
-            <w:r>
-              <w:rPr>
-                <w:rFonts w:ascii="Georgia" w:hAnsi="Georgia"/>
-                <w:sz w:val="21"/>
-                <w:szCs w:val="21"/>
-                <w:lang w:val="bg-BG" w:eastAsia="bg-BG"/>
-              </w:rPr>
-              <w:t>3</w:t>
-            </w:r>
-            <w:r>
-              <w:rPr>
-                <w:rFonts w:ascii="Georgia" w:hAnsi="Georgia"/>
-                <w:sz w:val="21"/>
-                <w:szCs w:val="21"/>
-                <w:lang w:val="bg-BG" w:eastAsia="bg-BG"/>
-              </w:rPr>
-              <w:t>.202</w:t>
-            </w:r>
-            <w:r>
-              <w:rPr>
-                <w:rFonts w:ascii="Georgia" w:hAnsi="Georgia"/>
-                <w:sz w:val="21"/>
-                <w:szCs w:val="21"/>
-                <w:lang w:val="bg-BG" w:eastAsia="bg-BG"/>
-              </w:rPr>
-              <w:t>6</w:t>
-            </w:r>
-            <w:r>
-              <w:rPr>
-                <w:rFonts w:ascii="Georgia" w:hAnsi="Georgia"/>
-                <w:sz w:val="21"/>
-                <w:szCs w:val="21"/>
-                <w:lang w:val="bg-BG" w:eastAsia="bg-BG"/>
-              </w:rPr>
-              <w:t xml:space="preserve"> г. от Столична община, Дирекция „Общински приходи“, Отдел ОП „</w:t>
-            </w:r>
-            <w:r>
-              <w:rPr>
-                <w:rFonts w:ascii="Georgia" w:hAnsi="Georgia"/>
-                <w:sz w:val="21"/>
-                <w:szCs w:val="21"/>
-                <w:lang w:val="bg-BG" w:eastAsia="bg-BG"/>
-              </w:rPr>
-              <w:t>Средец</w:t>
-            </w:r>
-            <w:r>
-              <w:rPr>
-                <w:rFonts w:ascii="Georgia" w:hAnsi="Georgia"/>
-                <w:sz w:val="21"/>
-                <w:szCs w:val="21"/>
-                <w:lang w:val="bg-BG" w:eastAsia="bg-BG"/>
-              </w:rPr>
-              <w:t xml:space="preserve"> – </w:t>
-            </w:r>
-            <w:r>
-              <w:rPr>
-                <w:rFonts w:ascii="Georgia" w:hAnsi="Georgia"/>
-                <w:sz w:val="21"/>
-                <w:szCs w:val="21"/>
-                <w:lang w:val="bg-BG" w:eastAsia="bg-BG"/>
-              </w:rPr>
-              <w:t>Триадица</w:t>
-            </w:r>
-            <w:r>
-              <w:rPr>
-                <w:rFonts w:ascii="Georgia" w:hAnsi="Georgia"/>
-                <w:sz w:val="21"/>
-                <w:szCs w:val="21"/>
-                <w:lang w:val="bg-BG" w:eastAsia="bg-BG"/>
-              </w:rPr>
-              <w:t>“;</w:t>
+                <w:lang w:eastAsia="bg-BG"/>
+              </w:rPr>
+              <w:t xml:space="preserve">25.03.2026</w:t>
+            </w:r>
+            <w:r>
+              <w:rPr>
+                <w:rFonts w:ascii="Georgia" w:hAnsi="Georgia"/>
+                <w:sz w:val="21"/>
+                <w:szCs w:val="21"/>
+                <w:lang w:val="bg-BG" w:eastAsia="bg-BG"/>
+              </w:rPr>
+              <w:t xml:space="preserve"> г. от </w:t>
+            </w:r>
+            <w:r>
+              <w:rPr>
+                <w:rFonts w:ascii="Georgia" w:hAnsi="Georgia"/>
+                <w:sz w:val="21"/>
+                <w:szCs w:val="21"/>
+                <w:lang w:eastAsia="bg-BG"/>
+              </w:rPr>
+              <w:t xml:space="preserve">Столична община, Дирекция „Общински приходи“, Отдел ОП „Средец – Триадица“</w:t>
+            </w:r>
+            <w:r>
+              <w:rPr>
+                <w:rFonts w:ascii="Georgia" w:hAnsi="Georgia"/>
+                <w:sz w:val="21"/>
+                <w:szCs w:val="21"/>
+                <w:lang w:val="bg-BG" w:eastAsia="bg-BG"/>
+              </w:rPr>
+              <w:t>;</w:t>
             </w:r>
             <w:r>
               <w:rPr>
@@ -7118,7 +6876,6 @@
   <w:style w:type="character" w:default="1" w:styleId="DefaultParagraphFont">
     <w:name w:val="Default Paragraph Font"/>
     <w:uiPriority w:val="1"/>
-    <w:semiHidden/>
     <w:unhideWhenUsed/>
   </w:style>
   <w:style w:type="table" w:default="1" w:styleId="TableNormal">

</xml_diff>

<commit_message>
Add dynamic preliminary contract date
</commit_message>
<xml_diff>
--- a/output/result.docx
+++ b/output/result.docx
@@ -2110,7 +2110,16 @@
                 <w:szCs w:val="21"/>
                 <w:lang w:val="bg-BG" w:eastAsia="bg-BG"/>
               </w:rPr>
-              <w:t>Предварителен договор от 24</w:t>
+              <w:t xml:space="preserve">Предварителен договор от </w:t>
+            </w:r>
+            <w:r>
+              <w:rPr>
+                <w:rFonts w:ascii="Georgia" w:hAnsi="Georgia"/>
+                <w:sz w:val="21"/>
+                <w:szCs w:val="21"/>
+                <w:lang w:val="bg-BG" w:eastAsia="bg-BG"/>
+              </w:rPr>
+              <w:t xml:space="preserve">24.02.2026</w:t>
             </w:r>
             <w:r>
               <w:rPr>
@@ -2119,25 +2128,7 @@
                 <w:szCs w:val="21"/>
                 <w:lang w:val="en-US" w:eastAsia="bg-BG"/>
               </w:rPr>
-              <w:t>.</w:t>
-            </w:r>
-            <w:r>
-              <w:rPr>
-                <w:rFonts w:ascii="Georgia" w:hAnsi="Georgia"/>
-                <w:sz w:val="21"/>
-                <w:szCs w:val="21"/>
-                <w:lang w:val="bg-BG" w:eastAsia="bg-BG"/>
-              </w:rPr>
-              <w:t>02</w:t>
-            </w:r>
-            <w:r>
-              <w:rPr>
-                <w:rFonts w:ascii="Georgia" w:hAnsi="Georgia"/>
-                <w:sz w:val="21"/>
-                <w:szCs w:val="21"/>
-                <w:lang w:val="en-US" w:eastAsia="bg-BG"/>
-              </w:rPr>
-              <w:t xml:space="preserve">.2026 </w:t>
+              <w:t xml:space="preserve"> </w:t>
             </w:r>
             <w:r>
               <w:rPr>
@@ -3926,7 +3917,7 @@
                 <w:szCs w:val="21"/>
                 <w:lang w:val="bg-BG" w:eastAsia="bg-BG"/>
               </w:rPr>
-              <w:t>24</w:t>
+              <w:t xml:space="preserve">24.02.2026</w:t>
             </w:r>
             <w:r>
               <w:rPr>
@@ -3935,25 +3926,7 @@
                 <w:szCs w:val="21"/>
                 <w:lang w:val="en-US" w:eastAsia="bg-BG"/>
               </w:rPr>
-              <w:t>.</w:t>
-            </w:r>
-            <w:r>
-              <w:rPr>
-                <w:rFonts w:ascii="Georgia" w:hAnsi="Georgia"/>
-                <w:sz w:val="21"/>
-                <w:szCs w:val="21"/>
-                <w:lang w:val="bg-BG" w:eastAsia="bg-BG"/>
-              </w:rPr>
-              <w:t>02</w:t>
-            </w:r>
-            <w:r>
-              <w:rPr>
-                <w:rFonts w:ascii="Georgia" w:hAnsi="Georgia"/>
-                <w:sz w:val="21"/>
-                <w:szCs w:val="21"/>
-                <w:lang w:val="en-US" w:eastAsia="bg-BG"/>
-              </w:rPr>
-              <w:t xml:space="preserve">.2026 </w:t>
+              <w:t xml:space="preserve"> </w:t>
             </w:r>
             <w:r>
               <w:rPr>
@@ -5049,7 +5022,17 @@
                 <w:szCs w:val="21"/>
                 <w:lang w:val="bg-BG" w:eastAsia="bg-BG"/>
               </w:rPr>
-              <w:t>Удостоверение за данъчна оценка с изх. № 7224051164, издадено на 25.03.2026 г. от Столична община, Дирекция „Общински приходи“, Отдел ОП „Средец – Триадица“</w:t>
+              <w:t xml:space="preserve">Удостоверение за данъчна оценка с изх. № 7224051164, издадено на 25.03.2026 г. от Столична община, Дирекция „Общински приходи“, Отдел ОП „Средец – </w:t>
+            </w:r>
+            <w:r>
+              <w:rPr>
+                <w:rFonts w:ascii="Georgia" w:hAnsi="Georgia"/>
+                <w:sz w:val="21"/>
+                <w:szCs w:val="21"/>
+                <w:lang w:val="bg-BG" w:eastAsia="bg-BG"/>
+              </w:rPr>
+              <w:lastRenderedPageBreak/>
+              <w:t>Триадица“</w:t>
             </w:r>
             <w:r>
               <w:rPr>
@@ -5106,17 +5089,7 @@
                 <w:szCs w:val="21"/>
                 <w:lang w:val="bg-BG" w:eastAsia="bg-BG"/>
               </w:rPr>
-              <w:t>РСЦ24-УГ01-</w:t>
-            </w:r>
-            <w:r>
-              <w:rPr>
-                <w:rFonts w:ascii="Georgia" w:hAnsi="Georgia"/>
-                <w:sz w:val="21"/>
-                <w:szCs w:val="21"/>
-                <w:lang w:val="bg-BG" w:eastAsia="bg-BG"/>
-              </w:rPr>
-              <w:lastRenderedPageBreak/>
-              <w:t>4783/30.07.2024 г., издадено от Столична община-район „Средец“</w:t>
+              <w:t>РСЦ24-УГ01-4783/30.07.2024 г., издадено от Столична община-район „Средец“</w:t>
             </w:r>
             <w:r>
               <w:rPr>
@@ -6876,6 +6849,7 @@
   <w:style w:type="character" w:default="1" w:styleId="DefaultParagraphFont">
     <w:name w:val="Default Paragraph Font"/>
     <w:uiPriority w:val="1"/>
+    <w:semiHidden/>
     <w:unhideWhenUsed/>
   </w:style>
   <w:style w:type="table" w:default="1" w:styleId="TableNormal">

</xml_diff>

<commit_message>
Add dynamic notary and signing context
</commit_message>
<xml_diff>
--- a/output/result.docx
+++ b/output/result.docx
@@ -1129,9 +1129,9 @@
                 <w:bCs/>
                 <w:sz w:val="21"/>
                 <w:szCs w:val="21"/>
-                <w:lang w:val="bg-BG" w:eastAsia="bg-BG"/>
-              </w:rPr>
-              <w:t>ВАЛЕНТИНА ГЕОРГИЕВА</w:t>
+                <w:lang w:eastAsia="bg-BG"/>
+              </w:rPr>
+              <w:t xml:space="preserve">ВАЛЕНТИНА ГЕОРГИЕВА</w:t>
             </w:r>
             <w:r>
               <w:rPr>
@@ -1140,7 +1140,61 @@
                 <w:szCs w:val="21"/>
                 <w:lang w:val="bg-BG" w:eastAsia="bg-BG"/>
               </w:rPr>
-              <w:t>, Нотариус с район на действие – Софийски районен съд, вписана под № 340 в регистъра на Нотариалната камара на Република България, в кантората ми в гр. София, улица “Княз Борис І” № 49, се явиха:</w:t>
+              <w:t xml:space="preserve">, Нотариус с район на действие – </w:t>
+            </w:r>
+            <w:r>
+              <w:rPr>
+                <w:rFonts w:ascii="Georgia" w:hAnsi="Georgia" w:cs="Georgia"/>
+                <w:sz w:val="21"/>
+                <w:szCs w:val="21"/>
+                <w:lang w:eastAsia="bg-BG"/>
+              </w:rPr>
+              <w:t xml:space="preserve">Софийски районен съд</w:t>
+            </w:r>
+            <w:r>
+              <w:rPr>
+                <w:rFonts w:ascii="Georgia" w:hAnsi="Georgia" w:cs="Georgia"/>
+                <w:sz w:val="21"/>
+                <w:szCs w:val="21"/>
+                <w:lang w:val="bg-BG" w:eastAsia="bg-BG"/>
+              </w:rPr>
+              <w:t xml:space="preserve">, вписана под № </w:t>
+            </w:r>
+            <w:r>
+              <w:rPr>
+                <w:rFonts w:ascii="Georgia" w:hAnsi="Georgia" w:cs="Georgia"/>
+                <w:sz w:val="21"/>
+                <w:szCs w:val="21"/>
+                <w:lang w:eastAsia="bg-BG"/>
+              </w:rPr>
+              <w:t xml:space="preserve">340</w:t>
+            </w:r>
+            <w:r>
+              <w:rPr>
+                <w:rFonts w:ascii="Georgia" w:hAnsi="Georgia" w:cs="Georgia"/>
+                <w:sz w:val="21"/>
+                <w:szCs w:val="21"/>
+                <w:lang w:val="bg-BG" w:eastAsia="bg-BG"/>
+              </w:rPr>
+              <w:t xml:space="preserve"> в регистъра на Нотариалната камара на Република България, в кантората ми в </w:t>
+            </w:r>
+            <w:r>
+              <w:rPr>
+                <w:rFonts w:ascii="Georgia" w:hAnsi="Georgia" w:cs="Georgia"/>
+                <w:sz w:val="21"/>
+                <w:szCs w:val="21"/>
+                <w:lang w:eastAsia="bg-BG"/>
+              </w:rPr>
+              <w:t xml:space="preserve">гр. София, улица „Княз Борис I“ № 49</w:t>
+            </w:r>
+            <w:r>
+              <w:rPr>
+                <w:rFonts w:ascii="Georgia" w:hAnsi="Georgia" w:cs="Georgia"/>
+                <w:sz w:val="21"/>
+                <w:szCs w:val="21"/>
+                <w:lang w:val="bg-BG" w:eastAsia="bg-BG"/>
+              </w:rPr>
+              <w:t>, се явиха:</w:t>
             </w:r>
             <w:bookmarkStart w:id="1" w:name="_Hlk526247358"/>
             <w:r>
@@ -3200,7 +3254,17 @@
                 <w:szCs w:val="21"/>
                 <w:lang w:val="bg-BG" w:eastAsia="bg-BG"/>
               </w:rPr>
-              <w:t xml:space="preserve"> обременен с вещни тежести, ипотечни задължения и възбрани, за имот</w:t>
+              <w:t xml:space="preserve"> обременен с вещни тежести, ипотечни </w:t>
+            </w:r>
+            <w:r>
+              <w:rPr>
+                <w:rFonts w:ascii="Georgia" w:hAnsi="Georgia"/>
+                <w:sz w:val="21"/>
+                <w:szCs w:val="21"/>
+                <w:lang w:val="bg-BG" w:eastAsia="bg-BG"/>
+              </w:rPr>
+              <w:lastRenderedPageBreak/>
+              <w:t>задължения и възбрани, за имот</w:t>
             </w:r>
             <w:r>
               <w:rPr>
@@ -3218,17 +3282,7 @@
                 <w:szCs w:val="21"/>
                 <w:lang w:val="bg-BG" w:eastAsia="bg-BG"/>
               </w:rPr>
-              <w:t xml:space="preserve"> няма сключени предварителни договори за продажба с трети </w:t>
-            </w:r>
-            <w:r>
-              <w:rPr>
-                <w:rFonts w:ascii="Georgia" w:hAnsi="Georgia"/>
-                <w:sz w:val="21"/>
-                <w:szCs w:val="21"/>
-                <w:lang w:val="bg-BG" w:eastAsia="bg-BG"/>
-              </w:rPr>
-              <w:lastRenderedPageBreak/>
-              <w:t xml:space="preserve">лица, не </w:t>
+              <w:t xml:space="preserve"> няма сключени предварителни договори за продажба с трети лица, не </w:t>
             </w:r>
             <w:r>
               <w:rPr>
@@ -5022,7 +5076,7 @@
                 <w:szCs w:val="21"/>
                 <w:lang w:val="bg-BG" w:eastAsia="bg-BG"/>
               </w:rPr>
-              <w:t xml:space="preserve">Удостоверение за данъчна оценка с изх. № 7224051164, издадено на 25.03.2026 г. от Столична община, Дирекция „Общински приходи“, Отдел ОП „Средец – </w:t>
+              <w:t xml:space="preserve">Удостоверение за данъчна оценка с изх. № 7224051164, издадено на </w:t>
             </w:r>
             <w:r>
               <w:rPr>
@@ -5032,7 +5086,7 @@
                 <w:lang w:val="bg-BG" w:eastAsia="bg-BG"/>
               </w:rPr>
               <w:lastRenderedPageBreak/>
-              <w:t>Триадица“</w:t>
+              <w:t>25.03.2026 г. от Столична община, Дирекция „Общински приходи“, Отдел ОП „Средец – Триадица“</w:t>
             </w:r>
             <w:r>
               <w:rPr>
@@ -6849,7 +6903,6 @@
   <w:style w:type="character" w:default="1" w:styleId="DefaultParagraphFont">
     <w:name w:val="Default Paragraph Font"/>
     <w:uiPriority w:val="1"/>
-    <w:semiHidden/>
     <w:unhideWhenUsed/>
   </w:style>
   <w:style w:type="table" w:default="1" w:styleId="TableNormal">

</xml_diff>

<commit_message>
Add dynamic party identity details
</commit_message>
<xml_diff>
--- a/output/result.docx
+++ b/output/result.docx
@@ -1269,9 +1269,9 @@
                 <w:bCs/>
                 <w:sz w:val="21"/>
                 <w:szCs w:val="21"/>
-                <w:lang w:val="en-US" w:eastAsia="bg-BG"/>
-              </w:rPr>
-              <w:t>647544565</w:t>
+                <w:lang w:eastAsia="bg-BG"/>
+              </w:rPr>
+              <w:t xml:space="preserve">647544565</w:t>
             </w:r>
             <w:r>
               <w:rPr>
@@ -1289,9 +1289,9 @@
                 <w:bCs/>
                 <w:sz w:val="21"/>
                 <w:szCs w:val="21"/>
-                <w:lang w:val="en-US" w:eastAsia="bg-BG"/>
-              </w:rPr>
-              <w:t>28</w:t>
+                <w:lang w:eastAsia="bg-BG"/>
+              </w:rPr>
+              <w:t xml:space="preserve">28.03.2018</w:t>
             </w:r>
             <w:r>
               <w:rPr>
@@ -1301,7 +1301,7 @@
                 <w:szCs w:val="21"/>
                 <w:lang w:val="bg-BG" w:eastAsia="bg-BG"/>
               </w:rPr>
-              <w:t>.</w:t>
+              <w:t xml:space="preserve"> г. от </w:t>
             </w:r>
             <w:r>
               <w:rPr>
@@ -1309,9 +1309,9 @@
                 <w:bCs/>
                 <w:sz w:val="21"/>
                 <w:szCs w:val="21"/>
-                <w:lang w:val="en-US" w:eastAsia="bg-BG"/>
-              </w:rPr>
-              <w:t>03</w:t>
+                <w:lang w:eastAsia="bg-BG"/>
+              </w:rPr>
+              <w:t xml:space="preserve">МВР - София</w:t>
             </w:r>
             <w:r>
               <w:rPr>
@@ -1321,7 +1321,7 @@
                 <w:szCs w:val="21"/>
                 <w:lang w:val="bg-BG" w:eastAsia="bg-BG"/>
               </w:rPr>
-              <w:t>.20</w:t>
+              <w:t>,</w:t>
             </w:r>
             <w:r>
               <w:rPr>
@@ -1329,9 +1329,136 @@
                 <w:bCs/>
                 <w:sz w:val="21"/>
                 <w:szCs w:val="21"/>
-                <w:lang w:val="en-US" w:eastAsia="bg-BG"/>
-              </w:rPr>
-              <w:t>18</w:t>
+                <w:lang w:val="bg-BG" w:eastAsia="bg-BG"/>
+              </w:rPr>
+              <w:t xml:space="preserve"> </w:t>
+            </w:r>
+            <w:r>
+              <w:rPr>
+                <w:rFonts w:ascii="Georgia" w:hAnsi="Georgia" w:cs="Courier New"/>
+                <w:sz w:val="21"/>
+                <w:szCs w:val="21"/>
+                <w:lang w:val="bg-BG" w:eastAsia="bg-BG"/>
+              </w:rPr>
+              <w:t xml:space="preserve">с постоянен адрес в </w:t>
+            </w:r>
+            <w:r>
+              <w:rPr>
+                <w:rFonts w:ascii="Georgia" w:hAnsi="Georgia" w:cs="Courier New"/>
+                <w:sz w:val="21"/>
+                <w:szCs w:val="21"/>
+                <w:lang w:eastAsia="bg-BG"/>
+              </w:rPr>
+              <w:t xml:space="preserve">град София, ул. „Цар Иван Асен II“ № 43, ет. 3, ап. 6</w:t>
+            </w:r>
+            <w:r>
+              <w:rPr>
+                <w:rFonts w:ascii="Georgia" w:hAnsi="Georgia"/>
+                <w:bCs/>
+                <w:sz w:val="21"/>
+                <w:szCs w:val="21"/>
+                <w:lang w:val="bg-BG" w:eastAsia="bg-BG"/>
+              </w:rPr>
+              <w:t xml:space="preserve">, </w:t>
+            </w:r>
+            <w:r>
+              <w:rPr>
+                <w:rFonts w:ascii="Georgia" w:hAnsi="Georgia"/>
+                <w:sz w:val="21"/>
+                <w:szCs w:val="21"/>
+                <w:lang w:val="bg-BG" w:eastAsia="bg-BG"/>
+              </w:rPr>
+              <w:t xml:space="preserve">в качеството </w:t>
+            </w:r>
+            <w:r>
+              <w:rPr>
+                <w:sz w:val="21"/>
+                <w:szCs w:val="21"/>
+                <w:lang w:val="bg-BG" w:eastAsia="bg-BG"/>
+              </w:rPr>
+              <w:t>ѝ</w:t>
+            </w:r>
+            <w:r>
+              <w:rPr>
+                <w:rFonts w:ascii="Georgia" w:eastAsia="Calibri" w:hAnsi="Georgia"/>
+                <w:bCs/>
+                <w:sz w:val="21"/>
+                <w:szCs w:val="21"/>
+                <w:lang w:val="bg-BG" w:eastAsia="bg-BG"/>
+              </w:rPr>
+              <w:t xml:space="preserve"> </w:t>
+            </w:r>
+            <w:r>
+              <w:rPr>
+                <w:rFonts w:ascii="Georgia" w:eastAsia="Calibri" w:hAnsi="Georgia"/>
+                <w:sz w:val="21"/>
+                <w:szCs w:val="21"/>
+                <w:lang w:val="bg-BG" w:eastAsia="bg-BG"/>
+              </w:rPr>
+              <w:t xml:space="preserve">на </w:t>
+            </w:r>
+            <w:r>
+              <w:rPr>
+                <w:rFonts w:ascii="Georgia" w:eastAsia="Calibri" w:hAnsi="Georgia"/>
+                <w:b/>
+                <w:iCs/>
+                <w:sz w:val="21"/>
+                <w:szCs w:val="21"/>
+                <w:lang w:val="bg-BG" w:eastAsia="bg-BG"/>
+              </w:rPr>
+              <w:t>ПРОДАВАЧ</w:t>
+            </w:r>
+            <w:r>
+              <w:rPr>
+                <w:rFonts w:ascii="Georgia" w:eastAsia="Calibri" w:hAnsi="Georgia"/>
+                <w:sz w:val="21"/>
+                <w:szCs w:val="21"/>
+                <w:lang w:val="bg-BG" w:eastAsia="bg-BG"/>
+              </w:rPr>
+              <w:t xml:space="preserve"> </w:t>
+            </w:r>
+            <w:r>
+              <w:rPr>
+                <w:rFonts w:ascii="Georgia" w:eastAsia="Calibri" w:hAnsi="Georgia"/>
+                <w:i/>
+                <w:iCs/>
+                <w:sz w:val="21"/>
+                <w:szCs w:val="21"/>
+                <w:lang w:val="bg-BG" w:eastAsia="bg-BG"/>
+              </w:rPr>
+              <w:t>от една страна</w:t>
+            </w:r>
+            <w:r>
+              <w:rPr>
+                <w:rFonts w:ascii="Georgia" w:hAnsi="Georgia"/>
+                <w:i/>
+                <w:iCs/>
+                <w:sz w:val="21"/>
+                <w:szCs w:val="21"/>
+                <w:lang w:val="bg-BG" w:eastAsia="bg-BG"/>
+              </w:rPr>
+              <w:t>, и от друга страна</w:t>
+            </w:r>
+            <w:r>
+              <w:rPr>
+                <w:rFonts w:ascii="Georgia" w:hAnsi="Georgia"/>
+                <w:sz w:val="21"/>
+                <w:szCs w:val="21"/>
+                <w:lang w:val="bg-BG" w:eastAsia="bg-BG"/>
+              </w:rPr>
+              <w:t xml:space="preserve"> </w:t>
+            </w:r>
+            <w:bookmarkEnd w:id="1"/>
+            <w:r>
+              <w:rPr>
+                <w:rFonts w:ascii="Georgia" w:hAnsi="Georgia" w:cs="Georgia"/>
+                <w:b/>
+                <w:bCs/>
+                <w:sz w:val="21"/>
+                <w:szCs w:val="21"/>
+                <w:lang w:eastAsia="bg-BG"/>
+              </w:rPr>
+              <w:t xml:space="preserve">КАМЕЛИЯ АНГЕЛОВА АНГЕЛОВА-ТОДОРОВА</w:t>
             </w:r>
             <w:r>
               <w:rPr>
@@ -1341,7 +1468,29 @@
                 <w:szCs w:val="21"/>
                 <w:lang w:val="bg-BG" w:eastAsia="bg-BG"/>
               </w:rPr>
-              <w:t xml:space="preserve"> г. от МВР - </w:t>
+              <w:t xml:space="preserve"> с </w:t>
+            </w:r>
+            <w:r>
+              <w:rPr>
+                <w:rFonts w:ascii="Georgia" w:hAnsi="Georgia" w:cs="Georgia"/>
+                <w:b/>
+                <w:bCs/>
+                <w:sz w:val="21"/>
+                <w:szCs w:val="21"/>
+                <w:lang w:val="bg-BG" w:eastAsia="bg-BG"/>
+              </w:rPr>
+              <w:t xml:space="preserve">ЕГН </w:t>
+            </w:r>
+            <w:r>
+              <w:rPr>
+                <w:rFonts w:ascii="Georgia" w:hAnsi="Georgia" w:cs="Georgia"/>
+                <w:b/>
+                <w:bCs/>
+                <w:sz w:val="21"/>
+                <w:szCs w:val="21"/>
+                <w:lang w:eastAsia="bg-BG"/>
+              </w:rPr>
+              <w:t xml:space="preserve">7507263057</w:t>
             </w:r>
             <w:r>
               <w:rPr>
@@ -1351,7 +1500,7 @@
                 <w:szCs w:val="21"/>
                 <w:lang w:val="bg-BG" w:eastAsia="bg-BG"/>
               </w:rPr>
-              <w:t>София</w:t>
+              <w:t xml:space="preserve">, притежаваща </w:t>
             </w:r>
             <w:r>
               <w:rPr>
@@ -1361,7 +1510,7 @@
                 <w:szCs w:val="21"/>
                 <w:lang w:val="bg-BG" w:eastAsia="bg-BG"/>
               </w:rPr>
-              <w:t>,</w:t>
+              <w:t>лична карта</w:t>
             </w:r>
             <w:r>
               <w:rPr>
@@ -1371,125 +1520,7 @@
                 <w:szCs w:val="21"/>
                 <w:lang w:val="bg-BG" w:eastAsia="bg-BG"/>
               </w:rPr>
-              <w:t xml:space="preserve"> </w:t>
-            </w:r>
-            <w:r>
-              <w:rPr>
-                <w:rFonts w:ascii="Georgia" w:hAnsi="Georgia" w:cs="Courier New"/>
-                <w:sz w:val="21"/>
-                <w:szCs w:val="21"/>
-                <w:lang w:val="bg-BG" w:eastAsia="bg-BG"/>
-              </w:rPr>
-              <w:t>с постоянен адрес в град София, ул. „Цар Иван Асен II“ № 43, ет. 3, ап. 6</w:t>
-            </w:r>
-            <w:r>
-              <w:rPr>
-                <w:rFonts w:ascii="Georgia" w:hAnsi="Georgia"/>
-                <w:bCs/>
-                <w:sz w:val="21"/>
-                <w:szCs w:val="21"/>
-                <w:lang w:val="bg-BG" w:eastAsia="bg-BG"/>
-              </w:rPr>
-              <w:t xml:space="preserve">, </w:t>
-            </w:r>
-            <w:r>
-              <w:rPr>
-                <w:rFonts w:ascii="Georgia" w:hAnsi="Georgia"/>
-                <w:sz w:val="21"/>
-                <w:szCs w:val="21"/>
-                <w:lang w:val="bg-BG" w:eastAsia="bg-BG"/>
-              </w:rPr>
-              <w:t xml:space="preserve">в качеството </w:t>
-            </w:r>
-            <w:r>
-              <w:rPr>
-                <w:sz w:val="21"/>
-                <w:szCs w:val="21"/>
-                <w:lang w:val="bg-BG" w:eastAsia="bg-BG"/>
-              </w:rPr>
-              <w:t>ѝ</w:t>
-            </w:r>
-            <w:r>
-              <w:rPr>
-                <w:rFonts w:ascii="Georgia" w:eastAsia="Calibri" w:hAnsi="Georgia"/>
-                <w:bCs/>
-                <w:sz w:val="21"/>
-                <w:szCs w:val="21"/>
-                <w:lang w:val="bg-BG" w:eastAsia="bg-BG"/>
-              </w:rPr>
-              <w:t xml:space="preserve"> </w:t>
-            </w:r>
-            <w:r>
-              <w:rPr>
-                <w:rFonts w:ascii="Georgia" w:eastAsia="Calibri" w:hAnsi="Georgia"/>
-                <w:sz w:val="21"/>
-                <w:szCs w:val="21"/>
-                <w:lang w:val="bg-BG" w:eastAsia="bg-BG"/>
-              </w:rPr>
-              <w:t xml:space="preserve">на </w:t>
-            </w:r>
-            <w:r>
-              <w:rPr>
-                <w:rFonts w:ascii="Georgia" w:eastAsia="Calibri" w:hAnsi="Georgia"/>
-                <w:b/>
-                <w:iCs/>
-                <w:sz w:val="21"/>
-                <w:szCs w:val="21"/>
-                <w:lang w:val="bg-BG" w:eastAsia="bg-BG"/>
-              </w:rPr>
-              <w:t>ПРОДАВАЧ</w:t>
-            </w:r>
-            <w:r>
-              <w:rPr>
-                <w:rFonts w:ascii="Georgia" w:eastAsia="Calibri" w:hAnsi="Georgia"/>
-                <w:sz w:val="21"/>
-                <w:szCs w:val="21"/>
-                <w:lang w:val="bg-BG" w:eastAsia="bg-BG"/>
-              </w:rPr>
-              <w:t xml:space="preserve"> </w:t>
-            </w:r>
-            <w:r>
-              <w:rPr>
-                <w:rFonts w:ascii="Georgia" w:eastAsia="Calibri" w:hAnsi="Georgia"/>
-                <w:i/>
-                <w:iCs/>
-                <w:sz w:val="21"/>
-                <w:szCs w:val="21"/>
-                <w:lang w:val="bg-BG" w:eastAsia="bg-BG"/>
-              </w:rPr>
-              <w:t>от една страна</w:t>
-            </w:r>
-            <w:r>
-              <w:rPr>
-                <w:rFonts w:ascii="Georgia" w:hAnsi="Georgia"/>
-                <w:i/>
-                <w:iCs/>
-                <w:sz w:val="21"/>
-                <w:szCs w:val="21"/>
-                <w:lang w:val="bg-BG" w:eastAsia="bg-BG"/>
-              </w:rPr>
-              <w:t>, и от друга страна</w:t>
-            </w:r>
-            <w:r>
-              <w:rPr>
-                <w:rFonts w:ascii="Georgia" w:hAnsi="Georgia"/>
-                <w:sz w:val="21"/>
-                <w:szCs w:val="21"/>
-                <w:lang w:val="bg-BG" w:eastAsia="bg-BG"/>
-              </w:rPr>
-              <w:t xml:space="preserve"> </w:t>
-            </w:r>
-            <w:bookmarkEnd w:id="1"/>
-            <w:r>
-              <w:rPr>
-                <w:rFonts w:ascii="Georgia" w:hAnsi="Georgia" w:cs="Georgia"/>
-                <w:b/>
-                <w:bCs/>
-                <w:sz w:val="21"/>
-                <w:szCs w:val="21"/>
-                <w:lang w:eastAsia="bg-BG"/>
-              </w:rPr>
-              <w:t xml:space="preserve">КАМЕЛИЯ АНГЕЛОВА АНГЕЛОВА-ТОДОРОВА</w:t>
+              <w:t xml:space="preserve"> № </w:t>
             </w:r>
             <w:r>
               <w:rPr>
@@ -1497,31 +1528,9 @@
                 <w:bCs/>
                 <w:sz w:val="21"/>
                 <w:szCs w:val="21"/>
-                <w:lang w:val="bg-BG" w:eastAsia="bg-BG"/>
-              </w:rPr>
-              <w:t xml:space="preserve"> с </w:t>
-            </w:r>
-            <w:r>
-              <w:rPr>
-                <w:rFonts w:ascii="Georgia" w:hAnsi="Georgia" w:cs="Georgia"/>
-                <w:b/>
-                <w:bCs/>
-                <w:sz w:val="21"/>
-                <w:szCs w:val="21"/>
-                <w:lang w:val="bg-BG" w:eastAsia="bg-BG"/>
-              </w:rPr>
-              <w:t xml:space="preserve">ЕГН </w:t>
-            </w:r>
-            <w:r>
-              <w:rPr>
-                <w:rFonts w:ascii="Georgia" w:hAnsi="Georgia" w:cs="Georgia"/>
-                <w:b/>
-                <w:bCs/>
-                <w:sz w:val="21"/>
-                <w:szCs w:val="21"/>
-                <w:lang w:eastAsia="bg-BG"/>
-              </w:rPr>
-              <w:t xml:space="preserve">7507263057</w:t>
+                <w:lang w:eastAsia="bg-BG"/>
+              </w:rPr>
+              <w:t xml:space="preserve">651747724</w:t>
             </w:r>
             <w:r>
               <w:rPr>
@@ -1531,7 +1540,7 @@
                 <w:szCs w:val="21"/>
                 <w:lang w:val="bg-BG" w:eastAsia="bg-BG"/>
               </w:rPr>
-              <w:t xml:space="preserve">, притежаваща </w:t>
+              <w:t>, изд</w:t>
             </w:r>
             <w:r>
               <w:rPr>
@@ -1541,7 +1550,7 @@
                 <w:szCs w:val="21"/>
                 <w:lang w:val="bg-BG" w:eastAsia="bg-BG"/>
               </w:rPr>
-              <w:t>лична карта</w:t>
+              <w:t>адена</w:t>
             </w:r>
             <w:r>
               <w:rPr>
@@ -1551,7 +1560,7 @@
                 <w:szCs w:val="21"/>
                 <w:lang w:val="bg-BG" w:eastAsia="bg-BG"/>
               </w:rPr>
-              <w:t xml:space="preserve"> № 651747724, изд</w:t>
+              <w:t xml:space="preserve"> на </w:t>
             </w:r>
             <w:r>
               <w:rPr>
@@ -1559,9 +1568,9 @@
                 <w:bCs/>
                 <w:sz w:val="21"/>
                 <w:szCs w:val="21"/>
-                <w:lang w:val="bg-BG" w:eastAsia="bg-BG"/>
-              </w:rPr>
-              <w:t>адена</w:t>
+                <w:lang w:eastAsia="bg-BG"/>
+              </w:rPr>
+              <w:t xml:space="preserve">17.02.2022</w:t>
             </w:r>
             <w:r>
               <w:rPr>
@@ -1571,7 +1580,37 @@
                 <w:szCs w:val="21"/>
                 <w:lang w:val="bg-BG" w:eastAsia="bg-BG"/>
               </w:rPr>
-              <w:t xml:space="preserve"> на 17.02.2022 г. от МВР - София, с постоянен адрес град София, Столична община, ул. „Добри Христов“ № 33, ет. 3, ап. 7</w:t>
+              <w:t xml:space="preserve"> г. от </w:t>
+            </w:r>
+            <w:r>
+              <w:rPr>
+                <w:rFonts w:ascii="Georgia" w:hAnsi="Georgia" w:cs="Georgia"/>
+                <w:bCs/>
+                <w:sz w:val="21"/>
+                <w:szCs w:val="21"/>
+                <w:lang w:eastAsia="bg-BG"/>
+              </w:rPr>
+              <w:t xml:space="preserve">МВР - София</w:t>
+            </w:r>
+            <w:r>
+              <w:rPr>
+                <w:rFonts w:ascii="Georgia" w:hAnsi="Georgia" w:cs="Georgia"/>
+                <w:bCs/>
+                <w:sz w:val="21"/>
+                <w:szCs w:val="21"/>
+                <w:lang w:val="bg-BG" w:eastAsia="bg-BG"/>
+              </w:rPr>
+              <w:t xml:space="preserve">, с постоянен адрес </w:t>
+            </w:r>
+            <w:r>
+              <w:rPr>
+                <w:rFonts w:ascii="Georgia" w:hAnsi="Georgia" w:cs="Georgia"/>
+                <w:bCs/>
+                <w:sz w:val="21"/>
+                <w:szCs w:val="21"/>
+                <w:lang w:eastAsia="bg-BG"/>
+              </w:rPr>
+              <w:t xml:space="preserve">град София, Столична община, ул. „Добри Христов“ № 33, ет. 3, ап. 7</w:t>
             </w:r>
             <w:r>
               <w:rPr>
@@ -3218,7 +3257,17 @@
                 <w:szCs w:val="21"/>
                 <w:lang w:val="bg-BG" w:eastAsia="bg-BG"/>
               </w:rPr>
-              <w:t>, че към настоящия момент имот</w:t>
+              <w:t xml:space="preserve">, че към </w:t>
+            </w:r>
+            <w:r>
+              <w:rPr>
+                <w:rFonts w:ascii="Georgia" w:hAnsi="Georgia"/>
+                <w:sz w:val="21"/>
+                <w:szCs w:val="21"/>
+                <w:lang w:val="bg-BG" w:eastAsia="bg-BG"/>
+              </w:rPr>
+              <w:lastRenderedPageBreak/>
+              <w:t>настоящия момент имот</w:t>
             </w:r>
             <w:r>
               <w:rPr>
@@ -3254,17 +3303,7 @@
                 <w:szCs w:val="21"/>
                 <w:lang w:val="bg-BG" w:eastAsia="bg-BG"/>
               </w:rPr>
-              <w:t xml:space="preserve"> обременен с вещни тежести, ипотечни </w:t>
-            </w:r>
-            <w:r>
-              <w:rPr>
-                <w:rFonts w:ascii="Georgia" w:hAnsi="Georgia"/>
-                <w:sz w:val="21"/>
-                <w:szCs w:val="21"/>
-                <w:lang w:val="bg-BG" w:eastAsia="bg-BG"/>
-              </w:rPr>
-              <w:lastRenderedPageBreak/>
-              <w:t>задължения и възбрани, за имот</w:t>
+              <w:t xml:space="preserve"> обременен с вещни тежести, ипотечни задължения и възбрани, за имот</w:t>
             </w:r>
             <w:r>
               <w:rPr>
@@ -5020,7 +5059,17 @@
                 <w:szCs w:val="21"/>
                 <w:lang w:val="bg-BG" w:eastAsia="bg-BG"/>
               </w:rPr>
-              <w:t>Схема на самостоятелен обект в сграда № 15-212416-12.02.2026 г., издадена от АГКК</w:t>
+              <w:t xml:space="preserve">Схема на самостоятелен обект в сграда № 15-212416-12.02.2026 </w:t>
+            </w:r>
+            <w:r>
+              <w:rPr>
+                <w:rFonts w:ascii="Georgia" w:hAnsi="Georgia"/>
+                <w:sz w:val="21"/>
+                <w:szCs w:val="21"/>
+                <w:lang w:val="bg-BG" w:eastAsia="bg-BG"/>
+              </w:rPr>
+              <w:lastRenderedPageBreak/>
+              <w:t>г., издадена от АГКК</w:t>
             </w:r>
             <w:r>
               <w:rPr>
@@ -5076,17 +5125,7 @@
                 <w:szCs w:val="21"/>
                 <w:lang w:val="bg-BG" w:eastAsia="bg-BG"/>
               </w:rPr>
-              <w:t xml:space="preserve">Удостоверение за данъчна оценка с изх. № 7224051164, издадено на </w:t>
-            </w:r>
-            <w:r>
-              <w:rPr>
-                <w:rFonts w:ascii="Georgia" w:hAnsi="Georgia"/>
-                <w:sz w:val="21"/>
-                <w:szCs w:val="21"/>
-                <w:lang w:val="bg-BG" w:eastAsia="bg-BG"/>
-              </w:rPr>
-              <w:lastRenderedPageBreak/>
-              <w:t>25.03.2026 г. от Столична община, Дирекция „Общински приходи“, Отдел ОП „Средец – Триадица“</w:t>
+              <w:t>Удостоверение за данъчна оценка с изх. № 7224051164, издадено на 25.03.2026 г. от Столична община, Дирекция „Общински приходи“, Отдел ОП „Средец – Триадица“</w:t>
             </w:r>
             <w:r>
               <w:rPr>

</xml_diff>

<commit_message>
Add dynamic signing date wording
</commit_message>
<xml_diff>
--- a/output/result.docx
+++ b/output/result.docx
@@ -1109,9 +1109,9 @@
                 <w:rFonts w:ascii="Georgia" w:hAnsi="Georgia" w:cs="Georgia"/>
                 <w:sz w:val="21"/>
                 <w:szCs w:val="21"/>
-                <w:lang w:val="bg-BG" w:eastAsia="bg-BG"/>
-              </w:rPr>
-              <w:t>втори април</w:t>
+                <w:lang w:eastAsia="bg-BG"/>
+              </w:rPr>
+              <w:t xml:space="preserve">втори април две хиляди двадесет и шеста година</w:t>
             </w:r>
             <w:r>
               <w:rPr>
@@ -1120,7 +1120,7 @@
                 <w:szCs w:val="21"/>
                 <w:lang w:val="bg-BG" w:eastAsia="bg-BG"/>
               </w:rPr>
-              <w:t xml:space="preserve"> две хиляди двадесет и шеста година), пред мен </w:t>
+              <w:t xml:space="preserve">), пред мен </w:t>
             </w:r>
             <w:r>
               <w:rPr>
@@ -3257,7 +3257,43 @@
                 <w:szCs w:val="21"/>
                 <w:lang w:val="bg-BG" w:eastAsia="bg-BG"/>
               </w:rPr>
-              <w:t xml:space="preserve">, че към </w:t>
+              <w:t>, че към настоящия момент имот</w:t>
+            </w:r>
+            <w:r>
+              <w:rPr>
+                <w:rFonts w:ascii="Georgia" w:hAnsi="Georgia"/>
+                <w:sz w:val="21"/>
+                <w:szCs w:val="21"/>
+                <w:lang w:val="bg-BG" w:eastAsia="bg-BG"/>
+              </w:rPr>
+              <w:t>а</w:t>
+            </w:r>
+            <w:r>
+              <w:rPr>
+                <w:rFonts w:ascii="Georgia" w:hAnsi="Georgia"/>
+                <w:sz w:val="21"/>
+                <w:szCs w:val="21"/>
+                <w:lang w:val="bg-BG" w:eastAsia="bg-BG"/>
+              </w:rPr>
+              <w:t xml:space="preserve">, предмет на сделката не </w:t>
+            </w:r>
+            <w:r>
+              <w:rPr>
+                <w:rFonts w:ascii="Georgia" w:hAnsi="Georgia"/>
+                <w:sz w:val="21"/>
+                <w:szCs w:val="21"/>
+                <w:lang w:val="bg-BG" w:eastAsia="bg-BG"/>
+              </w:rPr>
+              <w:t>е</w:t>
+            </w:r>
+            <w:r>
+              <w:rPr>
+                <w:rFonts w:ascii="Georgia" w:hAnsi="Georgia"/>
+                <w:sz w:val="21"/>
+                <w:szCs w:val="21"/>
+                <w:lang w:val="bg-BG" w:eastAsia="bg-BG"/>
+              </w:rPr>
+              <w:t xml:space="preserve"> обременен с вещни тежести, ипотечни </w:t>
             </w:r>
             <w:r>
               <w:rPr>
@@ -3267,43 +3303,7 @@
                 <w:lang w:val="bg-BG" w:eastAsia="bg-BG"/>
               </w:rPr>
               <w:lastRenderedPageBreak/>
-              <w:t>настоящия момент имот</w:t>
-            </w:r>
-            <w:r>
-              <w:rPr>
-                <w:rFonts w:ascii="Georgia" w:hAnsi="Georgia"/>
-                <w:sz w:val="21"/>
-                <w:szCs w:val="21"/>
-                <w:lang w:val="bg-BG" w:eastAsia="bg-BG"/>
-              </w:rPr>
-              <w:t>а</w:t>
-            </w:r>
-            <w:r>
-              <w:rPr>
-                <w:rFonts w:ascii="Georgia" w:hAnsi="Georgia"/>
-                <w:sz w:val="21"/>
-                <w:szCs w:val="21"/>
-                <w:lang w:val="bg-BG" w:eastAsia="bg-BG"/>
-              </w:rPr>
-              <w:t xml:space="preserve">, предмет на сделката не </w:t>
-            </w:r>
-            <w:r>
-              <w:rPr>
-                <w:rFonts w:ascii="Georgia" w:hAnsi="Georgia"/>
-                <w:sz w:val="21"/>
-                <w:szCs w:val="21"/>
-                <w:lang w:val="bg-BG" w:eastAsia="bg-BG"/>
-              </w:rPr>
-              <w:t>е</w:t>
-            </w:r>
-            <w:r>
-              <w:rPr>
-                <w:rFonts w:ascii="Georgia" w:hAnsi="Georgia"/>
-                <w:sz w:val="21"/>
-                <w:szCs w:val="21"/>
-                <w:lang w:val="bg-BG" w:eastAsia="bg-BG"/>
-              </w:rPr>
-              <w:t xml:space="preserve"> обременен с вещни тежести, ипотечни задължения и възбрани, за имот</w:t>
+              <w:t>задължения и възбрани, за имот</w:t>
             </w:r>
             <w:r>
               <w:rPr>
@@ -5059,7 +5059,63 @@
                 <w:szCs w:val="21"/>
                 <w:lang w:val="bg-BG" w:eastAsia="bg-BG"/>
               </w:rPr>
-              <w:t xml:space="preserve">Схема на самостоятелен обект в сграда № 15-212416-12.02.2026 </w:t>
+              <w:t>Схема на самостоятелен обект в сграда № 15-212416-12.02.2026 г., издадена от АГКК</w:t>
+            </w:r>
+            <w:r>
+              <w:rPr>
+                <w:rFonts w:ascii="Georgia" w:hAnsi="Georgia"/>
+                <w:sz w:val="21"/>
+                <w:szCs w:val="21"/>
+                <w:lang w:val="bg-BG" w:eastAsia="bg-BG"/>
+              </w:rPr>
+              <w:t>;</w:t>
+            </w:r>
+            <w:r>
+              <w:rPr>
+                <w:rFonts w:ascii="Georgia" w:hAnsi="Georgia"/>
+                <w:sz w:val="21"/>
+                <w:szCs w:val="21"/>
+                <w:lang w:val="bg-BG" w:eastAsia="bg-BG"/>
+              </w:rPr>
+              <w:t xml:space="preserve"> </w:t>
+            </w:r>
+            <w:r>
+              <w:rPr>
+                <w:rFonts w:ascii="Georgia" w:hAnsi="Georgia"/>
+                <w:b/>
+                <w:sz w:val="21"/>
+                <w:szCs w:val="21"/>
+                <w:lang w:val="bg-BG" w:eastAsia="bg-BG"/>
+              </w:rPr>
+              <w:t>3</w:t>
+            </w:r>
+            <w:r>
+              <w:rPr>
+                <w:rFonts w:ascii="Georgia" w:hAnsi="Georgia"/>
+                <w:b/>
+                <w:sz w:val="21"/>
+                <w:szCs w:val="21"/>
+                <w:lang w:val="bg-BG" w:eastAsia="bg-BG"/>
+              </w:rPr>
+              <w:t>.</w:t>
+            </w:r>
+            <w:r>
+              <w:rPr>
+                <w:rFonts w:ascii="Georgia" w:hAnsi="Georgia"/>
+                <w:sz w:val="21"/>
+                <w:szCs w:val="21"/>
+                <w:lang w:val="bg-BG" w:eastAsia="bg-BG"/>
+              </w:rPr>
+              <w:t xml:space="preserve"> </w:t>
+            </w:r>
+            <w:r>
+              <w:rPr>
+                <w:rFonts w:ascii="Georgia" w:hAnsi="Georgia"/>
+                <w:sz w:val="21"/>
+                <w:szCs w:val="21"/>
+                <w:lang w:val="bg-BG" w:eastAsia="bg-BG"/>
+              </w:rPr>
+              <w:t xml:space="preserve">Удостоверение за данъчна оценка с изх. № 7224051164, издадено на </w:t>
             </w:r>
             <w:r>
               <w:rPr>
@@ -5069,63 +5125,7 @@
                 <w:lang w:val="bg-BG" w:eastAsia="bg-BG"/>
               </w:rPr>
               <w:lastRenderedPageBreak/>
-              <w:t>г., издадена от АГКК</w:t>
-            </w:r>
-            <w:r>
-              <w:rPr>
-                <w:rFonts w:ascii="Georgia" w:hAnsi="Georgia"/>
-                <w:sz w:val="21"/>
-                <w:szCs w:val="21"/>
-                <w:lang w:val="bg-BG" w:eastAsia="bg-BG"/>
-              </w:rPr>
-              <w:t>;</w:t>
-            </w:r>
-            <w:r>
-              <w:rPr>
-                <w:rFonts w:ascii="Georgia" w:hAnsi="Georgia"/>
-                <w:sz w:val="21"/>
-                <w:szCs w:val="21"/>
-                <w:lang w:val="bg-BG" w:eastAsia="bg-BG"/>
-              </w:rPr>
-              <w:t xml:space="preserve"> </w:t>
-            </w:r>
-            <w:r>
-              <w:rPr>
-                <w:rFonts w:ascii="Georgia" w:hAnsi="Georgia"/>
-                <w:b/>
-                <w:sz w:val="21"/>
-                <w:szCs w:val="21"/>
-                <w:lang w:val="bg-BG" w:eastAsia="bg-BG"/>
-              </w:rPr>
-              <w:t>3</w:t>
-            </w:r>
-            <w:r>
-              <w:rPr>
-                <w:rFonts w:ascii="Georgia" w:hAnsi="Georgia"/>
-                <w:b/>
-                <w:sz w:val="21"/>
-                <w:szCs w:val="21"/>
-                <w:lang w:val="bg-BG" w:eastAsia="bg-BG"/>
-              </w:rPr>
-              <w:t>.</w:t>
-            </w:r>
-            <w:r>
-              <w:rPr>
-                <w:rFonts w:ascii="Georgia" w:hAnsi="Georgia"/>
-                <w:sz w:val="21"/>
-                <w:szCs w:val="21"/>
-                <w:lang w:val="bg-BG" w:eastAsia="bg-BG"/>
-              </w:rPr>
-              <w:t xml:space="preserve"> </w:t>
-            </w:r>
-            <w:r>
-              <w:rPr>
-                <w:rFonts w:ascii="Georgia" w:hAnsi="Georgia"/>
-                <w:sz w:val="21"/>
-                <w:szCs w:val="21"/>
-                <w:lang w:val="bg-BG" w:eastAsia="bg-BG"/>
-              </w:rPr>
-              <w:t>Удостоверение за данъчна оценка с изх. № 7224051164, издадено на 25.03.2026 г. от Столична община, Дирекция „Общински приходи“, Отдел ОП „Средец – Триадица“</w:t>
+              <w:t>25.03.2026 г. от Столична община, Дирекция „Общински приходи“, Отдел ОП „Средец – Триадица“</w:t>
             </w:r>
             <w:r>
               <w:rPr>

</xml_diff>

<commit_message>
Extract template data mapping helper
</commit_message>
<xml_diff>
--- a/output/result.docx
+++ b/output/result.docx
@@ -2210,7 +2210,7 @@
                 <w:rFonts w:ascii="Georgia" w:hAnsi="Georgia"/>
                 <w:sz w:val="21"/>
                 <w:szCs w:val="21"/>
-                <w:lang w:val="bg-BG" w:eastAsia="bg-BG"/>
+                <w:lang w:eastAsia="bg-BG"/>
               </w:rPr>
               <w:t xml:space="preserve">24.02.2026</w:t>
             </w:r>
@@ -2747,6 +2747,30 @@
                 <w:lang w:eastAsia="bg-BG"/>
               </w:rPr>
               <w:t xml:space="preserve">BG 67 UNCR 7000 4522 6900 18</w:t>
+            </w:r>
+            <w:r>
+              <w:rPr>
+                <w:rFonts w:ascii="Georgia" w:hAnsi="Georgia"/>
+                <w:b/>
+                <w:color w:val="000000"/>
+                <w:spacing w:val="3"/>
+                <w:sz w:val="21"/>
+                <w:szCs w:val="21"/>
+                <w:lang w:eastAsia="bg-BG"/>
+              </w:rPr>
+              <w:t/>
+            </w:r>
+            <w:r>
+              <w:rPr>
+                <w:rFonts w:ascii="Georgia" w:hAnsi="Georgia"/>
+                <w:b/>
+                <w:color w:val="000000"/>
+                <w:spacing w:val="3"/>
+                <w:sz w:val="21"/>
+                <w:szCs w:val="21"/>
+                <w:lang w:eastAsia="bg-BG"/>
+              </w:rPr>
+              <w:t/>
             </w:r>
             <w:r>
               <w:rPr>
@@ -5020,695 +5044,18 @@
                 <w:b/>
                 <w:sz w:val="21"/>
                 <w:szCs w:val="21"/>
-                <w:lang w:val="bg-BG" w:eastAsia="bg-BG"/>
-              </w:rPr>
-              <w:t xml:space="preserve">1. </w:t>
-            </w:r>
-            <w:r>
-              <w:rPr>
-                <w:rFonts w:ascii="Georgia" w:hAnsi="Georgia"/>
-                <w:sz w:val="21"/>
-                <w:szCs w:val="21"/>
-                <w:lang w:val="bg-BG" w:eastAsia="bg-BG"/>
-              </w:rPr>
-              <w:t>Нотариален акт за покупко-продажба на недвижим имот, № 29, том 2, рег. № 3118, дело 179 от 17.06.2005г. на Нотариус Маргарита Перусанова, рег. № 236 в НК, с район на действие – РС – София, вписан в СВ – гр. София към АВ с вх. рег. 29484 от 17.06.2005г., Акт № 183, том 85, дело № 21635/2005г., по имотна партида № 311618</w:t>
-            </w:r>
-            <w:r>
-              <w:rPr>
-                <w:rFonts w:ascii="Georgia" w:hAnsi="Georgia"/>
-                <w:sz w:val="21"/>
-                <w:szCs w:val="21"/>
-                <w:lang w:val="bg-BG" w:eastAsia="bg-BG"/>
-              </w:rPr>
-              <w:t xml:space="preserve">; </w:t>
-            </w:r>
-            <w:r>
-              <w:rPr>
-                <w:rFonts w:ascii="Georgia" w:hAnsi="Georgia"/>
-                <w:b/>
-                <w:sz w:val="21"/>
-                <w:szCs w:val="21"/>
-                <w:lang w:val="bg-BG" w:eastAsia="bg-BG"/>
-              </w:rPr>
-              <w:t xml:space="preserve">2. </w:t>
-            </w:r>
-            <w:r>
-              <w:rPr>
-                <w:rFonts w:ascii="Georgia" w:hAnsi="Georgia"/>
-                <w:sz w:val="21"/>
-                <w:szCs w:val="21"/>
-                <w:lang w:val="bg-BG" w:eastAsia="bg-BG"/>
-              </w:rPr>
-              <w:t>Схема на самостоятелен обект в сграда № 15-212416-12.02.2026 г., издадена от АГКК</w:t>
-            </w:r>
-            <w:r>
-              <w:rPr>
-                <w:rFonts w:ascii="Georgia" w:hAnsi="Georgia"/>
-                <w:sz w:val="21"/>
-                <w:szCs w:val="21"/>
-                <w:lang w:val="bg-BG" w:eastAsia="bg-BG"/>
-              </w:rPr>
-              <w:t>;</w:t>
-            </w:r>
-            <w:r>
-              <w:rPr>
-                <w:rFonts w:ascii="Georgia" w:hAnsi="Georgia"/>
-                <w:sz w:val="21"/>
-                <w:szCs w:val="21"/>
-                <w:lang w:val="bg-BG" w:eastAsia="bg-BG"/>
-              </w:rPr>
-              <w:t xml:space="preserve"> </w:t>
-            </w:r>
-            <w:r>
-              <w:rPr>
-                <w:rFonts w:ascii="Georgia" w:hAnsi="Georgia"/>
-                <w:b/>
-                <w:sz w:val="21"/>
-                <w:szCs w:val="21"/>
-                <w:lang w:val="bg-BG" w:eastAsia="bg-BG"/>
-              </w:rPr>
-              <w:t>3</w:t>
-            </w:r>
-            <w:r>
-              <w:rPr>
-                <w:rFonts w:ascii="Georgia" w:hAnsi="Georgia"/>
-                <w:b/>
-                <w:sz w:val="21"/>
-                <w:szCs w:val="21"/>
-                <w:lang w:val="bg-BG" w:eastAsia="bg-BG"/>
-              </w:rPr>
-              <w:t>.</w:t>
-            </w:r>
-            <w:r>
-              <w:rPr>
-                <w:rFonts w:ascii="Georgia" w:hAnsi="Georgia"/>
-                <w:sz w:val="21"/>
-                <w:szCs w:val="21"/>
-                <w:lang w:val="bg-BG" w:eastAsia="bg-BG"/>
-              </w:rPr>
-              <w:t xml:space="preserve"> </w:t>
-            </w:r>
-            <w:r>
-              <w:rPr>
-                <w:rFonts w:ascii="Georgia" w:hAnsi="Georgia"/>
-                <w:sz w:val="21"/>
-                <w:szCs w:val="21"/>
-                <w:lang w:val="bg-BG" w:eastAsia="bg-BG"/>
-              </w:rPr>
-              <w:t xml:space="preserve">Удостоверение за данъчна оценка с изх. № 7224051164, издадено на </w:t>
-            </w:r>
-            <w:r>
-              <w:rPr>
-                <w:rFonts w:ascii="Georgia" w:hAnsi="Georgia"/>
-                <w:sz w:val="21"/>
-                <w:szCs w:val="21"/>
-                <w:lang w:val="bg-BG" w:eastAsia="bg-BG"/>
-              </w:rPr>
-              <w:lastRenderedPageBreak/>
-              <w:t>25.03.2026 г. от Столична община, Дирекция „Общински приходи“, Отдел ОП „Средец – Триадица“</w:t>
-            </w:r>
-            <w:r>
-              <w:rPr>
-                <w:rFonts w:ascii="Georgia" w:hAnsi="Georgia"/>
-                <w:sz w:val="21"/>
-                <w:szCs w:val="21"/>
-                <w:lang w:val="bg-BG" w:eastAsia="bg-BG"/>
-              </w:rPr>
-              <w:t xml:space="preserve">; </w:t>
-            </w:r>
-            <w:r>
-              <w:rPr>
-                <w:rFonts w:ascii="Georgia" w:hAnsi="Georgia"/>
-                <w:b/>
-                <w:sz w:val="21"/>
-                <w:szCs w:val="21"/>
-                <w:lang w:val="bg-BG" w:eastAsia="bg-BG"/>
-              </w:rPr>
-              <w:t>4</w:t>
-            </w:r>
-            <w:r>
-              <w:rPr>
-                <w:rFonts w:ascii="Georgia" w:hAnsi="Georgia"/>
-                <w:b/>
-                <w:sz w:val="21"/>
-                <w:szCs w:val="21"/>
-                <w:lang w:val="bg-BG" w:eastAsia="bg-BG"/>
-              </w:rPr>
-              <w:t>.</w:t>
-            </w:r>
-            <w:r>
-              <w:rPr>
-                <w:rFonts w:ascii="Georgia" w:hAnsi="Georgia"/>
-                <w:b/>
-                <w:sz w:val="21"/>
-                <w:szCs w:val="21"/>
-                <w:lang w:val="bg-BG" w:eastAsia="bg-BG"/>
-              </w:rPr>
-              <w:t xml:space="preserve"> </w:t>
-            </w:r>
-            <w:r>
-              <w:rPr>
-                <w:rFonts w:ascii="Georgia" w:hAnsi="Georgia"/>
-                <w:sz w:val="21"/>
-                <w:szCs w:val="21"/>
-                <w:lang w:val="bg-BG" w:eastAsia="bg-BG"/>
-              </w:rPr>
-              <w:t xml:space="preserve">Удостоверение за семейно положение, съпруг/а и деца изх. № </w:t>
-            </w:r>
-            <w:r>
-              <w:rPr>
-                <w:rFonts w:ascii="Georgia" w:hAnsi="Georgia"/>
-                <w:sz w:val="21"/>
-                <w:szCs w:val="21"/>
-                <w:lang w:val="bg-BG" w:eastAsia="bg-BG"/>
-              </w:rPr>
-              <w:t>РСЦ24-УГ01-4783/30.07.2024 г., издадено от Столична община-район „Средец“</w:t>
-            </w:r>
-            <w:r>
-              <w:rPr>
-                <w:rFonts w:ascii="Georgia" w:hAnsi="Georgia"/>
-                <w:sz w:val="21"/>
-                <w:szCs w:val="21"/>
-                <w:lang w:val="bg-BG" w:eastAsia="bg-BG"/>
-              </w:rPr>
-              <w:t xml:space="preserve">; </w:t>
-            </w:r>
-            <w:r>
-              <w:rPr>
-                <w:rFonts w:ascii="Georgia" w:hAnsi="Georgia"/>
-                <w:b/>
-                <w:sz w:val="21"/>
-                <w:szCs w:val="21"/>
-                <w:lang w:val="bg-BG" w:eastAsia="bg-BG"/>
-              </w:rPr>
-              <w:t>5</w:t>
-            </w:r>
-            <w:r>
-              <w:rPr>
-                <w:rFonts w:ascii="Georgia" w:hAnsi="Georgia"/>
-                <w:b/>
-                <w:sz w:val="21"/>
-                <w:szCs w:val="21"/>
-                <w:lang w:val="bg-BG" w:eastAsia="bg-BG"/>
-              </w:rPr>
-              <w:t>.</w:t>
-            </w:r>
-            <w:r>
-              <w:rPr>
-                <w:rFonts w:ascii="Georgia" w:hAnsi="Georgia"/>
-                <w:b/>
-                <w:sz w:val="21"/>
-                <w:szCs w:val="21"/>
-                <w:lang w:val="bg-BG" w:eastAsia="bg-BG"/>
-              </w:rPr>
-              <w:t xml:space="preserve"> </w:t>
-            </w:r>
-            <w:r>
-              <w:rPr>
-                <w:rFonts w:ascii="Georgia" w:hAnsi="Georgia"/>
-                <w:sz w:val="21"/>
-                <w:szCs w:val="21"/>
-                <w:lang w:val="bg-BG" w:eastAsia="bg-BG"/>
-              </w:rPr>
-              <w:t>Удостоверение за идентичност на лице с различни имена изх. № РСЦ24-УГ01-4783/30.07.2024 г., издадено от Столична община-район „Средец“</w:t>
-            </w:r>
-            <w:r>
-              <w:rPr>
-                <w:rFonts w:ascii="Georgia" w:hAnsi="Georgia"/>
-                <w:sz w:val="21"/>
-                <w:szCs w:val="21"/>
-                <w:lang w:val="bg-BG" w:eastAsia="bg-BG"/>
-              </w:rPr>
-              <w:t xml:space="preserve">; </w:t>
-            </w:r>
-            <w:r>
-              <w:rPr>
-                <w:rFonts w:ascii="Georgia" w:hAnsi="Georgia"/>
-                <w:b/>
-                <w:sz w:val="21"/>
-                <w:szCs w:val="21"/>
-                <w:lang w:val="bg-BG" w:eastAsia="bg-BG"/>
-              </w:rPr>
-              <w:t>6</w:t>
-            </w:r>
-            <w:r>
-              <w:rPr>
-                <w:rFonts w:ascii="Georgia" w:hAnsi="Georgia"/>
-                <w:b/>
-                <w:sz w:val="21"/>
-                <w:szCs w:val="21"/>
-                <w:lang w:val="bg-BG" w:eastAsia="bg-BG"/>
-              </w:rPr>
-              <w:t>.</w:t>
-            </w:r>
-            <w:r>
-              <w:rPr>
-                <w:rFonts w:ascii="Georgia" w:hAnsi="Georgia"/>
-                <w:b/>
-                <w:sz w:val="21"/>
-                <w:szCs w:val="21"/>
-                <w:lang w:val="bg-BG" w:eastAsia="bg-BG"/>
-              </w:rPr>
-              <w:t xml:space="preserve"> </w:t>
-            </w:r>
-            <w:r>
-              <w:rPr>
-                <w:rFonts w:ascii="Georgia" w:hAnsi="Georgia"/>
-                <w:sz w:val="21"/>
-                <w:szCs w:val="21"/>
-                <w:lang w:val="bg-BG" w:eastAsia="bg-BG"/>
-              </w:rPr>
-              <w:t>Решение от 24.10.2000 г. на СРС, Брачна колегия, 83 състав, постановено по гр. дело № 725 от 2000 година</w:t>
-            </w:r>
-            <w:r>
-              <w:rPr>
-                <w:rFonts w:ascii="Georgia" w:hAnsi="Georgia"/>
-                <w:sz w:val="21"/>
-                <w:szCs w:val="21"/>
-                <w:lang w:val="bg-BG" w:eastAsia="bg-BG"/>
-              </w:rPr>
-              <w:t xml:space="preserve">; </w:t>
-            </w:r>
-            <w:r>
-              <w:rPr>
-                <w:rFonts w:ascii="Georgia" w:hAnsi="Georgia"/>
-                <w:b/>
-                <w:sz w:val="21"/>
-                <w:szCs w:val="21"/>
-                <w:lang w:val="bg-BG" w:eastAsia="bg-BG"/>
-              </w:rPr>
-              <w:t>7</w:t>
-            </w:r>
-            <w:r>
-              <w:rPr>
-                <w:rFonts w:ascii="Georgia" w:hAnsi="Georgia"/>
-                <w:b/>
-                <w:sz w:val="21"/>
-                <w:szCs w:val="21"/>
-                <w:lang w:val="bg-BG" w:eastAsia="bg-BG"/>
-              </w:rPr>
-              <w:t>.</w:t>
-            </w:r>
-            <w:r>
-              <w:rPr>
-                <w:rFonts w:ascii="Georgia" w:hAnsi="Georgia"/>
-                <w:b/>
-                <w:sz w:val="21"/>
-                <w:szCs w:val="21"/>
-                <w:lang w:val="bg-BG" w:eastAsia="bg-BG"/>
-              </w:rPr>
-              <w:t xml:space="preserve"> </w:t>
-            </w:r>
-            <w:r>
-              <w:rPr>
-                <w:rFonts w:ascii="Georgia" w:hAnsi="Georgia"/>
-                <w:sz w:val="21"/>
-                <w:szCs w:val="21"/>
-                <w:lang w:val="bg-BG" w:eastAsia="bg-BG"/>
-              </w:rPr>
-              <w:t xml:space="preserve">Брачен договор от 11.11.2019 г., с нотариална заверка на подписи и съдържание от 11.11.2019 г., вписан в Служба по вписванията – гр. София с вх. рег. № 74329/11.11.2019 г., акт № 77, том </w:t>
-            </w:r>
-            <w:r>
-              <w:rPr>
-                <w:rFonts w:ascii="Georgia" w:hAnsi="Georgia"/>
-                <w:sz w:val="21"/>
-                <w:szCs w:val="21"/>
-                <w:lang w:val="en-US" w:eastAsia="bg-BG"/>
-              </w:rPr>
-              <w:t>XIV</w:t>
-            </w:r>
-            <w:r>
-              <w:rPr>
-                <w:rFonts w:ascii="Georgia" w:hAnsi="Georgia"/>
-                <w:sz w:val="21"/>
-                <w:szCs w:val="21"/>
-                <w:lang w:val="bg-BG" w:eastAsia="bg-BG"/>
-              </w:rPr>
-              <w:t xml:space="preserve">; </w:t>
-            </w:r>
-            <w:r>
-              <w:rPr>
-                <w:rFonts w:ascii="Georgia" w:hAnsi="Georgia"/>
-                <w:b/>
-                <w:sz w:val="21"/>
-                <w:szCs w:val="21"/>
-                <w:lang w:val="bg-BG" w:eastAsia="bg-BG"/>
-              </w:rPr>
-              <w:t>8</w:t>
-            </w:r>
-            <w:r>
-              <w:rPr>
-                <w:rFonts w:ascii="Georgia" w:hAnsi="Georgia"/>
-                <w:b/>
-                <w:sz w:val="21"/>
-                <w:szCs w:val="21"/>
-                <w:lang w:val="bg-BG" w:eastAsia="bg-BG"/>
-              </w:rPr>
-              <w:t>.</w:t>
-            </w:r>
-            <w:r>
-              <w:rPr>
-                <w:rFonts w:ascii="Georgia" w:hAnsi="Georgia"/>
-                <w:sz w:val="21"/>
-                <w:szCs w:val="21"/>
-                <w:lang w:val="bg-BG" w:eastAsia="bg-BG"/>
-              </w:rPr>
-              <w:t xml:space="preserve"> Удостоверение за режим на имуществени отношения на Продавача с изх. № 20210721133355/дата 21.07.2021 г.</w:t>
-            </w:r>
-            <w:r>
-              <w:rPr>
-                <w:rFonts w:ascii="Georgia" w:hAnsi="Georgia"/>
-                <w:sz w:val="21"/>
-                <w:szCs w:val="21"/>
-                <w:lang w:val="bg-BG" w:eastAsia="bg-BG"/>
-              </w:rPr>
-              <w:t xml:space="preserve">; </w:t>
-            </w:r>
-            <w:r>
-              <w:rPr>
-                <w:rFonts w:ascii="Georgia" w:hAnsi="Georgia"/>
-                <w:b/>
-                <w:sz w:val="21"/>
-                <w:szCs w:val="21"/>
-                <w:lang w:val="bg-BG" w:eastAsia="bg-BG"/>
-              </w:rPr>
-              <w:t xml:space="preserve">9. </w:t>
-            </w:r>
-            <w:r>
-              <w:rPr>
-                <w:rFonts w:ascii="Georgia" w:hAnsi="Georgia"/>
-                <w:sz w:val="21"/>
-                <w:szCs w:val="21"/>
-                <w:lang w:val="bg-BG" w:eastAsia="bg-BG"/>
-              </w:rPr>
-              <w:t xml:space="preserve">Удостоверение за вписвания, отбелязвания и заличавания за имот на основание чл. 45, б. „б“ и „в“ от Правилника за вписванията изх. № </w:t>
-            </w:r>
-            <w:r>
-              <w:rPr>
-                <w:rFonts w:ascii="Georgia" w:hAnsi="Georgia"/>
-                <w:sz w:val="21"/>
-                <w:szCs w:val="21"/>
-                <w:lang w:val="en-US" w:eastAsia="bg-BG"/>
-              </w:rPr>
-              <w:t xml:space="preserve">______ </w:t>
-            </w:r>
-            <w:r>
-              <w:rPr>
-                <w:rFonts w:ascii="Georgia" w:hAnsi="Georgia"/>
-                <w:sz w:val="21"/>
-                <w:szCs w:val="21"/>
-                <w:lang w:val="bg-BG" w:eastAsia="bg-BG"/>
-              </w:rPr>
-              <w:t xml:space="preserve">от </w:t>
-            </w:r>
-            <w:r>
-              <w:rPr>
-                <w:rFonts w:ascii="Georgia" w:hAnsi="Georgia"/>
-                <w:sz w:val="21"/>
-                <w:szCs w:val="21"/>
-                <w:lang w:val="en-US" w:eastAsia="bg-BG"/>
-              </w:rPr>
-              <w:t xml:space="preserve">_______ 2026 </w:t>
-            </w:r>
-            <w:r>
-              <w:rPr>
-                <w:rFonts w:ascii="Georgia" w:hAnsi="Georgia"/>
-                <w:sz w:val="21"/>
-                <w:szCs w:val="21"/>
-                <w:lang w:val="bg-BG" w:eastAsia="bg-BG"/>
-              </w:rPr>
-              <w:t xml:space="preserve">година; </w:t>
-            </w:r>
-            <w:r>
-              <w:rPr>
-                <w:rFonts w:ascii="Georgia" w:hAnsi="Georgia"/>
-                <w:b/>
-                <w:sz w:val="21"/>
-                <w:szCs w:val="21"/>
-                <w:lang w:val="bg-BG" w:eastAsia="bg-BG"/>
-              </w:rPr>
-              <w:t>10</w:t>
-            </w:r>
-            <w:r>
-              <w:rPr>
-                <w:rFonts w:ascii="Georgia" w:hAnsi="Georgia" w:cs="Courier New"/>
-                <w:b/>
-                <w:sz w:val="21"/>
-                <w:szCs w:val="21"/>
-                <w:lang w:val="bg-BG" w:eastAsia="bg-BG"/>
-              </w:rPr>
-              <w:t>.</w:t>
-            </w:r>
-            <w:r>
-              <w:rPr>
-                <w:rFonts w:ascii="Georgia" w:hAnsi="Georgia" w:cs="Courier New"/>
-                <w:sz w:val="21"/>
-                <w:szCs w:val="21"/>
-                <w:lang w:val="bg-BG" w:eastAsia="bg-BG"/>
-              </w:rPr>
-              <w:t xml:space="preserve"> </w:t>
-            </w:r>
-            <w:r>
-              <w:rPr>
-                <w:rFonts w:ascii="Georgia" w:hAnsi="Georgia"/>
-                <w:sz w:val="21"/>
-                <w:szCs w:val="21"/>
-                <w:lang w:val="bg-BG" w:eastAsia="bg-BG"/>
-              </w:rPr>
-              <w:t>Декларации от продавач</w:t>
-            </w:r>
-            <w:r>
-              <w:rPr>
-                <w:rFonts w:ascii="Georgia" w:hAnsi="Georgia"/>
-                <w:sz w:val="21"/>
-                <w:szCs w:val="21"/>
-                <w:lang w:val="bg-BG" w:eastAsia="bg-BG"/>
-              </w:rPr>
-              <w:t>а</w:t>
-            </w:r>
-            <w:r>
-              <w:rPr>
-                <w:rFonts w:ascii="Georgia" w:hAnsi="Georgia"/>
-                <w:sz w:val="21"/>
-                <w:szCs w:val="21"/>
-                <w:lang w:val="bg-BG" w:eastAsia="bg-BG"/>
-              </w:rPr>
-              <w:t xml:space="preserve">; </w:t>
-            </w:r>
-            <w:r>
-              <w:rPr>
-                <w:rFonts w:ascii="Georgia" w:hAnsi="Georgia"/>
-                <w:b/>
-                <w:sz w:val="21"/>
-                <w:szCs w:val="21"/>
-                <w:lang w:val="bg-BG" w:eastAsia="bg-BG"/>
-              </w:rPr>
-              <w:t>1</w:t>
-            </w:r>
-            <w:r>
-              <w:rPr>
-                <w:rFonts w:ascii="Georgia" w:hAnsi="Georgia"/>
-                <w:b/>
-                <w:sz w:val="21"/>
-                <w:szCs w:val="21"/>
-                <w:lang w:val="bg-BG" w:eastAsia="bg-BG"/>
-              </w:rPr>
-              <w:t>1</w:t>
-            </w:r>
-            <w:r>
-              <w:rPr>
-                <w:rFonts w:ascii="Georgia" w:hAnsi="Georgia"/>
-                <w:b/>
-                <w:sz w:val="21"/>
-                <w:szCs w:val="21"/>
-                <w:lang w:val="bg-BG" w:eastAsia="bg-BG"/>
-              </w:rPr>
-              <w:t>.</w:t>
-            </w:r>
-            <w:r>
-              <w:rPr>
-                <w:rFonts w:ascii="Georgia" w:hAnsi="Georgia"/>
-                <w:sz w:val="21"/>
-                <w:szCs w:val="21"/>
-                <w:lang w:val="bg-BG" w:eastAsia="bg-BG"/>
-              </w:rPr>
-              <w:t xml:space="preserve"> Декларации от купувача;</w:t>
-            </w:r>
-            <w:r>
-              <w:rPr>
-                <w:rFonts w:ascii="Georgia" w:hAnsi="Georgia"/>
-                <w:sz w:val="21"/>
-                <w:szCs w:val="21"/>
-                <w:lang w:val="bg-BG" w:eastAsia="bg-BG"/>
-              </w:rPr>
-              <w:t xml:space="preserve"> </w:t>
-            </w:r>
-            <w:r>
-              <w:rPr>
-                <w:rFonts w:ascii="Georgia" w:hAnsi="Georgia"/>
-                <w:b/>
-                <w:sz w:val="21"/>
-                <w:szCs w:val="21"/>
-                <w:lang w:val="bg-BG" w:eastAsia="bg-BG"/>
-              </w:rPr>
-              <w:t>1</w:t>
-            </w:r>
-            <w:r>
-              <w:rPr>
-                <w:rFonts w:ascii="Georgia" w:hAnsi="Georgia"/>
-                <w:b/>
-                <w:sz w:val="21"/>
-                <w:szCs w:val="21"/>
-                <w:lang w:val="bg-BG" w:eastAsia="bg-BG"/>
-              </w:rPr>
-              <w:t>2</w:t>
-            </w:r>
-            <w:r>
-              <w:rPr>
-                <w:rFonts w:ascii="Georgia" w:hAnsi="Georgia"/>
-                <w:b/>
-                <w:sz w:val="21"/>
-                <w:szCs w:val="21"/>
-                <w:lang w:val="bg-BG" w:eastAsia="bg-BG"/>
-              </w:rPr>
-              <w:t>.</w:t>
-            </w:r>
-            <w:r>
-              <w:rPr>
-                <w:rFonts w:ascii="Georgia" w:hAnsi="Georgia"/>
-                <w:sz w:val="21"/>
-                <w:szCs w:val="21"/>
-                <w:lang w:val="bg-BG" w:eastAsia="bg-BG"/>
-              </w:rPr>
-              <w:t xml:space="preserve"> </w:t>
-            </w:r>
-            <w:r>
-              <w:rPr>
-                <w:rFonts w:ascii="Georgia" w:hAnsi="Georgia"/>
-                <w:sz w:val="21"/>
-                <w:szCs w:val="21"/>
-                <w:lang w:val="bg-BG" w:eastAsia="bg-BG"/>
-              </w:rPr>
-              <w:t>Предварителен договор между същите страни от 24</w:t>
-            </w:r>
-            <w:r>
-              <w:rPr>
-                <w:rFonts w:ascii="Georgia" w:hAnsi="Georgia"/>
-                <w:sz w:val="21"/>
-                <w:szCs w:val="21"/>
-                <w:lang w:val="en-US" w:eastAsia="bg-BG"/>
-              </w:rPr>
-              <w:t>.</w:t>
-            </w:r>
-            <w:r>
-              <w:rPr>
-                <w:rFonts w:ascii="Georgia" w:hAnsi="Georgia"/>
-                <w:sz w:val="21"/>
-                <w:szCs w:val="21"/>
-                <w:lang w:val="bg-BG" w:eastAsia="bg-BG"/>
-              </w:rPr>
-              <w:t>02</w:t>
-            </w:r>
-            <w:r>
-              <w:rPr>
-                <w:rFonts w:ascii="Georgia" w:hAnsi="Georgia"/>
-                <w:sz w:val="21"/>
-                <w:szCs w:val="21"/>
-                <w:lang w:val="en-US" w:eastAsia="bg-BG"/>
-              </w:rPr>
-              <w:t xml:space="preserve">.2026 </w:t>
-            </w:r>
-            <w:r>
-              <w:rPr>
-                <w:rFonts w:ascii="Georgia" w:hAnsi="Georgia"/>
-                <w:sz w:val="21"/>
-                <w:szCs w:val="21"/>
-                <w:lang w:val="bg-BG" w:eastAsia="bg-BG"/>
-              </w:rPr>
-              <w:t>година и</w:t>
-            </w:r>
-            <w:r>
-              <w:rPr>
-                <w:rFonts w:ascii="Georgia" w:hAnsi="Georgia"/>
-                <w:sz w:val="21"/>
-                <w:szCs w:val="21"/>
-                <w:lang w:val="bg-BG" w:eastAsia="bg-BG"/>
-              </w:rPr>
-              <w:t xml:space="preserve"> Протокол – опис</w:t>
-            </w:r>
-            <w:r>
-              <w:rPr>
-                <w:rFonts w:ascii="Georgia" w:hAnsi="Georgia"/>
-                <w:sz w:val="21"/>
-                <w:szCs w:val="21"/>
-                <w:lang w:val="bg-BG" w:eastAsia="bg-BG"/>
-              </w:rPr>
-              <w:t xml:space="preserve"> към него от същата дата; </w:t>
-            </w:r>
-            <w:r>
-              <w:rPr>
-                <w:rFonts w:ascii="Georgia" w:hAnsi="Georgia"/>
-                <w:b/>
-                <w:sz w:val="21"/>
-                <w:szCs w:val="21"/>
-                <w:lang w:val="bg-BG" w:eastAsia="bg-BG"/>
-              </w:rPr>
-              <w:t>13.</w:t>
-            </w:r>
-            <w:r>
-              <w:rPr>
-                <w:rFonts w:ascii="Georgia" w:hAnsi="Georgia"/>
-                <w:sz w:val="21"/>
-                <w:szCs w:val="21"/>
-                <w:lang w:val="bg-BG" w:eastAsia="bg-BG"/>
-              </w:rPr>
-              <w:t xml:space="preserve"> Платежно нареждане за платено капаро в размер на 10% от продажната цена;</w:t>
-            </w:r>
-            <w:r>
-              <w:rPr>
-                <w:rFonts w:ascii="Georgia" w:hAnsi="Georgia"/>
-                <w:sz w:val="21"/>
-                <w:szCs w:val="21"/>
-                <w:lang w:val="bg-BG" w:eastAsia="bg-BG"/>
-              </w:rPr>
-              <w:t xml:space="preserve"> </w:t>
-            </w:r>
-            <w:r>
-              <w:rPr>
-                <w:rFonts w:ascii="Georgia" w:hAnsi="Georgia"/>
-                <w:b/>
-                <w:sz w:val="21"/>
-                <w:szCs w:val="21"/>
-                <w:lang w:val="bg-BG" w:eastAsia="bg-BG"/>
-              </w:rPr>
-              <w:t>14.</w:t>
-            </w:r>
-            <w:r>
-              <w:rPr>
-                <w:rFonts w:ascii="Georgia" w:hAnsi="Georgia"/>
-                <w:sz w:val="21"/>
-                <w:szCs w:val="21"/>
-                <w:lang w:val="bg-BG" w:eastAsia="bg-BG"/>
-              </w:rPr>
-              <w:t xml:space="preserve"> </w:t>
-            </w:r>
-            <w:r>
-              <w:rPr>
-                <w:rFonts w:ascii="Georgia" w:hAnsi="Georgia"/>
-                <w:sz w:val="21"/>
-                <w:szCs w:val="21"/>
-                <w:lang w:val="bg-BG" w:eastAsia="bg-BG"/>
-              </w:rPr>
-              <w:t xml:space="preserve">Платежно нареждане </w:t>
-            </w:r>
-            <w:r>
-              <w:rPr>
-                <w:rFonts w:ascii="Georgia" w:hAnsi="Georgia"/>
-                <w:sz w:val="21"/>
-                <w:szCs w:val="21"/>
-                <w:lang w:val="bg-BG" w:eastAsia="bg-BG"/>
-              </w:rPr>
-              <w:t>за платени такси. -----</w:t>
+                <w:lang w:eastAsia="bg-BG"/>
+              </w:rPr>
+              <w:t xml:space="preserve">1. Нотариален акт за покупко-продажба на недвижим имот, № 29, том 2, рег. № 3118, дело 179 от 17.06.2005г. на Нотариус Маргарита Перусанова, рег. № 236 в НК, с район на действие – РС – София, вписан в СВ – гр. София към АВ с вх. рег. 29484 от 17.06.2005г., Акт № 183, том 85, дело № 21635/2005г., по имотна партида № 311618; 2. Схема на самостоятелен обект в сграда № 15-212416-12.02.2026 г., издадена от АГКК; 3. Удостоверение за данъчна оценка с изх. № 7224051164, издадено на 25.03.2026 г. от Столична община, Дирекция „Общински приходи“, Отдел ОП „Средец – Триадица“; 4. Удостоверение за семейно положение, съпруг/а и деца изх. № РСЦ24-УГ01-4783/30.07.2024 г., издадено от Столична община-район „Средец“; 5. Удостоверение за идентичност на лице с различни имена изх. № РСЦ24-УГ01-4783/30.07.2024 г., издадено от Столична община-район „Средец“; 6. Решение от 24.10.2000 г. на СРС, Брачна колегия, 83 състав, постановено по гр. дело № 725 от 2000 година; 7. Брачен договор от 11.11.2019 г., с нотариална заверка на подписи и съдържание от 11.11.2019 г., вписан в Служба по вписванията – гр. София с вх. рег. № 74329/11.11.2019 г., акт № 77, том XIV; 8. Удостоверение за режим на имуществени отношения на Продавача с изх. № 20210721133355/дата 21.07.2021 г.; 9. Удостоверение за вписвания, отбелязвания и заличавания за имот на основание чл. 45, б. „б“ и „в“ от Правилника за вписванията изх. № ______ от _______ 2026 година; 10. Декларации от продавача; 11. Декларации от купувача; 12. Предварителен договор между същите страни от 24.02.2026 година и Протокол – опис към него от същата дата; 13. Платежно нареждане за платено капаро в размер на 10% от продажната цена; 14. Платежно нареждане за платени такси.</w:t>
+            </w:r>
+            <w:r>
+              <w:rPr>
+                <w:rFonts w:ascii="Georgia" w:hAnsi="Georgia"/>
+                <w:sz w:val="21"/>
+                <w:szCs w:val="21"/>
+                <w:lang w:val="bg-BG" w:eastAsia="bg-BG"/>
+              </w:rPr>
+              <w:t xml:space="preserve"> -----</w:t>
             </w:r>
             <w:r>
               <w:rPr>

</xml_diff>

<commit_message>
Accept template data from request body
</commit_message>
<xml_diff>
--- a/output/result.docx
+++ b/output/result.docx
@@ -1093,7 +1093,7 @@
                 <w:szCs w:val="21"/>
                 <w:lang w:eastAsia="bg-BG"/>
               </w:rPr>
-              <w:t xml:space="preserve">01.01.2026</w:t>
+              <w:t xml:space="preserve">02.04.2026</w:t>
             </w:r>
             <w:r>
               <w:rPr>
@@ -1111,7 +1111,7 @@
                 <w:szCs w:val="21"/>
                 <w:lang w:eastAsia="bg-BG"/>
               </w:rPr>
-              <w:t xml:space="preserve">първи януари две хиляди двадесет и шеста година</w:t>
+              <w:t xml:space="preserve">втори април две хиляди двадесет и шеста година</w:t>
             </w:r>
             <w:r>
               <w:rPr>
@@ -1160,7 +1160,7 @@
                 <w:szCs w:val="21"/>
                 <w:lang w:val="bg-BG" w:eastAsia="bg-BG"/>
               </w:rPr>
-              <w:t xml:space="preserve">ИВАН ИВАНОВ</w:t>
+              <w:t xml:space="preserve">ЕМИЛИЯ ИВАНОВА ГОРАНОВА - ВЕСТНЕР</w:t>
             </w:r>
             <w:r>
               <w:rPr>
@@ -1404,7 +1404,7 @@
                 <w:szCs w:val="21"/>
                 <w:lang w:val="bg-BG" w:eastAsia="bg-BG"/>
               </w:rPr>
-              <w:t xml:space="preserve">ПЕТЪР ПЕТРОВ</w:t>
+              <w:t xml:space="preserve">КАМЕЛИЯ АНГЕЛОВА АНГЕЛОВА – ТОДОРОВА</w:t>
             </w:r>
             <w:r>
               <w:rPr>
@@ -1679,7 +1679,7 @@
                 <w:szCs w:val="21"/>
                 <w:lang w:eastAsia="bg-BG"/>
               </w:rPr>
-              <w:t xml:space="preserve">ИВАН ИВАНОВ</w:t>
+              <w:t xml:space="preserve">ЕМИЛИЯ ИВАНОВА ГОРАНОВА - ВЕСТНЕР</w:t>
             </w:r>
             <w:r>
               <w:rPr>
@@ -1708,7 +1708,7 @@
                 <w:szCs w:val="21"/>
                 <w:lang w:eastAsia="bg-BG"/>
               </w:rPr>
-              <w:t xml:space="preserve">ПЕТЪР ПЕТРОВ</w:t>
+              <w:t xml:space="preserve">КАМЕЛИЯ АНГЕЛОВА АНГЕЛОВА – ТОДОРОВА</w:t>
             </w:r>
             <w:r>
               <w:rPr>
@@ -3006,7 +3006,7 @@
                 <w:szCs w:val="21"/>
                 <w:lang w:eastAsia="bg-BG"/>
               </w:rPr>
-              <w:t xml:space="preserve">100 000 евро (сто хиляди евро)</w:t>
+              <w:t xml:space="preserve">360 000,00 евро (триста и шестдесет хиляди евро)</w:t>
             </w:r>
             <w:r>
               <w:rPr>
@@ -3076,7 +3076,7 @@
                 <w:szCs w:val="21"/>
                 <w:lang w:eastAsia="bg-BG"/>
               </w:rPr>
-              <w:t xml:space="preserve">ИВАН ИВАНОВ</w:t>
+              <w:t xml:space="preserve">ЕМИЛИЯ ИВАНОВА ГОРАНОВА - ВЕСТНЕР</w:t>
             </w:r>
             <w:r>
               <w:rPr>
@@ -3106,7 +3106,7 @@
                 <w:szCs w:val="21"/>
                 <w:lang w:eastAsia="bg-BG"/>
               </w:rPr>
-              <w:t xml:space="preserve">ПЕТЪР ПЕТРОВ</w:t>
+              <w:t xml:space="preserve">КАМЕЛИЯ АНГЕЛОВА АНГЕЛОВА – ТОДОРОВА</w:t>
             </w:r>
             <w:r>
               <w:rPr>
@@ -3180,7 +3180,7 @@
                 <w:szCs w:val="21"/>
                 <w:lang w:eastAsia="bg-BG"/>
               </w:rPr>
-              <w:t xml:space="preserve">ПЕТЪР ПЕТРОВ</w:t>
+              <w:t xml:space="preserve">КАМЕЛИЯ АНГЕЛОВА АНГЕЛОВА – ТОДОРОВА</w:t>
             </w:r>
             <w:r>
               <w:rPr>
@@ -3211,7 +3211,7 @@
                 <w:szCs w:val="21"/>
                 <w:lang w:eastAsia="bg-BG"/>
               </w:rPr>
-              <w:t xml:space="preserve">ИВАН ИВАНОВ</w:t>
+              <w:t xml:space="preserve">ЕМИЛИЯ ИВАНОВА ГОРАНОВА - ВЕСТНЕР</w:t>
             </w:r>
             <w:r>
               <w:rPr>
@@ -3364,7 +3364,7 @@
                 <w:szCs w:val="21"/>
                 <w:lang w:eastAsia="bg-BG"/>
               </w:rPr>
-              <w:t xml:space="preserve">ПЕТЪР ПЕТРОВ</w:t>
+              <w:t xml:space="preserve">КАМЕЛИЯ АНГЕЛОВА АНГЕЛОВА – ТОДОРОВА</w:t>
             </w:r>
             <w:r>
               <w:rPr>
@@ -3395,7 +3395,7 @@
                 <w:szCs w:val="21"/>
                 <w:lang w:eastAsia="bg-BG"/>
               </w:rPr>
-              <w:t xml:space="preserve">ИВАН ИВАНОВ</w:t>
+              <w:t xml:space="preserve">ЕМИЛИЯ ИВАНОВА ГОРАНОВА - ВЕСТНЕР</w:t>
             </w:r>
             <w:r>
               <w:rPr>
@@ -3952,7 +3952,7 @@
                 <w:szCs w:val="21"/>
                 <w:lang w:eastAsia="bg-BG"/>
               </w:rPr>
-              <w:t xml:space="preserve">ИВАН ИВАНОВ</w:t>
+              <w:t xml:space="preserve">ЕМИЛИЯ ИВАНОВА ГОРАНОВА - ВЕСТНЕР</w:t>
             </w:r>
             <w:r>
               <w:rPr>
@@ -4388,7 +4388,7 @@
                 <w:szCs w:val="21"/>
                 <w:lang w:eastAsia="bg-BG"/>
               </w:rPr>
-              <w:t xml:space="preserve">ПЕТЪР ПЕТРОВ</w:t>
+              <w:t xml:space="preserve">КАМЕЛИЯ АНГЕЛОВА АНГЕЛОВА – ТОДОРОВА</w:t>
             </w:r>
             <w:r>
               <w:rPr>
@@ -4416,7 +4416,7 @@
                 <w:szCs w:val="21"/>
                 <w:lang w:eastAsia="bg-BG"/>
               </w:rPr>
-              <w:t xml:space="preserve">ИВАН ИВАНОВ</w:t>
+              <w:t xml:space="preserve">ЕМИЛИЯ ИВАНОВА ГОРАНОВА - ВЕСТНЕР</w:t>
             </w:r>
             <w:r>
               <w:rPr>
@@ -5363,7 +5363,7 @@
                 <w:szCs w:val="21"/>
                 <w:lang w:eastAsia="bg-BG"/>
               </w:rPr>
-              <w:t xml:space="preserve">ПЕТЪР ПЕТРОВ</w:t>
+              <w:t xml:space="preserve">КАМЕЛИЯ АНГЕЛОВА АНГЕЛОВА – ТОДОРОВА</w:t>
             </w:r>
             <w:r>
               <w:rPr>
@@ -6685,7 +6685,7 @@
                 <w:szCs w:val="18"/>
                 <w:lang w:eastAsia="bg-BG"/>
               </w:rPr>
-              <w:t xml:space="preserve">ИВАН ИВАНОВ</w:t>
+              <w:t xml:space="preserve">ЕМИЛИЯ ИВАНОВА ГОРАНОВА - ВЕСТНЕР</w:t>
             </w:r>
             <w:r>
               <w:rPr>
@@ -6893,7 +6893,7 @@
                 <w:szCs w:val="18"/>
                 <w:lang w:eastAsia="bg-BG"/>
               </w:rPr>
-              <w:t xml:space="preserve">ПЕТЪР ПЕТРОВ</w:t>
+              <w:t xml:space="preserve">КАМЕЛИЯ АНГЕЛОВА АНГЕЛОВА – ТОДОРОВА</w:t>
             </w:r>
             <w:r>
               <w:rPr>

</xml_diff>

<commit_message>
Add basic number to words conversion
</commit_message>
<xml_diff>
--- a/output/result.docx
+++ b/output/result.docx
@@ -1953,6 +1953,334 @@
                 <w:szCs w:val="21"/>
                 <w:lang w:eastAsia="bg-BG"/>
               </w:rPr>
+              <w:t xml:space="preserve">68134.107.198.1.6 (undefined)</w:t>
+            </w:r>
+            <w:r>
+              <w:rPr>
+                <w:rFonts w:ascii="Georgia" w:eastAsia="Calibri" w:hAnsi="Georgia"/>
+                <w:sz w:val="21"/>
+                <w:szCs w:val="21"/>
+                <w:lang w:val="bg-BG" w:eastAsia="bg-BG"/>
+              </w:rPr>
+              <w:t>, по к</w:t>
+            </w:r>
+            <w:r>
+              <w:rPr>
+                <w:rFonts w:ascii="Georgia" w:eastAsia="Calibri" w:hAnsi="Georgia"/>
+                <w:sz w:val="21"/>
+                <w:szCs w:val="21"/>
+                <w:lang w:val="bg-BG" w:eastAsia="bg-BG"/>
+              </w:rPr>
+              <w:t xml:space="preserve">адастралната карта и кадастралните регистри </w:t>
+            </w:r>
+            <w:r>
+              <w:rPr>
+                <w:rFonts w:ascii="Georgia" w:eastAsia="Calibri" w:hAnsi="Georgia"/>
+                <w:sz w:val="21"/>
+                <w:szCs w:val="21"/>
+                <w:lang w:val="bg-BG" w:eastAsia="bg-BG"/>
+              </w:rPr>
+              <w:t xml:space="preserve">на гр. </w:t>
+            </w:r>
+            <w:r>
+              <w:rPr>
+                <w:rFonts w:ascii="Georgia" w:eastAsia="Calibri" w:hAnsi="Georgia"/>
+                <w:b/>
+                <w:sz w:val="21"/>
+                <w:szCs w:val="21"/>
+                <w:lang w:val="bg-BG" w:eastAsia="bg-BG"/>
+              </w:rPr>
+              <w:t>София</w:t>
+            </w:r>
+            <w:r>
+              <w:rPr>
+                <w:rFonts w:ascii="Georgia" w:eastAsia="Calibri" w:hAnsi="Georgia"/>
+                <w:sz w:val="21"/>
+                <w:szCs w:val="21"/>
+                <w:lang w:val="bg-BG" w:eastAsia="bg-BG"/>
+              </w:rPr>
+              <w:t xml:space="preserve">, община </w:t>
+            </w:r>
+            <w:r>
+              <w:rPr>
+                <w:rFonts w:ascii="Georgia" w:eastAsia="Calibri" w:hAnsi="Georgia"/>
+                <w:b/>
+                <w:sz w:val="21"/>
+                <w:szCs w:val="21"/>
+                <w:lang w:val="bg-BG" w:eastAsia="bg-BG"/>
+              </w:rPr>
+              <w:t>Столична</w:t>
+            </w:r>
+            <w:r>
+              <w:rPr>
+                <w:rFonts w:ascii="Georgia" w:eastAsia="Calibri" w:hAnsi="Georgia"/>
+                <w:sz w:val="21"/>
+                <w:szCs w:val="21"/>
+                <w:lang w:val="bg-BG" w:eastAsia="bg-BG"/>
+              </w:rPr>
+              <w:t xml:space="preserve">, област </w:t>
+            </w:r>
+            <w:r>
+              <w:rPr>
+                <w:rFonts w:ascii="Georgia" w:eastAsia="Calibri" w:hAnsi="Georgia"/>
+                <w:b/>
+                <w:sz w:val="21"/>
+                <w:szCs w:val="21"/>
+                <w:lang w:val="bg-BG" w:eastAsia="bg-BG"/>
+              </w:rPr>
+              <w:t>София (столица)</w:t>
+            </w:r>
+            <w:r>
+              <w:rPr>
+                <w:rFonts w:ascii="Georgia" w:eastAsia="Calibri" w:hAnsi="Georgia"/>
+                <w:sz w:val="21"/>
+                <w:szCs w:val="21"/>
+                <w:lang w:val="bg-BG" w:eastAsia="bg-BG"/>
+              </w:rPr>
+              <w:t>, одобрен</w:t>
+            </w:r>
+            <w:r>
+              <w:rPr>
+                <w:rFonts w:ascii="Georgia" w:eastAsia="Calibri" w:hAnsi="Georgia"/>
+                <w:sz w:val="21"/>
+                <w:szCs w:val="21"/>
+                <w:lang w:val="bg-BG" w:eastAsia="bg-BG"/>
+              </w:rPr>
+              <w:t>и</w:t>
+            </w:r>
+            <w:r>
+              <w:rPr>
+                <w:rFonts w:ascii="Georgia" w:eastAsia="Calibri" w:hAnsi="Georgia"/>
+                <w:sz w:val="21"/>
+                <w:szCs w:val="21"/>
+                <w:lang w:val="bg-BG" w:eastAsia="bg-BG"/>
+              </w:rPr>
+              <w:t xml:space="preserve"> със </w:t>
+            </w:r>
+            <w:r>
+              <w:rPr>
+                <w:rFonts w:ascii="Georgia" w:eastAsia="Calibri" w:hAnsi="Georgia"/>
+                <w:b/>
+                <w:sz w:val="21"/>
+                <w:szCs w:val="21"/>
+                <w:lang w:val="bg-BG" w:eastAsia="bg-BG"/>
+              </w:rPr>
+              <w:t>Заповед № РД-18-33 от 15.06.2010</w:t>
+            </w:r>
+            <w:r>
+              <w:rPr>
+                <w:rFonts w:ascii="Georgia" w:eastAsia="Calibri" w:hAnsi="Georgia"/>
+                <w:b/>
+                <w:sz w:val="21"/>
+                <w:szCs w:val="21"/>
+                <w:lang w:val="bg-BG" w:eastAsia="bg-BG"/>
+              </w:rPr>
+              <w:t xml:space="preserve"> </w:t>
+            </w:r>
+            <w:r>
+              <w:rPr>
+                <w:rFonts w:ascii="Georgia" w:eastAsia="Calibri" w:hAnsi="Georgia"/>
+                <w:b/>
+                <w:sz w:val="21"/>
+                <w:szCs w:val="21"/>
+                <w:lang w:val="bg-BG" w:eastAsia="bg-BG"/>
+              </w:rPr>
+              <w:t>г. на Изпълнителния директор на АГКК</w:t>
+            </w:r>
+            <w:r>
+              <w:rPr>
+                <w:rFonts w:ascii="Georgia" w:eastAsia="Calibri" w:hAnsi="Georgia"/>
+                <w:sz w:val="21"/>
+                <w:szCs w:val="21"/>
+                <w:lang w:val="bg-BG" w:eastAsia="bg-BG"/>
+              </w:rPr>
+              <w:t xml:space="preserve">, последно изменение на кадастралната карта и кадастралните регистри, засягащо </w:t>
+            </w:r>
+            <w:r>
+              <w:rPr>
+                <w:rFonts w:ascii="Georgia" w:eastAsia="Calibri" w:hAnsi="Georgia"/>
+                <w:sz w:val="21"/>
+                <w:szCs w:val="21"/>
+                <w:lang w:val="bg-BG" w:eastAsia="bg-BG"/>
+              </w:rPr>
+              <w:t>самостоятел</w:t>
+            </w:r>
+            <w:r>
+              <w:rPr>
+                <w:rFonts w:ascii="Georgia" w:eastAsia="Calibri" w:hAnsi="Georgia"/>
+                <w:sz w:val="21"/>
+                <w:szCs w:val="21"/>
+                <w:lang w:val="bg-BG" w:eastAsia="bg-BG"/>
+              </w:rPr>
+              <w:t>ния</w:t>
+            </w:r>
+            <w:r>
+              <w:rPr>
+                <w:rFonts w:ascii="Georgia" w:eastAsia="Calibri" w:hAnsi="Georgia"/>
+                <w:sz w:val="21"/>
+                <w:szCs w:val="21"/>
+                <w:lang w:val="bg-BG" w:eastAsia="bg-BG"/>
+              </w:rPr>
+              <w:t xml:space="preserve"> обект</w:t>
+            </w:r>
+            <w:r>
+              <w:rPr>
+                <w:rFonts w:ascii="Georgia" w:eastAsia="Calibri" w:hAnsi="Georgia"/>
+                <w:sz w:val="21"/>
+                <w:szCs w:val="21"/>
+                <w:lang w:val="bg-BG" w:eastAsia="bg-BG"/>
+              </w:rPr>
+              <w:t xml:space="preserve">: </w:t>
+            </w:r>
+            <w:r>
+              <w:rPr>
+                <w:rFonts w:ascii="Georgia" w:eastAsia="Calibri" w:hAnsi="Georgia"/>
+                <w:b/>
+                <w:sz w:val="21"/>
+                <w:szCs w:val="21"/>
+                <w:lang w:val="bg-BG" w:eastAsia="bg-BG"/>
+              </w:rPr>
+              <w:t>няма извършено изменение на КККР със заповед</w:t>
+            </w:r>
+            <w:r>
+              <w:rPr>
+                <w:rFonts w:ascii="Georgia" w:eastAsia="Calibri" w:hAnsi="Georgia"/>
+                <w:sz w:val="21"/>
+                <w:szCs w:val="21"/>
+                <w:lang w:val="bg-BG" w:eastAsia="bg-BG"/>
+              </w:rPr>
+              <w:t xml:space="preserve">, с адрес на самостоятелния обект: </w:t>
+            </w:r>
+            <w:r>
+              <w:rPr>
+                <w:rFonts w:ascii="Georgia" w:eastAsia="Calibri" w:hAnsi="Georgia"/>
+                <w:b/>
+                <w:sz w:val="21"/>
+                <w:szCs w:val="21"/>
+                <w:lang w:val="bg-BG" w:eastAsia="bg-BG"/>
+              </w:rPr>
+              <w:t xml:space="preserve">гр. София, район Средец, ул. ЦАР ИВАН АСЕН II №43, ет. 3, ап. 6</w:t>
+            </w:r>
+            <w:r>
+              <w:rPr>
+                <w:rFonts w:ascii="Georgia" w:eastAsia="Calibri" w:hAnsi="Georgia"/>
+                <w:sz w:val="21"/>
+                <w:szCs w:val="21"/>
+                <w:lang w:val="bg-BG" w:eastAsia="bg-BG"/>
+              </w:rPr>
+              <w:t>,</w:t>
+            </w:r>
+            <w:r>
+              <w:rPr>
+                <w:rFonts w:ascii="Georgia" w:eastAsia="Calibri" w:hAnsi="Georgia"/>
+                <w:sz w:val="21"/>
+                <w:szCs w:val="21"/>
+                <w:lang w:val="bg-BG" w:eastAsia="bg-BG"/>
+              </w:rPr>
+              <w:t xml:space="preserve"> самостоятелния</w:t>
+            </w:r>
+            <w:r>
+              <w:rPr>
+                <w:rFonts w:ascii="Georgia" w:eastAsia="Calibri" w:hAnsi="Georgia"/>
+                <w:sz w:val="21"/>
+                <w:szCs w:val="21"/>
+                <w:lang w:val="bg-BG" w:eastAsia="bg-BG"/>
+              </w:rPr>
+              <w:t>т</w:t>
+            </w:r>
+            <w:r>
+              <w:rPr>
+                <w:rFonts w:ascii="Georgia" w:eastAsia="Calibri" w:hAnsi="Georgia"/>
+                <w:sz w:val="21"/>
+                <w:szCs w:val="21"/>
+                <w:lang w:val="bg-BG" w:eastAsia="bg-BG"/>
+              </w:rPr>
+              <w:t xml:space="preserve"> обект се намира на етаж </w:t>
+            </w:r>
+            <w:r>
+              <w:rPr>
+                <w:rFonts w:ascii="Georgia" w:eastAsia="Calibri" w:hAnsi="Georgia"/>
+                <w:b/>
+                <w:sz w:val="21"/>
+                <w:szCs w:val="21"/>
+                <w:lang w:eastAsia="bg-BG"/>
+              </w:rPr>
+              <w:t xml:space="preserve">3 (undefined)</w:t>
+            </w:r>
+            <w:r>
+              <w:rPr>
+                <w:rFonts w:ascii="Georgia" w:eastAsia="Calibri" w:hAnsi="Georgia"/>
+                <w:sz w:val="21"/>
+                <w:szCs w:val="21"/>
+                <w:lang w:val="bg-BG" w:eastAsia="bg-BG"/>
+              </w:rPr>
+              <w:t xml:space="preserve"> </w:t>
+            </w:r>
+            <w:r>
+              <w:rPr>
+                <w:rFonts w:ascii="Georgia" w:eastAsia="Calibri" w:hAnsi="Georgia"/>
+                <w:sz w:val="21"/>
+                <w:szCs w:val="21"/>
+                <w:lang w:val="bg-BG" w:eastAsia="bg-BG"/>
+              </w:rPr>
+              <w:t xml:space="preserve">в сграда с идентификатор </w:t>
+            </w:r>
+            <w:r>
+              <w:rPr>
+                <w:rFonts w:ascii="Georgia" w:eastAsia="Calibri" w:hAnsi="Georgia"/>
+                <w:b/>
+                <w:sz w:val="21"/>
+                <w:szCs w:val="21"/>
+                <w:lang w:eastAsia="bg-BG"/>
+              </w:rPr>
+              <w:t xml:space="preserve">68134.107.198.1 (undefined)</w:t>
+            </w:r>
+            <w:r>
+              <w:rPr>
+                <w:rFonts w:ascii="Georgia" w:eastAsia="Calibri" w:hAnsi="Georgia"/>
+                <w:sz w:val="21"/>
+                <w:szCs w:val="21"/>
+                <w:lang w:val="bg-BG" w:eastAsia="bg-BG"/>
+              </w:rPr>
+              <w:t xml:space="preserve">, с предназначение: </w:t>
+            </w:r>
+            <w:r>
+              <w:rPr>
+                <w:rFonts w:ascii="Georgia" w:eastAsia="Calibri" w:hAnsi="Georgia"/>
+                <w:b/>
+                <w:sz w:val="21"/>
+                <w:szCs w:val="21"/>
+                <w:lang w:val="bg-BG" w:eastAsia="bg-BG"/>
+              </w:rPr>
+              <w:t>Ж</w:t>
+            </w:r>
+            <w:r>
+              <w:rPr>
+                <w:rFonts w:ascii="Georgia" w:eastAsia="Calibri" w:hAnsi="Georgia"/>
+                <w:b/>
+                <w:sz w:val="21"/>
+                <w:szCs w:val="21"/>
+                <w:lang w:val="bg-BG" w:eastAsia="bg-BG"/>
+              </w:rPr>
+              <w:t>илищна сграда – многофамилна</w:t>
+            </w:r>
+            <w:r>
+              <w:rPr>
+                <w:rFonts w:ascii="Georgia" w:eastAsia="Calibri" w:hAnsi="Georgia"/>
+                <w:sz w:val="21"/>
+                <w:szCs w:val="21"/>
+                <w:lang w:val="bg-BG" w:eastAsia="bg-BG"/>
+              </w:rPr>
+              <w:t xml:space="preserve">, брой етажи – </w:t>
+            </w:r>
+            <w:r>
+              <w:rPr>
+                <w:rFonts w:ascii="Georgia" w:eastAsia="Calibri" w:hAnsi="Georgia"/>
+                <w:b/>
+                <w:sz w:val="21"/>
+                <w:szCs w:val="21"/>
+                <w:lang w:eastAsia="bg-BG"/>
+              </w:rPr>
               <w:t xml:space="preserve">undefined (undefined)</w:t>
             </w:r>
             <w:r>
@@ -1962,86 +2290,223 @@
                 <w:szCs w:val="21"/>
                 <w:lang w:val="bg-BG" w:eastAsia="bg-BG"/>
               </w:rPr>
-              <w:t>, по к</w:t>
-            </w:r>
-            <w:r>
-              <w:rPr>
-                <w:rFonts w:ascii="Georgia" w:eastAsia="Calibri" w:hAnsi="Georgia"/>
-                <w:sz w:val="21"/>
-                <w:szCs w:val="21"/>
-                <w:lang w:val="bg-BG" w:eastAsia="bg-BG"/>
-              </w:rPr>
-              <w:t xml:space="preserve">адастралната карта и кадастралните регистри </w:t>
-            </w:r>
-            <w:r>
-              <w:rPr>
-                <w:rFonts w:ascii="Georgia" w:eastAsia="Calibri" w:hAnsi="Georgia"/>
-                <w:sz w:val="21"/>
-                <w:szCs w:val="21"/>
-                <w:lang w:val="bg-BG" w:eastAsia="bg-BG"/>
-              </w:rPr>
-              <w:t xml:space="preserve">на гр. </w:t>
-            </w:r>
-            <w:r>
-              <w:rPr>
-                <w:rFonts w:ascii="Georgia" w:eastAsia="Calibri" w:hAnsi="Georgia"/>
-                <w:b/>
-                <w:sz w:val="21"/>
-                <w:szCs w:val="21"/>
-                <w:lang w:val="bg-BG" w:eastAsia="bg-BG"/>
-              </w:rPr>
-              <w:t>София</w:t>
-            </w:r>
-            <w:r>
-              <w:rPr>
-                <w:rFonts w:ascii="Georgia" w:eastAsia="Calibri" w:hAnsi="Georgia"/>
-                <w:sz w:val="21"/>
-                <w:szCs w:val="21"/>
-                <w:lang w:val="bg-BG" w:eastAsia="bg-BG"/>
-              </w:rPr>
-              <w:t xml:space="preserve">, община </w:t>
-            </w:r>
-            <w:r>
-              <w:rPr>
-                <w:rFonts w:ascii="Georgia" w:eastAsia="Calibri" w:hAnsi="Georgia"/>
-                <w:b/>
-                <w:sz w:val="21"/>
-                <w:szCs w:val="21"/>
-                <w:lang w:val="bg-BG" w:eastAsia="bg-BG"/>
-              </w:rPr>
-              <w:t>Столична</w:t>
-            </w:r>
-            <w:r>
-              <w:rPr>
-                <w:rFonts w:ascii="Georgia" w:eastAsia="Calibri" w:hAnsi="Georgia"/>
-                <w:sz w:val="21"/>
-                <w:szCs w:val="21"/>
-                <w:lang w:val="bg-BG" w:eastAsia="bg-BG"/>
-              </w:rPr>
-              <w:t xml:space="preserve">, област </w:t>
-            </w:r>
-            <w:r>
-              <w:rPr>
-                <w:rFonts w:ascii="Georgia" w:eastAsia="Calibri" w:hAnsi="Georgia"/>
-                <w:b/>
-                <w:sz w:val="21"/>
-                <w:szCs w:val="21"/>
-                <w:lang w:val="bg-BG" w:eastAsia="bg-BG"/>
-              </w:rPr>
-              <w:t>София (столица)</w:t>
-            </w:r>
-            <w:r>
-              <w:rPr>
-                <w:rFonts w:ascii="Georgia" w:eastAsia="Calibri" w:hAnsi="Georgia"/>
-                <w:sz w:val="21"/>
-                <w:szCs w:val="21"/>
-                <w:lang w:val="bg-BG" w:eastAsia="bg-BG"/>
-              </w:rPr>
-              <w:t>, одобрен</w:t>
-            </w:r>
-            <w:r>
-              <w:rPr>
-                <w:rFonts w:ascii="Georgia" w:eastAsia="Calibri" w:hAnsi="Georgia"/>
+              <w:t xml:space="preserve">, </w:t>
+            </w:r>
+            <w:r>
+              <w:rPr>
+                <w:rFonts w:ascii="Georgia" w:eastAsia="Calibri" w:hAnsi="Georgia"/>
+                <w:sz w:val="21"/>
+                <w:szCs w:val="21"/>
+                <w:lang w:val="bg-BG" w:eastAsia="bg-BG"/>
+              </w:rPr>
+              <w:t xml:space="preserve">сградата е </w:t>
+            </w:r>
+            <w:r>
+              <w:rPr>
+                <w:rFonts w:ascii="Georgia" w:eastAsia="Calibri" w:hAnsi="Georgia"/>
+                <w:sz w:val="21"/>
+                <w:szCs w:val="21"/>
+                <w:lang w:val="bg-BG" w:eastAsia="bg-BG"/>
+              </w:rPr>
+              <w:t xml:space="preserve">разположена в поземлен имот с идентификатор </w:t>
+            </w:r>
+            <w:r>
+              <w:rPr>
+                <w:rFonts w:ascii="Georgia" w:eastAsia="Calibri" w:hAnsi="Georgia"/>
+                <w:b/>
+                <w:sz w:val="21"/>
+                <w:szCs w:val="21"/>
+                <w:lang w:eastAsia="bg-BG"/>
+              </w:rPr>
+              <w:t xml:space="preserve">68134.107.198 (undefined)</w:t>
+            </w:r>
+            <w:r>
+              <w:rPr>
+                <w:rFonts w:ascii="Georgia" w:eastAsia="Calibri" w:hAnsi="Georgia"/>
+                <w:sz w:val="21"/>
+                <w:szCs w:val="21"/>
+                <w:lang w:val="bg-BG" w:eastAsia="bg-BG"/>
+              </w:rPr>
+              <w:t xml:space="preserve">, с предназначение на самостоятелния обект – </w:t>
+            </w:r>
+            <w:r>
+              <w:rPr>
+                <w:rFonts w:ascii="Georgia" w:eastAsia="Calibri" w:hAnsi="Georgia"/>
+                <w:b/>
+                <w:sz w:val="21"/>
+                <w:szCs w:val="21"/>
+                <w:lang w:val="bg-BG" w:eastAsia="bg-BG"/>
+              </w:rPr>
+              <w:t>Ж</w:t>
+            </w:r>
+            <w:r>
+              <w:rPr>
+                <w:rFonts w:ascii="Georgia" w:eastAsia="Calibri" w:hAnsi="Georgia"/>
+                <w:b/>
+                <w:sz w:val="21"/>
+                <w:szCs w:val="21"/>
+                <w:lang w:val="bg-BG" w:eastAsia="bg-BG"/>
+              </w:rPr>
+              <w:t xml:space="preserve">илище, апартамент – </w:t>
+            </w:r>
+            <w:r>
+              <w:rPr>
+                <w:rFonts w:ascii="Georgia" w:eastAsia="Calibri" w:hAnsi="Georgia"/>
+                <w:b/>
+                <w:sz w:val="21"/>
+                <w:szCs w:val="21"/>
+                <w:lang w:val="bg-BG" w:eastAsia="bg-BG"/>
+              </w:rPr>
+              <w:t>в жилищна или вилна сграда</w:t>
+            </w:r>
+            <w:r>
+              <w:rPr>
+                <w:rFonts w:ascii="Georgia" w:eastAsia="Calibri" w:hAnsi="Georgia"/>
+                <w:b/>
+                <w:sz w:val="21"/>
+                <w:szCs w:val="21"/>
+                <w:lang w:val="bg-BG" w:eastAsia="bg-BG"/>
+              </w:rPr>
+              <w:t>, или в сграда</w:t>
+            </w:r>
+            <w:r>
+              <w:rPr>
+                <w:rFonts w:ascii="Georgia" w:eastAsia="Calibri" w:hAnsi="Georgia"/>
+                <w:b/>
+                <w:sz w:val="21"/>
+                <w:szCs w:val="21"/>
+                <w:lang w:val="bg-BG" w:eastAsia="bg-BG"/>
+              </w:rPr>
+              <w:t xml:space="preserve"> със смесено предназначение</w:t>
+            </w:r>
+            <w:r>
+              <w:rPr>
+                <w:rFonts w:ascii="Georgia" w:eastAsia="Calibri" w:hAnsi="Georgia"/>
+                <w:sz w:val="21"/>
+                <w:szCs w:val="21"/>
+                <w:lang w:val="bg-BG" w:eastAsia="bg-BG"/>
+              </w:rPr>
+              <w:t xml:space="preserve">, брой нива на обекта: </w:t>
+            </w:r>
+            <w:r>
+              <w:rPr>
+                <w:rFonts w:ascii="Georgia" w:eastAsia="Calibri" w:hAnsi="Georgia"/>
+                <w:b/>
+                <w:sz w:val="21"/>
+                <w:szCs w:val="21"/>
+                <w:lang w:val="bg-BG" w:eastAsia="bg-BG"/>
+              </w:rPr>
+              <w:t xml:space="preserve">undefined (undefined)</w:t>
+            </w:r>
+            <w:r>
+              <w:rPr>
+                <w:rFonts w:ascii="Georgia" w:eastAsia="Calibri" w:hAnsi="Georgia"/>
+                <w:sz w:val="21"/>
+                <w:szCs w:val="21"/>
+                <w:lang w:val="bg-BG" w:eastAsia="bg-BG"/>
+              </w:rPr>
+              <w:t xml:space="preserve">, площ на самостоятелния обект – </w:t>
+            </w:r>
+            <w:r>
+              <w:rPr>
+                <w:rFonts w:ascii="Georgia" w:eastAsia="Calibri" w:hAnsi="Georgia"/>
+                <w:b/>
+                <w:sz w:val="21"/>
+                <w:szCs w:val="21"/>
+                <w:lang w:eastAsia="bg-BG"/>
+              </w:rPr>
+              <w:t xml:space="preserve">80.00 кв.м. (undefined квадратни метра)</w:t>
+            </w:r>
+            <w:r>
+              <w:rPr>
+                <w:rFonts w:ascii="Georgia" w:eastAsia="Calibri" w:hAnsi="Georgia"/>
+                <w:sz w:val="21"/>
+                <w:szCs w:val="21"/>
+                <w:lang w:val="bg-BG" w:eastAsia="bg-BG"/>
+              </w:rPr>
+              <w:t>,</w:t>
+            </w:r>
+            <w:r>
+              <w:rPr>
+                <w:rFonts w:ascii="Georgia" w:eastAsia="Calibri" w:hAnsi="Georgia"/>
+                <w:sz w:val="21"/>
+                <w:szCs w:val="21"/>
+                <w:lang w:val="bg-BG" w:eastAsia="bg-BG"/>
+              </w:rPr>
+              <w:t xml:space="preserve"> и прилежащи части</w:t>
+            </w:r>
+            <w:r>
+              <w:rPr>
+                <w:rFonts w:ascii="Georgia" w:eastAsia="Calibri" w:hAnsi="Georgia"/>
+                <w:sz w:val="21"/>
+                <w:szCs w:val="21"/>
+                <w:lang w:val="bg-BG" w:eastAsia="bg-BG"/>
+              </w:rPr>
+              <w:t>:</w:t>
+            </w:r>
+            <w:r>
+              <w:rPr>
+                <w:rFonts w:ascii="Georgia" w:eastAsia="Calibri" w:hAnsi="Georgia"/>
+                <w:sz w:val="21"/>
+                <w:szCs w:val="21"/>
+                <w:lang w:val="bg-BG" w:eastAsia="bg-BG"/>
+              </w:rPr>
+              <w:t xml:space="preserve"> </w:t>
+            </w:r>
+            <w:r>
+              <w:rPr>
+                <w:rFonts w:ascii="Georgia" w:eastAsia="Calibri" w:hAnsi="Georgia"/>
+                <w:b/>
+                <w:sz w:val="21"/>
+                <w:szCs w:val="21"/>
+                <w:lang w:val="bg-BG" w:eastAsia="bg-BG"/>
+              </w:rPr>
+              <w:t>таван</w:t>
+            </w:r>
+            <w:r>
+              <w:rPr>
+                <w:rFonts w:ascii="Georgia" w:eastAsia="Calibri" w:hAnsi="Georgia"/>
+                <w:b/>
+                <w:sz w:val="21"/>
+                <w:szCs w:val="21"/>
+                <w:lang w:val="bg-BG" w:eastAsia="bg-BG"/>
+              </w:rPr>
+              <w:t xml:space="preserve"> </w:t>
+            </w:r>
+            <w:r>
+              <w:rPr>
+                <w:rFonts w:ascii="Georgia" w:eastAsia="Calibri" w:hAnsi="Georgia"/>
+                <w:b/>
+                <w:sz w:val="21"/>
+                <w:szCs w:val="21"/>
+                <w:lang w:eastAsia="bg-BG"/>
+              </w:rPr>
+              <w:t xml:space="preserve">6 (undefined)</w:t>
+            </w:r>
+            <w:r>
+              <w:rPr>
+                <w:rFonts w:ascii="Georgia" w:eastAsia="Calibri" w:hAnsi="Georgia"/>
+                <w:b/>
+                <w:sz w:val="21"/>
+                <w:szCs w:val="21"/>
+                <w:lang w:val="bg-BG" w:eastAsia="bg-BG"/>
+              </w:rPr>
+              <w:t>,</w:t>
+            </w:r>
+            <w:r>
+              <w:rPr>
+                <w:rFonts w:ascii="Georgia" w:eastAsia="Calibri" w:hAnsi="Georgia"/>
+                <w:b/>
+                <w:sz w:val="21"/>
+                <w:szCs w:val="21"/>
+                <w:lang w:val="bg-BG" w:eastAsia="bg-BG"/>
+              </w:rPr>
+              <w:t xml:space="preserve"> </w:t>
+            </w:r>
+            <w:r>
+              <w:rPr>
+                <w:rFonts w:ascii="Georgia" w:eastAsia="Calibri" w:hAnsi="Georgia"/>
+                <w:b/>
                 <w:sz w:val="21"/>
                 <w:szCs w:val="21"/>
                 <w:lang w:val="bg-BG" w:eastAsia="bg-BG"/>
@@ -2051,26 +2516,121 @@
             <w:r>
               <w:rPr>
                 <w:rFonts w:ascii="Georgia" w:eastAsia="Calibri" w:hAnsi="Georgia"/>
-                <w:sz w:val="21"/>
-                <w:szCs w:val="21"/>
-                <w:lang w:val="bg-BG" w:eastAsia="bg-BG"/>
-              </w:rPr>
-              <w:t xml:space="preserve"> със </w:t>
-            </w:r>
-            <w:r>
-              <w:rPr>
-                <w:rFonts w:ascii="Georgia" w:eastAsia="Calibri" w:hAnsi="Georgia"/>
-                <w:b/>
-                <w:sz w:val="21"/>
-                <w:szCs w:val="21"/>
-                <w:lang w:val="bg-BG" w:eastAsia="bg-BG"/>
-              </w:rPr>
-              <w:t>Заповед № РД-18-33 от 15.06.2010</w:t>
-            </w:r>
-            <w:r>
-              <w:rPr>
-                <w:rFonts w:ascii="Georgia" w:eastAsia="Calibri" w:hAnsi="Georgia"/>
-                <w:b/>
+                <w:b/>
+                <w:sz w:val="21"/>
+                <w:szCs w:val="21"/>
+                <w:lang w:val="bg-BG" w:eastAsia="bg-BG"/>
+              </w:rPr>
+              <w:t xml:space="preserve">зба </w:t>
+            </w:r>
+            <w:r>
+              <w:rPr>
+                <w:rFonts w:ascii="Georgia" w:eastAsia="Calibri" w:hAnsi="Georgia"/>
+                <w:b/>
+                <w:sz w:val="21"/>
+                <w:szCs w:val="21"/>
+                <w:lang w:eastAsia="bg-BG"/>
+              </w:rPr>
+              <w:t xml:space="preserve">6 (undefined)</w:t>
+            </w:r>
+            <w:r>
+              <w:rPr>
+                <w:rFonts w:ascii="Georgia" w:eastAsia="Calibri" w:hAnsi="Georgia"/>
+                <w:b/>
+                <w:sz w:val="21"/>
+                <w:szCs w:val="21"/>
+                <w:lang w:val="bg-BG" w:eastAsia="bg-BG"/>
+              </w:rPr>
+              <w:t xml:space="preserve"> и </w:t>
+            </w:r>
+            <w:r>
+              <w:rPr>
+                <w:rFonts w:ascii="Georgia" w:eastAsia="Calibri" w:hAnsi="Georgia"/>
+                <w:b/>
+                <w:sz w:val="21"/>
+                <w:szCs w:val="21"/>
+                <w:lang w:val="bg-BG" w:eastAsia="bg-BG"/>
+              </w:rPr>
+              <w:t xml:space="preserve">12,51 % (undefined)</w:t>
+            </w:r>
+            <w:r>
+              <w:rPr>
+                <w:rFonts w:ascii="Georgia" w:eastAsia="Calibri" w:hAnsi="Georgia"/>
+                <w:b/>
+                <w:sz w:val="21"/>
+                <w:szCs w:val="21"/>
+                <w:lang w:val="bg-BG" w:eastAsia="bg-BG"/>
+              </w:rPr>
+              <w:t xml:space="preserve"> идеални части от общите части на сградата</w:t>
+            </w:r>
+            <w:r>
+              <w:rPr>
+                <w:rFonts w:ascii="Georgia" w:eastAsia="Calibri" w:hAnsi="Georgia"/>
+                <w:sz w:val="21"/>
+                <w:szCs w:val="21"/>
+                <w:lang w:val="bg-BG" w:eastAsia="bg-BG"/>
+              </w:rPr>
+              <w:t xml:space="preserve">, </w:t>
+            </w:r>
+            <w:r>
+              <w:rPr>
+                <w:rFonts w:ascii="Georgia" w:eastAsia="Calibri" w:hAnsi="Georgia"/>
+                <w:sz w:val="21"/>
+                <w:szCs w:val="21"/>
+                <w:lang w:val="bg-BG" w:eastAsia="bg-BG"/>
+              </w:rPr>
+              <w:t xml:space="preserve">ниво: </w:t>
+            </w:r>
+            <w:r>
+              <w:rPr>
+                <w:rFonts w:ascii="Georgia" w:eastAsia="Calibri" w:hAnsi="Georgia"/>
+                <w:sz w:val="21"/>
+                <w:szCs w:val="21"/>
+                <w:lang w:val="bg-BG" w:eastAsia="bg-BG"/>
+              </w:rPr>
+              <w:t xml:space="preserve">undefined (undefined)</w:t>
+            </w:r>
+            <w:r>
+              <w:rPr>
+                <w:rFonts w:ascii="Georgia" w:eastAsia="Calibri" w:hAnsi="Georgia"/>
+                <w:sz w:val="21"/>
+                <w:szCs w:val="21"/>
+                <w:lang w:val="bg-BG" w:eastAsia="bg-BG"/>
+              </w:rPr>
+              <w:t xml:space="preserve">, </w:t>
+            </w:r>
+            <w:r>
+              <w:rPr>
+                <w:rFonts w:ascii="Georgia" w:eastAsia="Calibri" w:hAnsi="Georgia"/>
+                <w:sz w:val="21"/>
+                <w:szCs w:val="21"/>
+                <w:lang w:val="bg-BG" w:eastAsia="bg-BG"/>
+              </w:rPr>
+              <w:t xml:space="preserve">при съседи на самостоятелния обект: на същия етаж – </w:t>
+            </w:r>
+            <w:r>
+              <w:rPr>
+                <w:rFonts w:ascii="Georgia" w:eastAsia="Calibri" w:hAnsi="Georgia"/>
+                <w:b/>
+                <w:sz w:val="21"/>
+                <w:szCs w:val="21"/>
+                <w:lang w:val="bg-BG" w:eastAsia="bg-BG"/>
+              </w:rPr>
+              <w:t xml:space="preserve">самостоятелен обект с идентификатор </w:t>
+            </w:r>
+            <w:r>
+              <w:rPr>
+                <w:rFonts w:ascii="Georgia" w:eastAsia="Calibri" w:hAnsi="Georgia"/>
+                <w:b/>
+                <w:sz w:val="21"/>
+                <w:szCs w:val="21"/>
+                <w:lang w:eastAsia="bg-BG"/>
+              </w:rPr>
+              <w:t xml:space="preserve">68134.107.198.1.5</w:t>
+            </w:r>
+            <w:r>
+              <w:rPr>
+                <w:rFonts w:ascii="Georgia" w:eastAsia="Calibri" w:hAnsi="Georgia"/>
                 <w:sz w:val="21"/>
                 <w:szCs w:val="21"/>
                 <w:lang w:val="bg-BG" w:eastAsia="bg-BG"/>
@@ -2083,83 +2643,9 @@
                 <w:b/>
                 <w:sz w:val="21"/>
                 <w:szCs w:val="21"/>
-                <w:lang w:val="bg-BG" w:eastAsia="bg-BG"/>
-              </w:rPr>
-              <w:t>г. на Изпълнителния директор на АГКК</w:t>
-            </w:r>
-            <w:r>
-              <w:rPr>
-                <w:rFonts w:ascii="Georgia" w:eastAsia="Calibri" w:hAnsi="Georgia"/>
-                <w:sz w:val="21"/>
-                <w:szCs w:val="21"/>
-                <w:lang w:val="bg-BG" w:eastAsia="bg-BG"/>
-              </w:rPr>
-              <w:t xml:space="preserve">, последно изменение на кадастралната карта и кадастралните регистри, засягащо </w:t>
-            </w:r>
-            <w:r>
-              <w:rPr>
-                <w:rFonts w:ascii="Georgia" w:eastAsia="Calibri" w:hAnsi="Georgia"/>
-                <w:sz w:val="21"/>
-                <w:szCs w:val="21"/>
-                <w:lang w:val="bg-BG" w:eastAsia="bg-BG"/>
-              </w:rPr>
-              <w:t>самостоятел</w:t>
-            </w:r>
-            <w:r>
-              <w:rPr>
-                <w:rFonts w:ascii="Georgia" w:eastAsia="Calibri" w:hAnsi="Georgia"/>
-                <w:sz w:val="21"/>
-                <w:szCs w:val="21"/>
-                <w:lang w:val="bg-BG" w:eastAsia="bg-BG"/>
-              </w:rPr>
-              <w:t>ния</w:t>
-            </w:r>
-            <w:r>
-              <w:rPr>
-                <w:rFonts w:ascii="Georgia" w:eastAsia="Calibri" w:hAnsi="Georgia"/>
-                <w:sz w:val="21"/>
-                <w:szCs w:val="21"/>
-                <w:lang w:val="bg-BG" w:eastAsia="bg-BG"/>
-              </w:rPr>
-              <w:t xml:space="preserve"> обект</w:t>
-            </w:r>
-            <w:r>
-              <w:rPr>
-                <w:rFonts w:ascii="Georgia" w:eastAsia="Calibri" w:hAnsi="Georgia"/>
-                <w:sz w:val="21"/>
-                <w:szCs w:val="21"/>
-                <w:lang w:val="bg-BG" w:eastAsia="bg-BG"/>
-              </w:rPr>
-              <w:t xml:space="preserve">: </w:t>
-            </w:r>
-            <w:r>
-              <w:rPr>
-                <w:rFonts w:ascii="Georgia" w:eastAsia="Calibri" w:hAnsi="Georgia"/>
-                <w:b/>
-                <w:sz w:val="21"/>
-                <w:szCs w:val="21"/>
-                <w:lang w:val="bg-BG" w:eastAsia="bg-BG"/>
-              </w:rPr>
-              <w:t>няма извършено изменение на КККР със заповед</w:t>
-            </w:r>
-            <w:r>
-              <w:rPr>
-                <w:rFonts w:ascii="Georgia" w:eastAsia="Calibri" w:hAnsi="Georgia"/>
-                <w:sz w:val="21"/>
-                <w:szCs w:val="21"/>
-                <w:lang w:val="bg-BG" w:eastAsia="bg-BG"/>
-              </w:rPr>
-              <w:t xml:space="preserve">, с адрес на самостоятелния обект: </w:t>
-            </w:r>
-            <w:r>
-              <w:rPr>
-                <w:rFonts w:ascii="Georgia" w:eastAsia="Calibri" w:hAnsi="Georgia"/>
-                <w:b/>
-                <w:sz w:val="21"/>
-                <w:szCs w:val="21"/>
-                <w:lang w:val="bg-BG" w:eastAsia="bg-BG"/>
-              </w:rPr>
-              <w:t xml:space="preserve">undefined</w:t>
+                <w:lang w:eastAsia="bg-BG"/>
+              </w:rPr>
+              <w:t xml:space="preserve">(undefined)</w:t>
             </w:r>
             <w:r>
               <w:rPr>
@@ -2177,39 +2663,32 @@
                 <w:szCs w:val="21"/>
                 <w:lang w:val="bg-BG" w:eastAsia="bg-BG"/>
               </w:rPr>
-              <w:t xml:space="preserve"> самостоятелния</w:t>
-            </w:r>
-            <w:r>
-              <w:rPr>
-                <w:rFonts w:ascii="Georgia" w:eastAsia="Calibri" w:hAnsi="Georgia"/>
-                <w:sz w:val="21"/>
-                <w:szCs w:val="21"/>
-                <w:lang w:val="bg-BG" w:eastAsia="bg-BG"/>
-              </w:rPr>
-              <w:t>т</w:t>
-            </w:r>
-            <w:r>
-              <w:rPr>
-                <w:rFonts w:ascii="Georgia" w:eastAsia="Calibri" w:hAnsi="Georgia"/>
-                <w:sz w:val="21"/>
-                <w:szCs w:val="21"/>
-                <w:lang w:val="bg-BG" w:eastAsia="bg-BG"/>
-              </w:rPr>
-              <w:t xml:space="preserve"> обект се намира на етаж </w:t>
-            </w:r>
-            <w:r>
-              <w:rPr>
-                <w:rFonts w:ascii="Georgia" w:eastAsia="Calibri" w:hAnsi="Georgia"/>
-                <w:b/>
-                <w:sz w:val="21"/>
-                <w:szCs w:val="21"/>
-                <w:lang w:eastAsia="bg-BG"/>
-              </w:rPr>
-              <w:t xml:space="preserve">undefined (undefined)</w:t>
-            </w:r>
-            <w:r>
-              <w:rPr>
-                <w:rFonts w:ascii="Georgia" w:eastAsia="Calibri" w:hAnsi="Georgia"/>
+              <w:t xml:space="preserve"> под обекта – </w:t>
+            </w:r>
+            <w:r>
+              <w:rPr>
+                <w:rFonts w:ascii="Georgia" w:eastAsia="Calibri" w:hAnsi="Georgia"/>
+                <w:b/>
+                <w:sz w:val="21"/>
+                <w:szCs w:val="21"/>
+                <w:lang w:val="bg-BG" w:eastAsia="bg-BG"/>
+              </w:rPr>
+              <w:t xml:space="preserve">самостоятелен обект с идентификатор </w:t>
+            </w:r>
+            <w:r>
+              <w:rPr>
+                <w:rFonts w:ascii="Georgia" w:eastAsia="Calibri" w:hAnsi="Georgia"/>
+                <w:b/>
+                <w:sz w:val="21"/>
+                <w:szCs w:val="21"/>
+                <w:lang w:eastAsia="bg-BG"/>
+              </w:rPr>
+              <w:t xml:space="preserve">68134.107.198.1.4</w:t>
+            </w:r>
+            <w:r>
+              <w:rPr>
+                <w:rFonts w:ascii="Georgia" w:eastAsia="Calibri" w:hAnsi="Georgia"/>
+                <w:b/>
                 <w:sz w:val="21"/>
                 <w:szCs w:val="21"/>
                 <w:lang w:val="bg-BG" w:eastAsia="bg-BG"/>
@@ -2219,394 +2698,21 @@
             <w:r>
               <w:rPr>
                 <w:rFonts w:ascii="Georgia" w:eastAsia="Calibri" w:hAnsi="Georgia"/>
-                <w:sz w:val="21"/>
-                <w:szCs w:val="21"/>
-                <w:lang w:val="bg-BG" w:eastAsia="bg-BG"/>
-              </w:rPr>
-              <w:t xml:space="preserve">в сграда с идентификатор </w:t>
-            </w:r>
-            <w:r>
-              <w:rPr>
-                <w:rFonts w:ascii="Georgia" w:eastAsia="Calibri" w:hAnsi="Georgia"/>
-                <w:b/>
-                <w:sz w:val="21"/>
-                <w:szCs w:val="21"/>
-                <w:lang w:eastAsia="bg-BG"/>
-              </w:rPr>
-              <w:t xml:space="preserve">undefined (undefined)</w:t>
-            </w:r>
-            <w:r>
-              <w:rPr>
-                <w:rFonts w:ascii="Georgia" w:eastAsia="Calibri" w:hAnsi="Georgia"/>
-                <w:sz w:val="21"/>
-                <w:szCs w:val="21"/>
-                <w:lang w:val="bg-BG" w:eastAsia="bg-BG"/>
-              </w:rPr>
-              <w:t xml:space="preserve">, с предназначение: </w:t>
-            </w:r>
-            <w:r>
-              <w:rPr>
-                <w:rFonts w:ascii="Georgia" w:eastAsia="Calibri" w:hAnsi="Georgia"/>
-                <w:b/>
-                <w:sz w:val="21"/>
-                <w:szCs w:val="21"/>
-                <w:lang w:val="bg-BG" w:eastAsia="bg-BG"/>
-              </w:rPr>
-              <w:t>Ж</w:t>
-            </w:r>
-            <w:r>
-              <w:rPr>
-                <w:rFonts w:ascii="Georgia" w:eastAsia="Calibri" w:hAnsi="Georgia"/>
-                <w:b/>
-                <w:sz w:val="21"/>
-                <w:szCs w:val="21"/>
-                <w:lang w:val="bg-BG" w:eastAsia="bg-BG"/>
-              </w:rPr>
-              <w:t>илищна сграда – многофамилна</w:t>
-            </w:r>
-            <w:r>
-              <w:rPr>
-                <w:rFonts w:ascii="Georgia" w:eastAsia="Calibri" w:hAnsi="Georgia"/>
-                <w:sz w:val="21"/>
-                <w:szCs w:val="21"/>
-                <w:lang w:val="bg-BG" w:eastAsia="bg-BG"/>
-              </w:rPr>
-              <w:t xml:space="preserve">, брой етажи – </w:t>
-            </w:r>
-            <w:r>
-              <w:rPr>
-                <w:rFonts w:ascii="Georgia" w:eastAsia="Calibri" w:hAnsi="Georgia"/>
-                <w:b/>
-                <w:sz w:val="21"/>
-                <w:szCs w:val="21"/>
-                <w:lang w:eastAsia="bg-BG"/>
-              </w:rPr>
-              <w:t xml:space="preserve">undefined (undefined)</w:t>
-            </w:r>
-            <w:r>
-              <w:rPr>
-                <w:rFonts w:ascii="Georgia" w:eastAsia="Calibri" w:hAnsi="Georgia"/>
-                <w:sz w:val="21"/>
-                <w:szCs w:val="21"/>
-                <w:lang w:val="bg-BG" w:eastAsia="bg-BG"/>
-              </w:rPr>
-              <w:t xml:space="preserve">, </w:t>
-            </w:r>
-            <w:r>
-              <w:rPr>
-                <w:rFonts w:ascii="Georgia" w:eastAsia="Calibri" w:hAnsi="Georgia"/>
-                <w:sz w:val="21"/>
-                <w:szCs w:val="21"/>
-                <w:lang w:val="bg-BG" w:eastAsia="bg-BG"/>
-              </w:rPr>
-              <w:t xml:space="preserve">сградата е </w:t>
-            </w:r>
-            <w:r>
-              <w:rPr>
-                <w:rFonts w:ascii="Georgia" w:eastAsia="Calibri" w:hAnsi="Georgia"/>
-                <w:sz w:val="21"/>
-                <w:szCs w:val="21"/>
-                <w:lang w:val="bg-BG" w:eastAsia="bg-BG"/>
-              </w:rPr>
-              <w:t xml:space="preserve">разположена в поземлен имот с идентификатор </w:t>
-            </w:r>
-            <w:r>
-              <w:rPr>
-                <w:rFonts w:ascii="Georgia" w:eastAsia="Calibri" w:hAnsi="Georgia"/>
-                <w:b/>
-                <w:sz w:val="21"/>
-                <w:szCs w:val="21"/>
-                <w:lang w:eastAsia="bg-BG"/>
-              </w:rPr>
-              <w:t xml:space="preserve">undefined (undefined)</w:t>
-            </w:r>
-            <w:r>
-              <w:rPr>
-                <w:rFonts w:ascii="Georgia" w:eastAsia="Calibri" w:hAnsi="Georgia"/>
-                <w:sz w:val="21"/>
-                <w:szCs w:val="21"/>
-                <w:lang w:val="bg-BG" w:eastAsia="bg-BG"/>
-              </w:rPr>
-              <w:t xml:space="preserve">, с предназначение на самостоятелния обект – </w:t>
-            </w:r>
-            <w:r>
-              <w:rPr>
-                <w:rFonts w:ascii="Georgia" w:eastAsia="Calibri" w:hAnsi="Georgia"/>
-                <w:b/>
-                <w:sz w:val="21"/>
-                <w:szCs w:val="21"/>
-                <w:lang w:val="bg-BG" w:eastAsia="bg-BG"/>
-              </w:rPr>
-              <w:t>Ж</w:t>
-            </w:r>
-            <w:r>
-              <w:rPr>
-                <w:rFonts w:ascii="Georgia" w:eastAsia="Calibri" w:hAnsi="Georgia"/>
-                <w:b/>
-                <w:sz w:val="21"/>
-                <w:szCs w:val="21"/>
-                <w:lang w:val="bg-BG" w:eastAsia="bg-BG"/>
-              </w:rPr>
-              <w:t xml:space="preserve">илище, апартамент – </w:t>
-            </w:r>
-            <w:r>
-              <w:rPr>
-                <w:rFonts w:ascii="Georgia" w:eastAsia="Calibri" w:hAnsi="Georgia"/>
-                <w:b/>
-                <w:sz w:val="21"/>
-                <w:szCs w:val="21"/>
-                <w:lang w:val="bg-BG" w:eastAsia="bg-BG"/>
-              </w:rPr>
-              <w:t>в жилищна или вилна сграда</w:t>
-            </w:r>
-            <w:r>
-              <w:rPr>
-                <w:rFonts w:ascii="Georgia" w:eastAsia="Calibri" w:hAnsi="Georgia"/>
-                <w:b/>
-                <w:sz w:val="21"/>
-                <w:szCs w:val="21"/>
-                <w:lang w:val="bg-BG" w:eastAsia="bg-BG"/>
-              </w:rPr>
-              <w:t>, или в сграда</w:t>
-            </w:r>
-            <w:r>
-              <w:rPr>
-                <w:rFonts w:ascii="Georgia" w:eastAsia="Calibri" w:hAnsi="Georgia"/>
-                <w:b/>
-                <w:sz w:val="21"/>
-                <w:szCs w:val="21"/>
-                <w:lang w:val="bg-BG" w:eastAsia="bg-BG"/>
-              </w:rPr>
-              <w:t xml:space="preserve"> със смесено предназначение</w:t>
-            </w:r>
-            <w:r>
-              <w:rPr>
-                <w:rFonts w:ascii="Georgia" w:eastAsia="Calibri" w:hAnsi="Georgia"/>
-                <w:sz w:val="21"/>
-                <w:szCs w:val="21"/>
-                <w:lang w:val="bg-BG" w:eastAsia="bg-BG"/>
-              </w:rPr>
-              <w:t xml:space="preserve">, брой нива на обекта: </w:t>
-            </w:r>
-            <w:r>
-              <w:rPr>
-                <w:rFonts w:ascii="Georgia" w:eastAsia="Calibri" w:hAnsi="Georgia"/>
-                <w:b/>
-                <w:sz w:val="21"/>
-                <w:szCs w:val="21"/>
-                <w:lang w:val="bg-BG" w:eastAsia="bg-BG"/>
-              </w:rPr>
-              <w:t xml:space="preserve">undefined (undefined)</w:t>
-            </w:r>
-            <w:r>
-              <w:rPr>
-                <w:rFonts w:ascii="Georgia" w:eastAsia="Calibri" w:hAnsi="Georgia"/>
-                <w:sz w:val="21"/>
-                <w:szCs w:val="21"/>
-                <w:lang w:val="bg-BG" w:eastAsia="bg-BG"/>
-              </w:rPr>
-              <w:t xml:space="preserve">, площ на самостоятелния обект – </w:t>
-            </w:r>
-            <w:r>
-              <w:rPr>
-                <w:rFonts w:ascii="Georgia" w:eastAsia="Calibri" w:hAnsi="Georgia"/>
-                <w:b/>
-                <w:sz w:val="21"/>
-                <w:szCs w:val="21"/>
-                <w:lang w:eastAsia="bg-BG"/>
-              </w:rPr>
-              <w:t xml:space="preserve">undefined кв.м. (undefined квадратни метра)</w:t>
-            </w:r>
-            <w:r>
-              <w:rPr>
-                <w:rFonts w:ascii="Georgia" w:eastAsia="Calibri" w:hAnsi="Georgia"/>
-                <w:sz w:val="21"/>
-                <w:szCs w:val="21"/>
-                <w:lang w:val="bg-BG" w:eastAsia="bg-BG"/>
-              </w:rPr>
-              <w:t>,</w:t>
-            </w:r>
-            <w:r>
-              <w:rPr>
-                <w:rFonts w:ascii="Georgia" w:eastAsia="Calibri" w:hAnsi="Georgia"/>
-                <w:sz w:val="21"/>
-                <w:szCs w:val="21"/>
-                <w:lang w:val="bg-BG" w:eastAsia="bg-BG"/>
-              </w:rPr>
-              <w:t xml:space="preserve"> и прилежащи части</w:t>
-            </w:r>
-            <w:r>
-              <w:rPr>
-                <w:rFonts w:ascii="Georgia" w:eastAsia="Calibri" w:hAnsi="Georgia"/>
-                <w:sz w:val="21"/>
-                <w:szCs w:val="21"/>
-                <w:lang w:val="bg-BG" w:eastAsia="bg-BG"/>
-              </w:rPr>
-              <w:t>:</w:t>
-            </w:r>
-            <w:r>
-              <w:rPr>
-                <w:rFonts w:ascii="Georgia" w:eastAsia="Calibri" w:hAnsi="Georgia"/>
-                <w:sz w:val="21"/>
-                <w:szCs w:val="21"/>
-                <w:lang w:val="bg-BG" w:eastAsia="bg-BG"/>
-              </w:rPr>
-              <w:t xml:space="preserve"> </w:t>
-            </w:r>
-            <w:r>
-              <w:rPr>
-                <w:rFonts w:ascii="Georgia" w:eastAsia="Calibri" w:hAnsi="Georgia"/>
-                <w:b/>
-                <w:sz w:val="21"/>
-                <w:szCs w:val="21"/>
-                <w:lang w:val="bg-BG" w:eastAsia="bg-BG"/>
-              </w:rPr>
-              <w:t>таван</w:t>
-            </w:r>
-            <w:r>
-              <w:rPr>
-                <w:rFonts w:ascii="Georgia" w:eastAsia="Calibri" w:hAnsi="Georgia"/>
-                <w:b/>
-                <w:sz w:val="21"/>
-                <w:szCs w:val="21"/>
-                <w:lang w:val="bg-BG" w:eastAsia="bg-BG"/>
-              </w:rPr>
-              <w:t xml:space="preserve"> </w:t>
-            </w:r>
-            <w:r>
-              <w:rPr>
-                <w:rFonts w:ascii="Georgia" w:eastAsia="Calibri" w:hAnsi="Georgia"/>
-                <w:b/>
-                <w:sz w:val="21"/>
-                <w:szCs w:val="21"/>
-                <w:lang w:eastAsia="bg-BG"/>
-              </w:rPr>
-              <w:t xml:space="preserve">undefined (undefined)</w:t>
-            </w:r>
-            <w:r>
-              <w:rPr>
-                <w:rFonts w:ascii="Georgia" w:eastAsia="Calibri" w:hAnsi="Georgia"/>
-                <w:b/>
-                <w:sz w:val="21"/>
-                <w:szCs w:val="21"/>
-                <w:lang w:val="bg-BG" w:eastAsia="bg-BG"/>
-              </w:rPr>
-              <w:t>,</w:t>
-            </w:r>
-            <w:r>
-              <w:rPr>
-                <w:rFonts w:ascii="Georgia" w:eastAsia="Calibri" w:hAnsi="Georgia"/>
-                <w:b/>
-                <w:sz w:val="21"/>
-                <w:szCs w:val="21"/>
-                <w:lang w:val="bg-BG" w:eastAsia="bg-BG"/>
-              </w:rPr>
-              <w:t xml:space="preserve"> </w:t>
-            </w:r>
-            <w:r>
-              <w:rPr>
-                <w:rFonts w:ascii="Georgia" w:eastAsia="Calibri" w:hAnsi="Georgia"/>
-                <w:b/>
-                <w:sz w:val="21"/>
-                <w:szCs w:val="21"/>
-                <w:lang w:val="bg-BG" w:eastAsia="bg-BG"/>
-              </w:rPr>
-              <w:t>и</w:t>
-            </w:r>
-            <w:r>
-              <w:rPr>
-                <w:rFonts w:ascii="Georgia" w:eastAsia="Calibri" w:hAnsi="Georgia"/>
-                <w:b/>
-                <w:sz w:val="21"/>
-                <w:szCs w:val="21"/>
-                <w:lang w:val="bg-BG" w:eastAsia="bg-BG"/>
-              </w:rPr>
-              <w:t xml:space="preserve">зба </w:t>
-            </w:r>
-            <w:r>
-              <w:rPr>
-                <w:rFonts w:ascii="Georgia" w:eastAsia="Calibri" w:hAnsi="Georgia"/>
-                <w:b/>
-                <w:sz w:val="21"/>
-                <w:szCs w:val="21"/>
-                <w:lang w:eastAsia="bg-BG"/>
-              </w:rPr>
-              <w:t xml:space="preserve">undefined (undefined)</w:t>
-            </w:r>
-            <w:r>
-              <w:rPr>
-                <w:rFonts w:ascii="Georgia" w:eastAsia="Calibri" w:hAnsi="Georgia"/>
-                <w:b/>
-                <w:sz w:val="21"/>
-                <w:szCs w:val="21"/>
-                <w:lang w:val="bg-BG" w:eastAsia="bg-BG"/>
-              </w:rPr>
-              <w:t xml:space="preserve"> и </w:t>
-            </w:r>
-            <w:r>
-              <w:rPr>
-                <w:rFonts w:ascii="Georgia" w:eastAsia="Calibri" w:hAnsi="Georgia"/>
-                <w:b/>
-                <w:sz w:val="21"/>
-                <w:szCs w:val="21"/>
-                <w:lang w:val="bg-BG" w:eastAsia="bg-BG"/>
-              </w:rPr>
-              <w:t xml:space="preserve">undefined % (undefined)</w:t>
-            </w:r>
-            <w:r>
-              <w:rPr>
-                <w:rFonts w:ascii="Georgia" w:eastAsia="Calibri" w:hAnsi="Georgia"/>
-                <w:b/>
-                <w:sz w:val="21"/>
-                <w:szCs w:val="21"/>
-                <w:lang w:val="bg-BG" w:eastAsia="bg-BG"/>
-              </w:rPr>
-              <w:t xml:space="preserve"> идеални части от общите части на сградата</w:t>
-            </w:r>
-            <w:r>
-              <w:rPr>
-                <w:rFonts w:ascii="Georgia" w:eastAsia="Calibri" w:hAnsi="Georgia"/>
-                <w:sz w:val="21"/>
-                <w:szCs w:val="21"/>
-                <w:lang w:val="bg-BG" w:eastAsia="bg-BG"/>
-              </w:rPr>
-              <w:t xml:space="preserve">, </w:t>
-            </w:r>
-            <w:r>
-              <w:rPr>
-                <w:rFonts w:ascii="Georgia" w:eastAsia="Calibri" w:hAnsi="Georgia"/>
-                <w:sz w:val="21"/>
-                <w:szCs w:val="21"/>
-                <w:lang w:val="bg-BG" w:eastAsia="bg-BG"/>
-              </w:rPr>
-              <w:t xml:space="preserve">ниво: </w:t>
-            </w:r>
-            <w:r>
-              <w:rPr>
-                <w:rFonts w:ascii="Georgia" w:eastAsia="Calibri" w:hAnsi="Georgia"/>
-                <w:sz w:val="21"/>
-                <w:szCs w:val="21"/>
-                <w:lang w:val="bg-BG" w:eastAsia="bg-BG"/>
-              </w:rPr>
-              <w:t xml:space="preserve">undefined (undefined)</w:t>
-            </w:r>
-            <w:r>
-              <w:rPr>
-                <w:rFonts w:ascii="Georgia" w:eastAsia="Calibri" w:hAnsi="Georgia"/>
-                <w:sz w:val="21"/>
-                <w:szCs w:val="21"/>
-                <w:lang w:val="bg-BG" w:eastAsia="bg-BG"/>
-              </w:rPr>
-              <w:t xml:space="preserve">, </w:t>
-            </w:r>
-            <w:r>
-              <w:rPr>
-                <w:rFonts w:ascii="Georgia" w:eastAsia="Calibri" w:hAnsi="Georgia"/>
-                <w:sz w:val="21"/>
-                <w:szCs w:val="21"/>
-                <w:lang w:val="bg-BG" w:eastAsia="bg-BG"/>
-              </w:rPr>
-              <w:t xml:space="preserve">при съседи на самостоятелния обект: на същия етаж – </w:t>
+                <w:b/>
+                <w:sz w:val="21"/>
+                <w:szCs w:val="21"/>
+                <w:lang w:eastAsia="bg-BG"/>
+              </w:rPr>
+              <w:t xml:space="preserve">(undefined)</w:t>
+            </w:r>
+            <w:r>
+              <w:rPr>
+                <w:rFonts w:ascii="Georgia" w:eastAsia="Calibri" w:hAnsi="Georgia"/>
+                <w:sz w:val="21"/>
+                <w:szCs w:val="21"/>
+                <w:lang w:val="bg-BG" w:eastAsia="bg-BG"/>
+              </w:rPr>
+              <w:t xml:space="preserve">, над обекта – </w:t>
             </w:r>
             <w:r>
               <w:rPr>
@@ -2626,113 +2732,7 @@
                 <w:szCs w:val="21"/>
                 <w:lang w:eastAsia="bg-BG"/>
               </w:rPr>
-              <w:t xml:space="preserve">undefined</w:t>
-            </w:r>
-            <w:r>
-              <w:rPr>
-                <w:rFonts w:ascii="Georgia" w:eastAsia="Calibri" w:hAnsi="Georgia"/>
-                <w:sz w:val="21"/>
-                <w:szCs w:val="21"/>
-                <w:lang w:val="bg-BG" w:eastAsia="bg-BG"/>
-              </w:rPr>
-              <w:t xml:space="preserve"> </w:t>
-            </w:r>
-            <w:r>
-              <w:rPr>
-                <w:rFonts w:ascii="Georgia" w:eastAsia="Calibri" w:hAnsi="Georgia"/>
-                <w:b/>
-                <w:sz w:val="21"/>
-                <w:szCs w:val="21"/>
-                <w:lang w:eastAsia="bg-BG"/>
-              </w:rPr>
-              <w:t xml:space="preserve">(undefined)</w:t>
-            </w:r>
-            <w:r>
-              <w:rPr>
-                <w:rFonts w:ascii="Georgia" w:eastAsia="Calibri" w:hAnsi="Georgia"/>
-                <w:sz w:val="21"/>
-                <w:szCs w:val="21"/>
-                <w:lang w:val="bg-BG" w:eastAsia="bg-BG"/>
-              </w:rPr>
-              <w:t>,</w:t>
-            </w:r>
-            <w:r>
-              <w:rPr>
-                <w:rFonts w:ascii="Georgia" w:eastAsia="Calibri" w:hAnsi="Georgia"/>
-                <w:sz w:val="21"/>
-                <w:szCs w:val="21"/>
-                <w:lang w:val="bg-BG" w:eastAsia="bg-BG"/>
-              </w:rPr>
-              <w:t xml:space="preserve"> под обекта – </w:t>
-            </w:r>
-            <w:r>
-              <w:rPr>
-                <w:rFonts w:ascii="Georgia" w:eastAsia="Calibri" w:hAnsi="Georgia"/>
-                <w:b/>
-                <w:sz w:val="21"/>
-                <w:szCs w:val="21"/>
-                <w:lang w:val="bg-BG" w:eastAsia="bg-BG"/>
-              </w:rPr>
-              <w:t xml:space="preserve">самостоятелен обект с идентификатор </w:t>
-            </w:r>
-            <w:r>
-              <w:rPr>
-                <w:rFonts w:ascii="Georgia" w:eastAsia="Calibri" w:hAnsi="Georgia"/>
-                <w:b/>
-                <w:sz w:val="21"/>
-                <w:szCs w:val="21"/>
-                <w:lang w:eastAsia="bg-BG"/>
-              </w:rPr>
-              <w:t xml:space="preserve">undefined</w:t>
-            </w:r>
-            <w:r>
-              <w:rPr>
-                <w:rFonts w:ascii="Georgia" w:eastAsia="Calibri" w:hAnsi="Georgia"/>
-                <w:b/>
-                <w:sz w:val="21"/>
-                <w:szCs w:val="21"/>
-                <w:lang w:val="bg-BG" w:eastAsia="bg-BG"/>
-              </w:rPr>
-              <w:t xml:space="preserve"> </w:t>
-            </w:r>
-            <w:r>
-              <w:rPr>
-                <w:rFonts w:ascii="Georgia" w:eastAsia="Calibri" w:hAnsi="Georgia"/>
-                <w:b/>
-                <w:sz w:val="21"/>
-                <w:szCs w:val="21"/>
-                <w:lang w:eastAsia="bg-BG"/>
-              </w:rPr>
-              <w:t xml:space="preserve">(undefined)</w:t>
-            </w:r>
-            <w:r>
-              <w:rPr>
-                <w:rFonts w:ascii="Georgia" w:eastAsia="Calibri" w:hAnsi="Georgia"/>
-                <w:sz w:val="21"/>
-                <w:szCs w:val="21"/>
-                <w:lang w:val="bg-BG" w:eastAsia="bg-BG"/>
-              </w:rPr>
-              <w:t xml:space="preserve">, над обекта – </w:t>
-            </w:r>
-            <w:r>
-              <w:rPr>
-                <w:rFonts w:ascii="Georgia" w:eastAsia="Calibri" w:hAnsi="Georgia"/>
-                <w:b/>
-                <w:sz w:val="21"/>
-                <w:szCs w:val="21"/>
-                <w:lang w:val="bg-BG" w:eastAsia="bg-BG"/>
-              </w:rPr>
-              <w:t xml:space="preserve">самостоятелен обект с идентификатор </w:t>
-            </w:r>
-            <w:r>
-              <w:rPr>
-                <w:rFonts w:ascii="Georgia" w:eastAsia="Calibri" w:hAnsi="Georgia"/>
-                <w:b/>
-                <w:sz w:val="21"/>
-                <w:szCs w:val="21"/>
-                <w:lang w:eastAsia="bg-BG"/>
-              </w:rPr>
-              <w:t xml:space="preserve">undefined</w:t>
+              <w:t xml:space="preserve">68134.107.198.1.8</w:t>
             </w:r>
             <w:r>
               <w:rPr>
@@ -3006,7 +3006,7 @@
                 <w:szCs w:val="21"/>
                 <w:lang w:eastAsia="bg-BG"/>
               </w:rPr>
-              <w:t xml:space="preserve">360 000 евро (триста и шестдесет хиляди евро)</w:t>
+              <w:t xml:space="preserve">100000 евро (сто хиляди евро)</w:t>
             </w:r>
             <w:r>
               <w:rPr>

</xml_diff>

<commit_message>
Fix Bulgarian grammar and decimal wording
</commit_message>
<xml_diff>
--- a/output/result.docx
+++ b/output/result.docx
@@ -1131,7 +1131,7 @@
                 <w:szCs w:val="21"/>
                 <w:lang w:eastAsia="bg-BG"/>
               </w:rPr>
-              <w:t xml:space="preserve">undefined</w:t>
+              <w:t xml:space="preserve">ВАЛЕНТИНА ГЕОРГИЕВА</w:t>
             </w:r>
             <w:r>
               <w:rPr>
@@ -1189,7 +1189,7 @@
                 <w:szCs w:val="21"/>
                 <w:lang w:eastAsia="bg-BG"/>
               </w:rPr>
-              <w:t xml:space="preserve">undefined</w:t>
+              <w:t xml:space="preserve">7208223211</w:t>
             </w:r>
             <w:r>
               <w:rPr>
@@ -1217,7 +1217,7 @@
                 <w:szCs w:val="21"/>
                 <w:lang w:eastAsia="bg-BG"/>
               </w:rPr>
-              <w:t xml:space="preserve">undefined</w:t>
+              <w:t xml:space="preserve">647544565</w:t>
             </w:r>
             <w:r>
               <w:rPr>
@@ -1237,7 +1237,7 @@
                 <w:szCs w:val="21"/>
                 <w:lang w:eastAsia="bg-BG"/>
               </w:rPr>
-              <w:t xml:space="preserve">undefined</w:t>
+              <w:t xml:space="preserve">28.03.2018</w:t>
             </w:r>
             <w:r>
               <w:rPr>
@@ -1295,7 +1295,7 @@
                 <w:szCs w:val="21"/>
                 <w:lang w:eastAsia="bg-BG"/>
               </w:rPr>
-              <w:t xml:space="preserve">undefined</w:t>
+              <w:t xml:space="preserve">град София, ул. „Цар Иван Асен II“ № 43, ет. 3, ап. 6</w:t>
             </w:r>
             <w:r>
               <w:rPr>
@@ -1436,7 +1436,7 @@
                 <w:szCs w:val="21"/>
                 <w:lang w:eastAsia="bg-BG"/>
               </w:rPr>
-              <w:t xml:space="preserve">undefined</w:t>
+              <w:t xml:space="preserve">7507263057</w:t>
             </w:r>
             <w:r>
               <w:rPr>
@@ -1476,7 +1476,7 @@
                 <w:szCs w:val="21"/>
                 <w:lang w:eastAsia="bg-BG"/>
               </w:rPr>
-              <w:t xml:space="preserve">undefined</w:t>
+              <w:t xml:space="preserve">651747724</w:t>
             </w:r>
             <w:r>
               <w:rPr>
@@ -1516,7 +1516,7 @@
                 <w:szCs w:val="21"/>
                 <w:lang w:eastAsia="bg-BG"/>
               </w:rPr>
-              <w:t xml:space="preserve">undefined</w:t>
+              <w:t xml:space="preserve">17.02.2022</w:t>
             </w:r>
             <w:r>
               <w:rPr>
@@ -1536,7 +1536,7 @@
                 <w:szCs w:val="21"/>
                 <w:lang w:eastAsia="bg-BG"/>
               </w:rPr>
-              <w:t xml:space="preserve">undefined</w:t>
+              <w:t xml:space="preserve">град София, Столична община, ул. „Добри Христов“ № 33, ет. 3, ап. 7</w:t>
             </w:r>
             <w:r>
               <w:rPr>
@@ -1875,7 +1875,7 @@
                 <w:szCs w:val="21"/>
                 <w:lang w:eastAsia="bg-BG"/>
               </w:rPr>
-              <w:t xml:space="preserve">undefined-undefined</w:t>
+              <w:t xml:space="preserve">15-212416-12.02.2026</w:t>
             </w:r>
             <w:r>
               <w:rPr>
@@ -1953,7 +1953,7 @@
                 <w:szCs w:val="21"/>
                 <w:lang w:eastAsia="bg-BG"/>
               </w:rPr>
-              <w:t xml:space="preserve">68134.107.198.1.6 (undefined)</w:t>
+              <w:t xml:space="preserve">68134.107.198.1.6 (шестдесет и осем хиляди сто тридесет и четири, точка, сто и седем, точка, сто деветдесет и осем, точка, едно, точка, шест)</w:t>
             </w:r>
             <w:r>
               <w:rPr>
@@ -2205,7 +2205,7 @@
                 <w:szCs w:val="21"/>
                 <w:lang w:eastAsia="bg-BG"/>
               </w:rPr>
-              <w:t xml:space="preserve">3 (undefined)</w:t>
+              <w:t xml:space="preserve">3 (трети)</w:t>
             </w:r>
             <w:r>
               <w:rPr>
@@ -2233,7 +2233,7 @@
                 <w:szCs w:val="21"/>
                 <w:lang w:eastAsia="bg-BG"/>
               </w:rPr>
-              <w:t xml:space="preserve">68134.107.198.1 (undefined)</w:t>
+              <w:t xml:space="preserve">68134.107.198.1 (шестдесет и осем хиляди сто тридесет и четири, точка, сто и седем, точка, сто деветдесет и осем, точка, едно)</w:t>
             </w:r>
             <w:r>
               <w:rPr>
@@ -2281,7 +2281,7 @@
                 <w:szCs w:val="21"/>
                 <w:lang w:eastAsia="bg-BG"/>
               </w:rPr>
-              <w:t xml:space="preserve">undefined (undefined)</w:t>
+              <w:t xml:space="preserve">5 (пет)</w:t>
             </w:r>
             <w:r>
               <w:rPr>
@@ -2318,7 +2318,7 @@
                 <w:szCs w:val="21"/>
                 <w:lang w:eastAsia="bg-BG"/>
               </w:rPr>
-              <w:t xml:space="preserve">68134.107.198 (undefined)</w:t>
+              <w:t xml:space="preserve">68134.107.198 (шестдесет и осем хиляди сто тридесет и четири, точка, сто и седем, точка, сто деветдесет и осем)</w:t>
             </w:r>
             <w:r>
               <w:rPr>
@@ -2396,7 +2396,7 @@
                 <w:szCs w:val="21"/>
                 <w:lang w:val="bg-BG" w:eastAsia="bg-BG"/>
               </w:rPr>
-              <w:t xml:space="preserve">undefined (undefined)</w:t>
+              <w:t xml:space="preserve">1 (едно)</w:t>
             </w:r>
             <w:r>
               <w:rPr>
@@ -2415,7 +2415,7 @@
                 <w:szCs w:val="21"/>
                 <w:lang w:eastAsia="bg-BG"/>
               </w:rPr>
-              <w:t xml:space="preserve">80.00 кв.м. (undefined квадратни метра)</w:t>
+              <w:t xml:space="preserve">80.00 кв.м. (осемдесет квадратни метра)</w:t>
             </w:r>
             <w:r>
               <w:rPr>
@@ -2481,7 +2481,7 @@
                 <w:szCs w:val="21"/>
                 <w:lang w:eastAsia="bg-BG"/>
               </w:rPr>
-              <w:t xml:space="preserve">6 (undefined)</w:t>
+              <w:t xml:space="preserve">6 (шести)</w:t>
             </w:r>
             <w:r>
               <w:rPr>
@@ -2531,7 +2531,7 @@
                 <w:szCs w:val="21"/>
                 <w:lang w:eastAsia="bg-BG"/>
               </w:rPr>
-              <w:t xml:space="preserve">6 (undefined)</w:t>
+              <w:t xml:space="preserve">6 (шести)</w:t>
             </w:r>
             <w:r>
               <w:rPr>
@@ -2551,7 +2551,7 @@
                 <w:szCs w:val="21"/>
                 <w:lang w:val="bg-BG" w:eastAsia="bg-BG"/>
               </w:rPr>
-              <w:t xml:space="preserve">12,51 % (undefined)</w:t>
+              <w:t xml:space="preserve">12,51 % (дванадесет цяло и петдесет и една стотни върху сто)</w:t>
             </w:r>
             <w:r>
               <w:rPr>
@@ -2588,7 +2588,7 @@
                 <w:szCs w:val="21"/>
                 <w:lang w:val="bg-BG" w:eastAsia="bg-BG"/>
               </w:rPr>
-              <w:t xml:space="preserve">undefined (undefined)</w:t>
+              <w:t xml:space="preserve">1 (едно)</w:t>
             </w:r>
             <w:r>
               <w:rPr>
@@ -2645,7 +2645,7 @@
                 <w:szCs w:val="21"/>
                 <w:lang w:eastAsia="bg-BG"/>
               </w:rPr>
-              <w:t xml:space="preserve">(undefined)</w:t>
+              <w:t xml:space="preserve">(шестдесет и осем хиляди сто тридесет и четири, точка, сто и седем, точка, сто деветдесет и осем, точка, едно, точка, пет)</w:t>
             </w:r>
             <w:r>
               <w:rPr>
@@ -2703,7 +2703,7 @@
                 <w:szCs w:val="21"/>
                 <w:lang w:eastAsia="bg-BG"/>
               </w:rPr>
-              <w:t xml:space="preserve">(undefined)</w:t>
+              <w:t xml:space="preserve">(шестдесет и осем хиляди сто тридесет и четири, точка, сто и седем, точка, сто деветдесет и осем, точка, едно, точка, четири)</w:t>
             </w:r>
             <w:r>
               <w:rPr>
@@ -2752,7 +2752,7 @@
                 <w:szCs w:val="21"/>
                 <w:lang w:eastAsia="bg-BG"/>
               </w:rPr>
-              <w:t xml:space="preserve">(undefined)</w:t>
+              <w:t xml:space="preserve">(шестдесет и осем хиляди сто тридесет и четири, точка, сто и седем, точка, сто деветдесет и осем, точка, едно, точка, осем)</w:t>
             </w:r>
             <w:r>
               <w:rPr>
@@ -3006,7 +3006,7 @@
                 <w:szCs w:val="21"/>
                 <w:lang w:eastAsia="bg-BG"/>
               </w:rPr>
-              <w:t xml:space="preserve">1364000 евро (един милион триста шестдесет и четири хиляди евро)</w:t>
+              <w:t xml:space="preserve">360 000,00 евро (триста и шестдесет хиляди евро)</w:t>
             </w:r>
             <w:r>
               <w:rPr>
@@ -3151,7 +3151,7 @@
                 <w:szCs w:val="21"/>
                 <w:lang w:eastAsia="bg-BG"/>
               </w:rPr>
-              <w:t xml:space="preserve">undefined</w:t>
+              <w:t xml:space="preserve">24.02.2026</w:t>
             </w:r>
             <w:r>
               <w:rPr>
@@ -3230,7 +3230,7 @@
                 <w:szCs w:val="21"/>
                 <w:lang w:eastAsia="bg-BG"/>
               </w:rPr>
-              <w:t xml:space="preserve">undefined евро (undefined евро)</w:t>
+              <w:t xml:space="preserve">36 000 евро (тридесет и шест хиляди евро)</w:t>
             </w:r>
             <w:r>
               <w:rPr>
@@ -3267,11 +3267,31 @@
                 <w:szCs w:val="21"/>
                 <w:lang w:eastAsia="bg-BG"/>
               </w:rPr>
-              <w:t xml:space="preserve">undefined евро (undefined евро)</w:t>
+              <w:t xml:space="preserve">324 000 евро (триста двадесет и четири хиляди</w:t>
             </w:r>
             <w:r>
               <w:rPr>
                 <w:rFonts w:ascii="Georgia" w:hAnsi="Georgia" w:cs="Courier New"/>
+                <w:b/>
+                <w:sz w:val="21"/>
+                <w:szCs w:val="21"/>
+                <w:lang w:val="bg-BG" w:eastAsia="bg-BG"/>
+              </w:rPr>
+              <w:t xml:space="preserve"> евро</w:t>
+            </w:r>
+            <w:r>
+              <w:rPr>
+                <w:rFonts w:ascii="Georgia" w:hAnsi="Georgia" w:cs="Courier New"/>
+                <w:b/>
+                <w:sz w:val="21"/>
+                <w:szCs w:val="21"/>
+                <w:lang w:eastAsia="bg-BG"/>
+              </w:rPr>
+              <w:t>)</w:t>
+            </w:r>
+            <w:r>
+              <w:rPr>
+                <w:rFonts w:ascii="Georgia" w:hAnsi="Georgia" w:cs="Courier New"/>
                 <w:sz w:val="21"/>
                 <w:szCs w:val="21"/>
                 <w:lang w:val="bg-BG" w:eastAsia="bg-BG"/>
@@ -3334,7 +3354,7 @@
                 <w:szCs w:val="21"/>
                 <w:lang w:eastAsia="bg-BG"/>
               </w:rPr>
-              <w:t xml:space="preserve">undefined евро (undefined евро)</w:t>
+              <w:t xml:space="preserve">324 000 евро (триста двадесет и четири хиляди евро)</w:t>
             </w:r>
             <w:r>
               <w:rPr>
@@ -3449,7 +3469,7 @@
                 <w:szCs w:val="21"/>
                 <w:lang w:eastAsia="bg-BG"/>
               </w:rPr>
-              <w:t xml:space="preserve">undefined</w:t>
+              <w:t xml:space="preserve">„УНИКРЕДИТ БУЛБАНК“ АД</w:t>
             </w:r>
             <w:r>
               <w:rPr>
@@ -3483,7 +3503,7 @@
                 <w:szCs w:val="21"/>
                 <w:lang w:eastAsia="bg-BG"/>
               </w:rPr>
-              <w:t xml:space="preserve">undefined</w:t>
+              <w:t xml:space="preserve">UNCRBGSF</w:t>
             </w:r>
             <w:r>
               <w:rPr>
@@ -3517,7 +3537,7 @@
                 <w:szCs w:val="21"/>
                 <w:lang w:eastAsia="bg-BG"/>
               </w:rPr>
-              <w:t xml:space="preserve">undefined</w:t>
+              <w:t xml:space="preserve">BG 67 UNCR 7000 4522 6900 18</w:t>
             </w:r>
             <w:r>
               <w:rPr>
@@ -3701,7 +3721,7 @@
                 <w:szCs w:val="21"/>
                 <w:lang w:eastAsia="bg-BG"/>
               </w:rPr>
-              <w:t xml:space="preserve">undefined евро</w:t>
+              <w:t xml:space="preserve">48 492,90 евро</w:t>
             </w:r>
             <w:r>
               <w:rPr>
@@ -3730,7 +3750,7 @@
                 <w:szCs w:val="21"/>
                 <w:lang w:eastAsia="bg-BG"/>
               </w:rPr>
-              <w:t xml:space="preserve">undefined евро</w:t>
+              <w:t xml:space="preserve">четиридесет и осем хиляди четиристотин деветдесет и две и деветдесет евроцента</w:t>
             </w:r>
             <w:r>
               <w:rPr>
@@ -4822,7 +4842,7 @@
                 <w:szCs w:val="21"/>
                 <w:lang w:val="bg-BG" w:eastAsia="bg-BG"/>
               </w:rPr>
-              <w:t xml:space="preserve">undefined</w:t>
+              <w:t xml:space="preserve">24.02.2026</w:t>
             </w:r>
             <w:r>
               <w:rPr>
@@ -5880,7 +5900,7 @@
                 <w:szCs w:val="21"/>
                 <w:lang w:eastAsia="bg-BG"/>
               </w:rPr>
-              <w:t xml:space="preserve">undefined-undefined</w:t>
+              <w:t xml:space="preserve">15-212416-12.02.2026</w:t>
             </w:r>
             <w:r>
               <w:rPr>
@@ -6418,7 +6438,7 @@
                 <w:szCs w:val="21"/>
                 <w:lang w:val="bg-BG" w:eastAsia="bg-BG"/>
               </w:rPr>
-              <w:t xml:space="preserve">undefined</w:t>
+              <w:t xml:space="preserve">24.02.2026</w:t>
             </w:r>
             <w:r>
               <w:rPr>
@@ -7753,6 +7773,7 @@
   <w:style w:type="character" w:default="1" w:styleId="DefaultParagraphFont">
     <w:name w:val="Default Paragraph Font"/>
     <w:uiPriority w:val="1"/>
+    <w:semiHidden/>
     <w:unhideWhenUsed/>
   </w:style>
   <w:style w:type="table" w:default="1" w:styleId="TableNormal">

</xml_diff>

<commit_message>
Generate payment amount words in backend
</commit_message>
<xml_diff>
--- a/output/result.docx
+++ b/output/result.docx
@@ -3230,7 +3230,7 @@
                 <w:szCs w:val="21"/>
                 <w:lang w:eastAsia="bg-BG"/>
               </w:rPr>
-              <w:t xml:space="preserve">36 000 евро (тридесет и шест хиляди евро)</w:t>
+              <w:t xml:space="preserve">36 000,00 евро (тридесет и шест хиляди евро)</w:t>
             </w:r>
             <w:r>
               <w:rPr>
@@ -3267,7 +3267,7 @@
                 <w:szCs w:val="21"/>
                 <w:lang w:eastAsia="bg-BG"/>
               </w:rPr>
-              <w:t xml:space="preserve">324 000 евро (триста двадесет и четири хиляди</w:t>
+              <w:t xml:space="preserve">324 000,00 евро (триста и двадесет и четири хиляди</w:t>
             </w:r>
             <w:r>
               <w:rPr>
@@ -3354,7 +3354,7 @@
                 <w:szCs w:val="21"/>
                 <w:lang w:eastAsia="bg-BG"/>
               </w:rPr>
-              <w:t xml:space="preserve">324 000 евро (триста двадесет и четири хиляди евро)</w:t>
+              <w:t xml:space="preserve">324 000,00 евро (триста и двадесет и четири хиляди евро)</w:t>
             </w:r>
             <w:r>
               <w:rPr>

</xml_diff>

<commit_message>
Remove manual tax words input
</commit_message>
<xml_diff>
--- a/output/result.docx
+++ b/output/result.docx
@@ -3721,7 +3721,7 @@
                 <w:szCs w:val="21"/>
                 <w:lang w:eastAsia="bg-BG"/>
               </w:rPr>
-              <w:t xml:space="preserve">48 492,90 евро</w:t>
+              <w:t xml:space="preserve">55 348,86 евро</w:t>
             </w:r>
             <w:r>
               <w:rPr>
@@ -3750,7 +3750,7 @@
                 <w:szCs w:val="21"/>
                 <w:lang w:eastAsia="bg-BG"/>
               </w:rPr>
-              <w:t xml:space="preserve">четиридесет и осем хиляди четиристотин деветдесет и две и деветдесет евроцента</w:t>
+              <w:t xml:space="preserve">петдесет и пет хиляди триста четиридесет и осем евро и осемдесет и шест евроцента</w:t>
             </w:r>
             <w:r>
               <w:rPr>

</xml_diff>

<commit_message>
Support cents for all euro amount fields
</commit_message>
<xml_diff>
--- a/output/result.docx
+++ b/output/result.docx
@@ -3006,7 +3006,7 @@
                 <w:szCs w:val="21"/>
                 <w:lang w:eastAsia="bg-BG"/>
               </w:rPr>
-              <w:t xml:space="preserve">360 000,00 евро (триста и шестдесет хиляди евро)</w:t>
+              <w:t xml:space="preserve">360 000,50 евро (триста и шестдесет хиляди евро и петдесет евроцента)</w:t>
             </w:r>
             <w:r>
               <w:rPr>
@@ -3230,7 +3230,7 @@
                 <w:szCs w:val="21"/>
                 <w:lang w:eastAsia="bg-BG"/>
               </w:rPr>
-              <w:t xml:space="preserve">36 000,00 евро (тридесет и шест хиляди евро)</w:t>
+              <w:t xml:space="preserve">36 000,25 евро (тридесет и шест хиляди евро и двадесет и пет евроцента)</w:t>
             </w:r>
             <w:r>
               <w:rPr>
@@ -3267,17 +3267,64 @@
                 <w:szCs w:val="21"/>
                 <w:lang w:eastAsia="bg-BG"/>
               </w:rPr>
-              <w:t xml:space="preserve">324 000,00 евро (триста и двадесет и четири хиляди</w:t>
+              <w:t xml:space="preserve">323 999,75 евро (триста и двадесет и три хиляди деветстотин деветдесет и девет евро и седемдесет и пет евроцента)</w:t>
             </w:r>
             <w:r>
               <w:rPr>
                 <w:rFonts w:ascii="Georgia" w:hAnsi="Georgia" w:cs="Courier New"/>
-                <w:b/>
-                <w:sz w:val="21"/>
-                <w:szCs w:val="21"/>
-                <w:lang w:val="bg-BG" w:eastAsia="bg-BG"/>
-              </w:rPr>
-              <w:t xml:space="preserve"> евро</w:t>
+                <w:sz w:val="21"/>
+                <w:szCs w:val="21"/>
+                <w:lang w:val="bg-BG" w:eastAsia="bg-BG"/>
+              </w:rPr>
+              <w:t>.--------------------------------------------</w:t>
+            </w:r>
+          </w:p>
+          <w:p>
+            <w:pPr>
+              <w:jc w:val="both"/>
+              <w:rPr>
+                <w:rFonts w:ascii="Georgia" w:hAnsi="Georgia"/>
+                <w:sz w:val="21"/>
+                <w:szCs w:val="21"/>
+                <w:lang w:val="bg-BG" w:eastAsia="bg-BG"/>
+              </w:rPr>
+            </w:pPr>
+            <w:r>
+              <w:rPr>
+                <w:rFonts w:ascii="Georgia" w:hAnsi="Georgia" w:cs="Georgia"/>
+                <w:sz w:val="21"/>
+                <w:szCs w:val="21"/>
+                <w:lang w:val="bg-BG" w:eastAsia="bg-BG"/>
+              </w:rPr>
+              <w:t xml:space="preserve">           </w:t>
+            </w:r>
+            <w:r>
+              <w:rPr>
+                <w:rFonts w:ascii="Georgia" w:hAnsi="Georgia" w:cs="Georgia"/>
+                <w:b/>
+                <w:sz w:val="21"/>
+                <w:szCs w:val="21"/>
+                <w:lang w:val="bg-BG" w:eastAsia="bg-BG"/>
+              </w:rPr>
+              <w:t>3.</w:t>
+            </w:r>
+            <w:r>
+              <w:rPr>
+                <w:rFonts w:ascii="Georgia" w:hAnsi="Georgia" w:cs="Georgia"/>
+                <w:sz w:val="21"/>
+                <w:szCs w:val="21"/>
+                <w:lang w:val="bg-BG" w:eastAsia="bg-BG"/>
+              </w:rPr>
+              <w:t xml:space="preserve"> Остатъкът от дължимата обща п</w:t>
+            </w:r>
+            <w:r>
+              <w:rPr>
+                <w:rFonts w:ascii="Georgia" w:hAnsi="Georgia" w:cs="Georgia"/>
+                <w:sz w:val="21"/>
+                <w:szCs w:val="21"/>
+                <w:lang w:val="bg-BG" w:eastAsia="bg-BG"/>
+              </w:rPr>
+              <w:t xml:space="preserve">родажна цена за подробно описания в цялата предходна точка първа от нотариалния акт недвижим имот, в размер на </w:t>
             </w:r>
             <w:r>
               <w:rPr>
@@ -3287,74 +3334,7 @@
                 <w:szCs w:val="21"/>
                 <w:lang w:eastAsia="bg-BG"/>
               </w:rPr>
-              <w:t>)</w:t>
-            </w:r>
-            <w:r>
-              <w:rPr>
-                <w:rFonts w:ascii="Georgia" w:hAnsi="Georgia" w:cs="Courier New"/>
-                <w:sz w:val="21"/>
-                <w:szCs w:val="21"/>
-                <w:lang w:val="bg-BG" w:eastAsia="bg-BG"/>
-              </w:rPr>
-              <w:t>.--------------------------------------------</w:t>
-            </w:r>
-          </w:p>
-          <w:p>
-            <w:pPr>
-              <w:jc w:val="both"/>
-              <w:rPr>
-                <w:rFonts w:ascii="Georgia" w:hAnsi="Georgia"/>
-                <w:sz w:val="21"/>
-                <w:szCs w:val="21"/>
-                <w:lang w:val="bg-BG" w:eastAsia="bg-BG"/>
-              </w:rPr>
-            </w:pPr>
-            <w:r>
-              <w:rPr>
-                <w:rFonts w:ascii="Georgia" w:hAnsi="Georgia" w:cs="Georgia"/>
-                <w:sz w:val="21"/>
-                <w:szCs w:val="21"/>
-                <w:lang w:val="bg-BG" w:eastAsia="bg-BG"/>
-              </w:rPr>
-              <w:t xml:space="preserve">           </w:t>
-            </w:r>
-            <w:r>
-              <w:rPr>
-                <w:rFonts w:ascii="Georgia" w:hAnsi="Georgia" w:cs="Georgia"/>
-                <w:b/>
-                <w:sz w:val="21"/>
-                <w:szCs w:val="21"/>
-                <w:lang w:val="bg-BG" w:eastAsia="bg-BG"/>
-              </w:rPr>
-              <w:t>3.</w:t>
-            </w:r>
-            <w:r>
-              <w:rPr>
-                <w:rFonts w:ascii="Georgia" w:hAnsi="Georgia" w:cs="Georgia"/>
-                <w:sz w:val="21"/>
-                <w:szCs w:val="21"/>
-                <w:lang w:val="bg-BG" w:eastAsia="bg-BG"/>
-              </w:rPr>
-              <w:t xml:space="preserve"> Остатъкът от дължимата обща п</w:t>
-            </w:r>
-            <w:r>
-              <w:rPr>
-                <w:rFonts w:ascii="Georgia" w:hAnsi="Georgia" w:cs="Georgia"/>
-                <w:sz w:val="21"/>
-                <w:szCs w:val="21"/>
-                <w:lang w:val="bg-BG" w:eastAsia="bg-BG"/>
-              </w:rPr>
-              <w:t xml:space="preserve">родажна цена за подробно описания в цялата предходна точка първа от нотариалния акт недвижим имот, в размер на </w:t>
-            </w:r>
-            <w:r>
-              <w:rPr>
-                <w:rFonts w:ascii="Georgia" w:hAnsi="Georgia" w:cs="Courier New"/>
-                <w:b/>
-                <w:sz w:val="21"/>
-                <w:szCs w:val="21"/>
-                <w:lang w:eastAsia="bg-BG"/>
-              </w:rPr>
-              <w:t xml:space="preserve">324 000,00 евро (триста и двадесет и четири хиляди евро)</w:t>
+              <w:t xml:space="preserve">323 999,75 евро (триста и двадесет и три хиляди деветстотин деветдесет и девет евро и седемдесет и пет евроцента)</w:t>
             </w:r>
             <w:r>
               <w:rPr>
@@ -3721,7 +3701,7 @@
                 <w:szCs w:val="21"/>
                 <w:lang w:eastAsia="bg-BG"/>
               </w:rPr>
-              <w:t xml:space="preserve">55 348,86 евро</w:t>
+              <w:t xml:space="preserve">48 492,90</w:t>
             </w:r>
             <w:r>
               <w:rPr>
@@ -3730,13 +3710,35 @@
                 <w:bCs/>
                 <w:sz w:val="21"/>
                 <w:szCs w:val="21"/>
-                <w:lang w:val="bg-BG" w:eastAsia="bg-BG"/>
+                <w:lang w:eastAsia="bg-BG"/>
               </w:rPr>
               <w:t xml:space="preserve"> </w:t>
             </w:r>
             <w:r>
               <w:rPr>
                 <w:rFonts w:ascii="Georgia" w:hAnsi="Georgia"/>
+                <w:b/>
+                <w:bCs/>
+                <w:sz w:val="21"/>
+                <w:szCs w:val="21"/>
+                <w:lang w:val="bg-BG" w:eastAsia="bg-BG"/>
+              </w:rPr>
+              <w:t>евро</w:t>
+            </w:r>
+            <w:r>
+              <w:rPr>
+                <w:rFonts w:ascii="Georgia" w:hAnsi="Georgia"/>
+                <w:b/>
+                <w:bCs/>
+                <w:sz w:val="21"/>
+                <w:szCs w:val="21"/>
+                <w:lang w:eastAsia="bg-BG"/>
+              </w:rPr>
+              <w:t xml:space="preserve"> </w:t>
+            </w:r>
+            <w:r>
+              <w:rPr>
+                <w:rFonts w:ascii="Georgia" w:hAnsi="Georgia"/>
                 <w:sz w:val="21"/>
                 <w:szCs w:val="21"/>
                 <w:lang w:val="bg-BG" w:eastAsia="bg-BG"/>
@@ -3750,7 +3752,7 @@
                 <w:szCs w:val="21"/>
                 <w:lang w:eastAsia="bg-BG"/>
               </w:rPr>
-              <w:t xml:space="preserve">петдесет и пет хиляди триста четиридесет и осем евро и осемдесет и шест евроцента</w:t>
+              <w:t xml:space="preserve">четиридесет и осем хиляди четиристотин деветдесет и две евро и деветдесет евроцента</w:t>
             </w:r>
             <w:r>
               <w:rPr>

</xml_diff>

<commit_message>
Generate contract date words in backend
</commit_message>
<xml_diff>
--- a/output/result.docx
+++ b/output/result.docx
@@ -3006,7 +3006,7 @@
                 <w:szCs w:val="21"/>
                 <w:lang w:eastAsia="bg-BG"/>
               </w:rPr>
-              <w:t xml:space="preserve">360 000,50 евро (триста и шестдесет хиляди евро и петдесет евроцента)</w:t>
+              <w:t xml:space="preserve">360 000,00 евро (триста и шестдесет хиляди евро)</w:t>
             </w:r>
             <w:r>
               <w:rPr>
@@ -3230,7 +3230,7 @@
                 <w:szCs w:val="21"/>
                 <w:lang w:eastAsia="bg-BG"/>
               </w:rPr>
-              <w:t xml:space="preserve">36 000,25 евро (тридесет и шест хиляди евро и двадесет и пет евроцента)</w:t>
+              <w:t xml:space="preserve">36 000,00 евро (тридесет и шест хиляди евро)</w:t>
             </w:r>
             <w:r>
               <w:rPr>
@@ -3267,7 +3267,7 @@
                 <w:szCs w:val="21"/>
                 <w:lang w:eastAsia="bg-BG"/>
               </w:rPr>
-              <w:t xml:space="preserve">323 999,75 евро (триста и двадесет и три хиляди деветстотин деветдесет и девет евро и седемдесет и пет евроцента)</w:t>
+              <w:t xml:space="preserve">324 000,00 евро (триста и двадесет и четири хиляди евро)</w:t>
             </w:r>
             <w:r>
               <w:rPr>
@@ -3334,7 +3334,7 @@
                 <w:szCs w:val="21"/>
                 <w:lang w:eastAsia="bg-BG"/>
               </w:rPr>
-              <w:t xml:space="preserve">323 999,75 евро (триста и двадесет и три хиляди деветстотин деветдесет и девет евро и седемдесет и пет евроцента)</w:t>
+              <w:t xml:space="preserve">324 000,00 евро (триста и двадесет и четири хиляди евро)</w:t>
             </w:r>
             <w:r>
               <w:rPr>

</xml_diff>

<commit_message>
Fix conjunction handling in thousand amounts
</commit_message>
<xml_diff>
--- a/output/result.docx
+++ b/output/result.docx
@@ -3267,7 +3267,7 @@
                 <w:szCs w:val="21"/>
                 <w:lang w:eastAsia="bg-BG"/>
               </w:rPr>
-              <w:t xml:space="preserve">324 000,00 евро (триста и двадесет и четири хиляди евро)</w:t>
+              <w:t xml:space="preserve">324 000,00 евро (триста двадесет и четири хиляди евро)</w:t>
             </w:r>
             <w:r>
               <w:rPr>
@@ -3334,7 +3334,7 @@
                 <w:szCs w:val="21"/>
                 <w:lang w:eastAsia="bg-BG"/>
               </w:rPr>
-              <w:t xml:space="preserve">324 000,00 евро (триста и двадесет и четири хиляди евро)</w:t>
+              <w:t xml:space="preserve">324 000,00 евро (триста двадесет и четири хиляди евро)</w:t>
             </w:r>
             <w:r>
               <w:rPr>

</xml_diff>

<commit_message>
Fix attic and basement number wording
</commit_message>
<xml_diff>
--- a/output/result.docx
+++ b/output/result.docx
@@ -2481,7 +2481,7 @@
                 <w:szCs w:val="21"/>
                 <w:lang w:eastAsia="bg-BG"/>
               </w:rPr>
-              <w:t xml:space="preserve">6 (шести)</w:t>
+              <w:t xml:space="preserve">6 (шест)</w:t>
             </w:r>
             <w:r>
               <w:rPr>
@@ -2531,7 +2531,7 @@
                 <w:szCs w:val="21"/>
                 <w:lang w:eastAsia="bg-BG"/>
               </w:rPr>
-              <w:t xml:space="preserve">6 (шести)</w:t>
+              <w:t xml:space="preserve">6 (шест)</w:t>
             </w:r>
             <w:r>
               <w:rPr>
@@ -3449,7 +3449,7 @@
                 <w:szCs w:val="21"/>
                 <w:lang w:eastAsia="bg-BG"/>
               </w:rPr>
-              <w:t xml:space="preserve">УНИКРЕДИТ БУЛБАНК“ АД</w:t>
+              <w:t xml:space="preserve">„УНИКРЕДИТ БУЛБАНК“ АД</w:t>
             </w:r>
             <w:r>
               <w:rPr>

</xml_diff>

<commit_message>
Format signature names in title case
</commit_message>
<xml_diff>
--- a/output/result.docx
+++ b/output/result.docx
@@ -6707,7 +6707,7 @@
                 <w:szCs w:val="18"/>
                 <w:lang w:eastAsia="bg-BG"/>
               </w:rPr>
-              <w:t xml:space="preserve">ЕМИЛИЯ ИВАНОВА ГОРАНОВА - ВЕСТНЕР</w:t>
+              <w:t xml:space="preserve">Емилия Иванова Горанова - Вестнер</w:t>
             </w:r>
             <w:r>
               <w:rPr>
@@ -6915,7 +6915,7 @@
                 <w:szCs w:val="18"/>
                 <w:lang w:eastAsia="bg-BG"/>
               </w:rPr>
-              <w:t xml:space="preserve">КАМЕЛИЯ АНГЕЛОВА АНГЕЛОВА – ТОДОРОВА</w:t>
+              <w:t xml:space="preserve">Камелия Ангелова Ангелова – Тодорова</w:t>
             </w:r>
             <w:r>
               <w:rPr>
@@ -7775,7 +7775,6 @@
   <w:style w:type="character" w:default="1" w:styleId="DefaultParagraphFont">
     <w:name w:val="Default Paragraph Font"/>
     <w:uiPriority w:val="1"/>
-    <w:semiHidden/>
     <w:unhideWhenUsed/>
   </w:style>
   <w:style w:type="table" w:default="1" w:styleId="TableNormal">

</xml_diff>

<commit_message>
Match tax evaluation amount spacing
</commit_message>
<xml_diff>
--- a/output/result.docx
+++ b/output/result.docx
@@ -3701,7 +3701,7 @@
                 <w:szCs w:val="21"/>
                 <w:lang w:eastAsia="bg-BG"/>
               </w:rPr>
-              <w:t xml:space="preserve">48 492,90</w:t>
+              <w:t xml:space="preserve">48 492, 90</w:t>
             </w:r>
             <w:r>
               <w:rPr>
@@ -6707,7 +6707,7 @@
                 <w:szCs w:val="18"/>
                 <w:lang w:eastAsia="bg-BG"/>
               </w:rPr>
-              <w:t xml:space="preserve">Емилия Иванова Горанова - Вестнер</w:t>
+              <w:t xml:space="preserve">Емилия Иванова Горанова – Вестнер</w:t>
             </w:r>
             <w:r>
               <w:rPr>

</xml_diff>

<commit_message>
Add home and success screens to document flow
</commit_message>
<xml_diff>
--- a/output/result.docx
+++ b/output/result.docx
@@ -3701,7 +3701,7 @@
                 <w:szCs w:val="21"/>
                 <w:lang w:eastAsia="bg-BG"/>
               </w:rPr>
-              <w:t xml:space="preserve">48 492, 90</w:t>
+              <w:t/>
             </w:r>
             <w:r>
               <w:rPr>
@@ -3752,7 +3752,7 @@
                 <w:szCs w:val="21"/>
                 <w:lang w:eastAsia="bg-BG"/>
               </w:rPr>
-              <w:t xml:space="preserve">четиридесет и осем хиляди четиристотин деветдесет и две евро и деветдесет евроцента</w:t>
+              <w:t xml:space="preserve">undefined</w:t>
             </w:r>
             <w:r>
               <w:rPr>

</xml_diff>

<commit_message>
Add final generate step to wizard
</commit_message>
<xml_diff>
--- a/output/result.docx
+++ b/output/result.docx
@@ -3449,7 +3449,7 @@
                 <w:szCs w:val="21"/>
                 <w:lang w:eastAsia="bg-BG"/>
               </w:rPr>
-              <w:t xml:space="preserve">УНИКРЕДИТ БУЛБАНК“ АД</w:t>
+              <w:t xml:space="preserve">„УНИКРЕДИТ БУЛБАНК“</w:t>
             </w:r>
             <w:r>
               <w:rPr>
@@ -3701,7 +3701,7 @@
                 <w:szCs w:val="21"/>
                 <w:lang w:eastAsia="bg-BG"/>
               </w:rPr>
-              <w:t/>
+              <w:t xml:space="preserve">48 492, 90</w:t>
             </w:r>
             <w:r>
               <w:rPr>
@@ -3752,7 +3752,7 @@
                 <w:szCs w:val="21"/>
                 <w:lang w:eastAsia="bg-BG"/>
               </w:rPr>
-              <w:t xml:space="preserve">undefined</w:t>
+              <w:t xml:space="preserve">четиридесет и осем хиляди четиристотин деветдесет и две евро и деветдесет евроцента</w:t>
             </w:r>
             <w:r>
               <w:rPr>

</xml_diff>